<commit_message>
WORKING ON SHOWING POSTS AND INFO OF INDIVIDUAL AUTHORS
</commit_message>
<xml_diff>
--- a/Notes-Blog_React.docx
+++ b/Notes-Blog_React.docx
@@ -28,8 +28,13 @@
       </w:r>
     </w:p>
     <w:p>
-      <w:r>
-        <w:t>Position : sticky,</w:t>
+      <w:proofErr w:type="gramStart"/>
+      <w:r>
+        <w:t>Position :</w:t>
+      </w:r>
+      <w:proofErr w:type="gramEnd"/>
+      <w:r>
+        <w:t xml:space="preserve"> sticky,</w:t>
       </w:r>
     </w:p>
     <w:p>
@@ -58,7 +63,27 @@
           <w:highlight w:val="yellow"/>
           <w:lang w:val="en-IN"/>
         </w:rPr>
-        <w:t>Steps To Implement Radio Button In React</w:t>
+        <w:t xml:space="preserve">Steps To Implement Radio Button </w:t>
+      </w:r>
+      <w:proofErr w:type="gramStart"/>
+      <w:r>
+        <w:rPr>
+          <w:b/>
+          <w:bCs/>
+          <w:highlight w:val="yellow"/>
+          <w:lang w:val="en-IN"/>
+        </w:rPr>
+        <w:t>In</w:t>
+      </w:r>
+      <w:proofErr w:type="gramEnd"/>
+      <w:r>
+        <w:rPr>
+          <w:b/>
+          <w:bCs/>
+          <w:highlight w:val="yellow"/>
+          <w:lang w:val="en-IN"/>
+        </w:rPr>
+        <w:t xml:space="preserve"> React</w:t>
       </w:r>
     </w:p>
     <w:p>
@@ -204,7 +229,25 @@
           <w:bCs/>
           <w:lang w:val="en-IN"/>
         </w:rPr>
-        <w:t>2. Hover Handling (onMouseEnter)</w:t>
+        <w:t>2. Hover Handling (</w:t>
+      </w:r>
+      <w:proofErr w:type="spellStart"/>
+      <w:r>
+        <w:rPr>
+          <w:b/>
+          <w:bCs/>
+          <w:lang w:val="en-IN"/>
+        </w:rPr>
+        <w:t>onMouseEnter</w:t>
+      </w:r>
+      <w:proofErr w:type="spellEnd"/>
+      <w:r>
+        <w:rPr>
+          <w:b/>
+          <w:bCs/>
+          <w:lang w:val="en-IN"/>
+        </w:rPr>
+        <w:t>)</w:t>
       </w:r>
     </w:p>
     <w:p>
@@ -213,11 +256,33 @@
           <w:lang w:val="en-IN"/>
         </w:rPr>
       </w:pPr>
-      <w:r>
-        <w:rPr>
-          <w:lang w:val="en-IN"/>
-        </w:rPr>
-        <w:t>const handleMouseEnter = (e) =&gt; {</w:t>
+      <w:proofErr w:type="spellStart"/>
+      <w:r>
+        <w:rPr>
+          <w:lang w:val="en-IN"/>
+        </w:rPr>
+        <w:t>const</w:t>
+      </w:r>
+      <w:proofErr w:type="spellEnd"/>
+      <w:r>
+        <w:rPr>
+          <w:lang w:val="en-IN"/>
+        </w:rPr>
+        <w:t xml:space="preserve"> </w:t>
+      </w:r>
+      <w:proofErr w:type="spellStart"/>
+      <w:r>
+        <w:rPr>
+          <w:lang w:val="en-IN"/>
+        </w:rPr>
+        <w:t>handleMouseEnter</w:t>
+      </w:r>
+      <w:proofErr w:type="spellEnd"/>
+      <w:r>
+        <w:rPr>
+          <w:lang w:val="en-IN"/>
+        </w:rPr>
+        <w:t xml:space="preserve"> = (e) =&gt; {</w:t>
       </w:r>
     </w:p>
     <w:p>
@@ -230,7 +295,71 @@
         <w:rPr>
           <w:lang w:val="en-IN"/>
         </w:rPr>
-        <w:t xml:space="preserve">  const itemRect = e.target.getBoundingClientRect(); // gets size and position of the hovered link</w:t>
+        <w:t xml:space="preserve">  </w:t>
+      </w:r>
+      <w:proofErr w:type="spellStart"/>
+      <w:r>
+        <w:rPr>
+          <w:lang w:val="en-IN"/>
+        </w:rPr>
+        <w:t>const</w:t>
+      </w:r>
+      <w:proofErr w:type="spellEnd"/>
+      <w:r>
+        <w:rPr>
+          <w:lang w:val="en-IN"/>
+        </w:rPr>
+        <w:t xml:space="preserve"> </w:t>
+      </w:r>
+      <w:proofErr w:type="spellStart"/>
+      <w:r>
+        <w:rPr>
+          <w:lang w:val="en-IN"/>
+        </w:rPr>
+        <w:t>itemRect</w:t>
+      </w:r>
+      <w:proofErr w:type="spellEnd"/>
+      <w:r>
+        <w:rPr>
+          <w:lang w:val="en-IN"/>
+        </w:rPr>
+        <w:t xml:space="preserve"> = </w:t>
+      </w:r>
+      <w:proofErr w:type="spellStart"/>
+      <w:proofErr w:type="gramStart"/>
+      <w:r>
+        <w:rPr>
+          <w:lang w:val="en-IN"/>
+        </w:rPr>
+        <w:t>e.target</w:t>
+      </w:r>
+      <w:proofErr w:type="gramEnd"/>
+      <w:r>
+        <w:rPr>
+          <w:lang w:val="en-IN"/>
+        </w:rPr>
+        <w:t>.</w:t>
+      </w:r>
+      <w:proofErr w:type="gramStart"/>
+      <w:r>
+        <w:rPr>
+          <w:lang w:val="en-IN"/>
+        </w:rPr>
+        <w:t>getBoundingClientRect</w:t>
+      </w:r>
+      <w:proofErr w:type="spellEnd"/>
+      <w:r>
+        <w:rPr>
+          <w:lang w:val="en-IN"/>
+        </w:rPr>
+        <w:t>(</w:t>
+      </w:r>
+      <w:proofErr w:type="gramEnd"/>
+      <w:r>
+        <w:rPr>
+          <w:lang w:val="en-IN"/>
+        </w:rPr>
+        <w:t>); // gets size and position of the hovered link</w:t>
       </w:r>
     </w:p>
     <w:p>
@@ -243,7 +372,51 @@
         <w:rPr>
           <w:lang w:val="en-IN"/>
         </w:rPr>
-        <w:t xml:space="preserve">  const containerRect = containerRef.current.getBoundingClientRect(); // same for nav container</w:t>
+        <w:t xml:space="preserve">  </w:t>
+      </w:r>
+      <w:proofErr w:type="spellStart"/>
+      <w:r>
+        <w:rPr>
+          <w:lang w:val="en-IN"/>
+        </w:rPr>
+        <w:t>const</w:t>
+      </w:r>
+      <w:proofErr w:type="spellEnd"/>
+      <w:r>
+        <w:rPr>
+          <w:lang w:val="en-IN"/>
+        </w:rPr>
+        <w:t xml:space="preserve"> </w:t>
+      </w:r>
+      <w:proofErr w:type="spellStart"/>
+      <w:r>
+        <w:rPr>
+          <w:lang w:val="en-IN"/>
+        </w:rPr>
+        <w:t>containerRect</w:t>
+      </w:r>
+      <w:proofErr w:type="spellEnd"/>
+      <w:r>
+        <w:rPr>
+          <w:lang w:val="en-IN"/>
+        </w:rPr>
+        <w:t xml:space="preserve"> = </w:t>
+      </w:r>
+      <w:proofErr w:type="spellStart"/>
+      <w:proofErr w:type="gramStart"/>
+      <w:r>
+        <w:rPr>
+          <w:lang w:val="en-IN"/>
+        </w:rPr>
+        <w:t>containerRef.current.getBoundingClientRect</w:t>
+      </w:r>
+      <w:proofErr w:type="spellEnd"/>
+      <w:proofErr w:type="gramEnd"/>
+      <w:r>
+        <w:rPr>
+          <w:lang w:val="en-IN"/>
+        </w:rPr>
+        <w:t>(); // same for nav container</w:t>
       </w:r>
     </w:p>
     <w:p>
@@ -256,7 +429,59 @@
         <w:rPr>
           <w:lang w:val="en-IN"/>
         </w:rPr>
-        <w:t xml:space="preserve">  underline.style.width = `${itemRect.width}px`; // match the hovered link width</w:t>
+        <w:t xml:space="preserve">  </w:t>
+      </w:r>
+      <w:proofErr w:type="spellStart"/>
+      <w:proofErr w:type="gramStart"/>
+      <w:r>
+        <w:rPr>
+          <w:lang w:val="en-IN"/>
+        </w:rPr>
+        <w:t>underline.style</w:t>
+      </w:r>
+      <w:proofErr w:type="gramEnd"/>
+      <w:r>
+        <w:rPr>
+          <w:lang w:val="en-IN"/>
+        </w:rPr>
+        <w:t>.width</w:t>
+      </w:r>
+      <w:proofErr w:type="spellEnd"/>
+      <w:r>
+        <w:rPr>
+          <w:lang w:val="en-IN"/>
+        </w:rPr>
+        <w:t xml:space="preserve"> = `${</w:t>
+      </w:r>
+      <w:proofErr w:type="spellStart"/>
+      <w:proofErr w:type="gramStart"/>
+      <w:r>
+        <w:rPr>
+          <w:lang w:val="en-IN"/>
+        </w:rPr>
+        <w:t>itemRect.width</w:t>
+      </w:r>
+      <w:proofErr w:type="spellEnd"/>
+      <w:r>
+        <w:rPr>
+          <w:lang w:val="en-IN"/>
+        </w:rPr>
+        <w:t>}</w:t>
+      </w:r>
+      <w:proofErr w:type="spellStart"/>
+      <w:r>
+        <w:rPr>
+          <w:lang w:val="en-IN"/>
+        </w:rPr>
+        <w:t>px</w:t>
+      </w:r>
+      <w:proofErr w:type="spellEnd"/>
+      <w:proofErr w:type="gramEnd"/>
+      <w:r>
+        <w:rPr>
+          <w:lang w:val="en-IN"/>
+        </w:rPr>
+        <w:t>`; // match the hovered link width</w:t>
       </w:r>
     </w:p>
     <w:p>
@@ -269,7 +494,73 @@
         <w:rPr>
           <w:lang w:val="en-IN"/>
         </w:rPr>
-        <w:t xml:space="preserve">  underline.style.left = `${itemRect.left - containerRect.left}px`; // move it to the hovered link's position</w:t>
+        <w:t xml:space="preserve">  </w:t>
+      </w:r>
+      <w:proofErr w:type="spellStart"/>
+      <w:proofErr w:type="gramStart"/>
+      <w:r>
+        <w:rPr>
+          <w:lang w:val="en-IN"/>
+        </w:rPr>
+        <w:t>underline.style</w:t>
+      </w:r>
+      <w:proofErr w:type="gramEnd"/>
+      <w:r>
+        <w:rPr>
+          <w:lang w:val="en-IN"/>
+        </w:rPr>
+        <w:t>.left</w:t>
+      </w:r>
+      <w:proofErr w:type="spellEnd"/>
+      <w:r>
+        <w:rPr>
+          <w:lang w:val="en-IN"/>
+        </w:rPr>
+        <w:t xml:space="preserve"> = `${</w:t>
+      </w:r>
+      <w:proofErr w:type="spellStart"/>
+      <w:r>
+        <w:rPr>
+          <w:lang w:val="en-IN"/>
+        </w:rPr>
+        <w:t>itemRect.left</w:t>
+      </w:r>
+      <w:proofErr w:type="spellEnd"/>
+      <w:r>
+        <w:rPr>
+          <w:lang w:val="en-IN"/>
+        </w:rPr>
+        <w:t xml:space="preserve"> - </w:t>
+      </w:r>
+      <w:proofErr w:type="spellStart"/>
+      <w:proofErr w:type="gramStart"/>
+      <w:r>
+        <w:rPr>
+          <w:lang w:val="en-IN"/>
+        </w:rPr>
+        <w:t>containerRect.left</w:t>
+      </w:r>
+      <w:proofErr w:type="spellEnd"/>
+      <w:r>
+        <w:rPr>
+          <w:lang w:val="en-IN"/>
+        </w:rPr>
+        <w:t>}</w:t>
+      </w:r>
+      <w:proofErr w:type="spellStart"/>
+      <w:r>
+        <w:rPr>
+          <w:lang w:val="en-IN"/>
+        </w:rPr>
+        <w:t>px</w:t>
+      </w:r>
+      <w:proofErr w:type="spellEnd"/>
+      <w:proofErr w:type="gramEnd"/>
+      <w:r>
+        <w:rPr>
+          <w:lang w:val="en-IN"/>
+        </w:rPr>
+        <w:t>`; // move it to the hovered link's position</w:t>
       </w:r>
     </w:p>
     <w:p>
@@ -509,13 +800,31 @@
           <w:szCs w:val="32"/>
         </w:rPr>
       </w:pPr>
-      <w:r>
-        <w:rPr>
-          <w:sz w:val="32"/>
-          <w:szCs w:val="32"/>
-        </w:rPr>
-        <w:t>npm install zustand</w:t>
-      </w:r>
+      <w:proofErr w:type="spellStart"/>
+      <w:r>
+        <w:rPr>
+          <w:sz w:val="32"/>
+          <w:szCs w:val="32"/>
+        </w:rPr>
+        <w:t>npm</w:t>
+      </w:r>
+      <w:proofErr w:type="spellEnd"/>
+      <w:r>
+        <w:rPr>
+          <w:sz w:val="32"/>
+          <w:szCs w:val="32"/>
+        </w:rPr>
+        <w:t xml:space="preserve"> install </w:t>
+      </w:r>
+      <w:proofErr w:type="spellStart"/>
+      <w:r>
+        <w:rPr>
+          <w:sz w:val="32"/>
+          <w:szCs w:val="32"/>
+        </w:rPr>
+        <w:t>zustand</w:t>
+      </w:r>
+      <w:proofErr w:type="spellEnd"/>
     </w:p>
     <w:p>
       <w:pPr>
@@ -593,7 +902,23 @@
           <w:sz w:val="32"/>
           <w:szCs w:val="32"/>
         </w:rPr>
-        <w:t xml:space="preserve"> export const useStore = ….</w:t>
+        <w:t xml:space="preserve"> export const </w:t>
+      </w:r>
+      <w:proofErr w:type="spellStart"/>
+      <w:r>
+        <w:rPr>
+          <w:sz w:val="32"/>
+          <w:szCs w:val="32"/>
+        </w:rPr>
+        <w:t>useStore</w:t>
+      </w:r>
+      <w:proofErr w:type="spellEnd"/>
+      <w:r>
+        <w:rPr>
+          <w:sz w:val="32"/>
+          <w:szCs w:val="32"/>
+        </w:rPr>
+        <w:t xml:space="preserve"> = ….</w:t>
       </w:r>
     </w:p>
     <w:p>
@@ -608,7 +933,39 @@
           <w:sz w:val="32"/>
           <w:szCs w:val="32"/>
         </w:rPr>
-        <w:t>And then import it as import useStore from “../src/useStore.js”</w:t>
+        <w:t xml:space="preserve">And then import it as import </w:t>
+      </w:r>
+      <w:proofErr w:type="spellStart"/>
+      <w:r>
+        <w:rPr>
+          <w:sz w:val="32"/>
+          <w:szCs w:val="32"/>
+        </w:rPr>
+        <w:t>useStore</w:t>
+      </w:r>
+      <w:proofErr w:type="spellEnd"/>
+      <w:r>
+        <w:rPr>
+          <w:sz w:val="32"/>
+          <w:szCs w:val="32"/>
+        </w:rPr>
+        <w:t xml:space="preserve"> from “../</w:t>
+      </w:r>
+      <w:proofErr w:type="spellStart"/>
+      <w:r>
+        <w:rPr>
+          <w:sz w:val="32"/>
+          <w:szCs w:val="32"/>
+        </w:rPr>
+        <w:t>src</w:t>
+      </w:r>
+      <w:proofErr w:type="spellEnd"/>
+      <w:r>
+        <w:rPr>
+          <w:sz w:val="32"/>
+          <w:szCs w:val="32"/>
+        </w:rPr>
+        <w:t>/useStore.js”</w:t>
       </w:r>
     </w:p>
     <w:p>
@@ -639,7 +996,73 @@
           <w:sz w:val="32"/>
           <w:szCs w:val="32"/>
         </w:rPr>
-        <w:t>Const { bears, updateBears } = useStore()</w:t>
+        <w:t xml:space="preserve">Const </w:t>
+      </w:r>
+      <w:proofErr w:type="gramStart"/>
+      <w:r>
+        <w:rPr>
+          <w:sz w:val="32"/>
+          <w:szCs w:val="32"/>
+        </w:rPr>
+        <w:t>{ bears</w:t>
+      </w:r>
+      <w:proofErr w:type="gramEnd"/>
+      <w:r>
+        <w:rPr>
+          <w:sz w:val="32"/>
+          <w:szCs w:val="32"/>
+        </w:rPr>
+        <w:t xml:space="preserve">, </w:t>
+      </w:r>
+      <w:proofErr w:type="spellStart"/>
+      <w:proofErr w:type="gramStart"/>
+      <w:r>
+        <w:rPr>
+          <w:sz w:val="32"/>
+          <w:szCs w:val="32"/>
+        </w:rPr>
+        <w:t>updateBears</w:t>
+      </w:r>
+      <w:proofErr w:type="spellEnd"/>
+      <w:r>
+        <w:rPr>
+          <w:sz w:val="32"/>
+          <w:szCs w:val="32"/>
+        </w:rPr>
+        <w:t xml:space="preserve"> }</w:t>
+      </w:r>
+      <w:proofErr w:type="gramEnd"/>
+      <w:r>
+        <w:rPr>
+          <w:sz w:val="32"/>
+          <w:szCs w:val="32"/>
+        </w:rPr>
+        <w:t xml:space="preserve"> = </w:t>
+      </w:r>
+      <w:proofErr w:type="spellStart"/>
+      <w:proofErr w:type="gramStart"/>
+      <w:r>
+        <w:rPr>
+          <w:sz w:val="32"/>
+          <w:szCs w:val="32"/>
+        </w:rPr>
+        <w:t>useStore</w:t>
+      </w:r>
+      <w:proofErr w:type="spellEnd"/>
+      <w:r>
+        <w:rPr>
+          <w:sz w:val="32"/>
+          <w:szCs w:val="32"/>
+        </w:rPr>
+        <w:t>(</w:t>
+      </w:r>
+      <w:proofErr w:type="gramEnd"/>
+      <w:r>
+        <w:rPr>
+          <w:sz w:val="32"/>
+          <w:szCs w:val="32"/>
+        </w:rPr>
+        <w:t>)</w:t>
       </w:r>
     </w:p>
     <w:p>
@@ -770,6 +1193,7 @@
       </w:pPr>
       <w:r>
         <w:rPr>
+          <w:noProof/>
           <w:sz w:val="32"/>
           <w:szCs w:val="32"/>
         </w:rPr>
@@ -820,6 +1244,7 @@
       </w:pPr>
       <w:r>
         <w:rPr>
+          <w:noProof/>
           <w:sz w:val="32"/>
           <w:szCs w:val="32"/>
         </w:rPr>
@@ -893,6 +1318,7 @@
         <w:rPr>
           <w:b/>
           <w:bCs/>
+          <w:noProof/>
           <w:sz w:val="32"/>
           <w:szCs w:val="32"/>
         </w:rPr>
@@ -946,6 +1372,7 @@
         <w:rPr>
           <w:b/>
           <w:bCs/>
+          <w:noProof/>
           <w:sz w:val="32"/>
           <w:szCs w:val="32"/>
         </w:rPr>
@@ -975,6 +1402,1615 @@
                     <a:xfrm>
                       <a:off x="0" y="0"/>
                       <a:ext cx="5220429" cy="2114845"/>
+                    </a:xfrm>
+                    <a:prstGeom prst="rect">
+                      <a:avLst/>
+                    </a:prstGeom>
+                  </pic:spPr>
+                </pic:pic>
+              </a:graphicData>
+            </a:graphic>
+          </wp:inline>
+        </w:drawing>
+      </w:r>
+    </w:p>
+    <w:p>
+      <w:pPr>
+        <w:rPr>
+          <w:b/>
+          <w:bCs/>
+          <w:sz w:val="32"/>
+          <w:szCs w:val="32"/>
+        </w:rPr>
+      </w:pPr>
+    </w:p>
+    <w:p>
+      <w:pPr>
+        <w:rPr>
+          <w:b/>
+          <w:bCs/>
+          <w:sz w:val="32"/>
+          <w:szCs w:val="32"/>
+        </w:rPr>
+      </w:pPr>
+    </w:p>
+    <w:p>
+      <w:pPr>
+        <w:rPr>
+          <w:b/>
+          <w:bCs/>
+          <w:sz w:val="32"/>
+          <w:szCs w:val="32"/>
+        </w:rPr>
+      </w:pPr>
+      <w:r>
+        <w:rPr>
+          <w:b/>
+          <w:bCs/>
+          <w:sz w:val="32"/>
+          <w:szCs w:val="32"/>
+          <w:highlight w:val="yellow"/>
+        </w:rPr>
+        <w:t xml:space="preserve">Ripple effect and getting position of </w:t>
+      </w:r>
+      <w:proofErr w:type="spellStart"/>
+      <w:r>
+        <w:rPr>
+          <w:b/>
+          <w:bCs/>
+          <w:sz w:val="32"/>
+          <w:szCs w:val="32"/>
+          <w:highlight w:val="yellow"/>
+        </w:rPr>
+        <w:t>el</w:t>
+      </w:r>
+      <w:proofErr w:type="spellEnd"/>
+      <w:r>
+        <w:rPr>
+          <w:b/>
+          <w:bCs/>
+          <w:sz w:val="32"/>
+          <w:szCs w:val="32"/>
+          <w:highlight w:val="yellow"/>
+        </w:rPr>
+        <w:t xml:space="preserve"> using </w:t>
+      </w:r>
+      <w:proofErr w:type="spellStart"/>
+      <w:r>
+        <w:rPr>
+          <w:b/>
+          <w:bCs/>
+          <w:sz w:val="32"/>
+          <w:szCs w:val="32"/>
+          <w:highlight w:val="yellow"/>
+        </w:rPr>
+        <w:t>javascript</w:t>
+      </w:r>
+      <w:proofErr w:type="spellEnd"/>
+    </w:p>
+    <w:p>
+      <w:pPr>
+        <w:rPr>
+          <w:b/>
+          <w:bCs/>
+          <w:sz w:val="32"/>
+          <w:szCs w:val="32"/>
+        </w:rPr>
+      </w:pPr>
+      <w:r>
+        <w:rPr>
+          <w:b/>
+          <w:bCs/>
+          <w:noProof/>
+          <w:sz w:val="32"/>
+          <w:szCs w:val="32"/>
+        </w:rPr>
+        <mc:AlternateContent>
+          <mc:Choice Requires="wpi">
+            <w:drawing>
+              <wp:anchor distT="0" distB="0" distL="114300" distR="114300" simplePos="0" relativeHeight="251696128" behindDoc="0" locked="0" layoutInCell="1" allowOverlap="1" wp14:anchorId="35B93D03" wp14:editId="24A0FE1E">
+                <wp:simplePos x="0" y="0"/>
+                <wp:positionH relativeFrom="column">
+                  <wp:posOffset>172470</wp:posOffset>
+                </wp:positionH>
+                <wp:positionV relativeFrom="paragraph">
+                  <wp:posOffset>2466010</wp:posOffset>
+                </wp:positionV>
+                <wp:extent cx="142200" cy="211320"/>
+                <wp:effectExtent l="76200" t="76200" r="29845" b="55880"/>
+                <wp:wrapNone/>
+                <wp:docPr id="775467428" name="Ink 37"/>
+                <wp:cNvGraphicFramePr>
+                  <a:graphicFrameLocks xmlns:a="http://schemas.openxmlformats.org/drawingml/2006/main"/>
+                </wp:cNvGraphicFramePr>
+                <a:graphic xmlns:a="http://schemas.openxmlformats.org/drawingml/2006/main">
+                  <a:graphicData uri="http://schemas.microsoft.com/office/word/2010/wordprocessingInk">
+                    <w14:contentPart bwMode="auto" r:id="rId17">
+                      <w14:nvContentPartPr>
+                        <w14:cNvContentPartPr>
+                          <a14:cpLocks xmlns:a14="http://schemas.microsoft.com/office/drawing/2010/main" noRot="1"/>
+                        </w14:cNvContentPartPr>
+                      </w14:nvContentPartPr>
+                      <w14:xfrm>
+                        <a:off x="0" y="0"/>
+                        <a:ext cx="142200" cy="211320"/>
+                      </w14:xfrm>
+                    </w14:contentPart>
+                  </a:graphicData>
+                </a:graphic>
+              </wp:anchor>
+            </w:drawing>
+          </mc:Choice>
+          <mc:Fallback>
+            <w:pict>
+              <v:shapetype w14:anchorId="49E03B41" id="_x0000_t75" coordsize="21600,21600" o:spt="75" o:preferrelative="t" path="m@4@5l@4@11@9@11@9@5xe" filled="f" stroked="f">
+                <v:stroke joinstyle="miter"/>
+                <v:formulas>
+                  <v:f eqn="if lineDrawn pixelLineWidth 0"/>
+                  <v:f eqn="sum @0 1 0"/>
+                  <v:f eqn="sum 0 0 @1"/>
+                  <v:f eqn="prod @2 1 2"/>
+                  <v:f eqn="prod @3 21600 pixelWidth"/>
+                  <v:f eqn="prod @3 21600 pixelHeight"/>
+                  <v:f eqn="sum @0 0 1"/>
+                  <v:f eqn="prod @6 1 2"/>
+                  <v:f eqn="prod @7 21600 pixelWidth"/>
+                  <v:f eqn="sum @8 21600 0"/>
+                  <v:f eqn="prod @7 21600 pixelHeight"/>
+                  <v:f eqn="sum @10 21600 0"/>
+                </v:formulas>
+                <v:path o:extrusionok="f" gradientshapeok="t" o:connecttype="rect"/>
+                <o:lock v:ext="edit" aspectratio="t"/>
+              </v:shapetype>
+              <v:shape id="Ink 37" o:spid="_x0000_s1026" type="#_x0000_t75" style="position:absolute;margin-left:12.2pt;margin-top:192.75pt;width:14.05pt;height:19.5pt;z-index:251696128;visibility:visible;mso-wrap-style:square;mso-wrap-distance-left:9pt;mso-wrap-distance-top:0;mso-wrap-distance-right:9pt;mso-wrap-distance-bottom:0;mso-position-horizontal:absolute;mso-position-horizontal-relative:text;mso-position-vertical:absolute;mso-position-vertical-relative:text" o:gfxdata="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">
+                <v:imagedata r:id="rId18" o:title=""/>
+                <o:lock v:ext="edit" rotation="t" aspectratio="f"/>
+              </v:shape>
+            </w:pict>
+          </mc:Fallback>
+        </mc:AlternateContent>
+      </w:r>
+      <w:r>
+        <w:rPr>
+          <w:b/>
+          <w:bCs/>
+          <w:noProof/>
+          <w:sz w:val="32"/>
+          <w:szCs w:val="32"/>
+        </w:rPr>
+        <mc:AlternateContent>
+          <mc:Choice Requires="wpi">
+            <w:drawing>
+              <wp:anchor distT="0" distB="0" distL="114300" distR="114300" simplePos="0" relativeHeight="251695104" behindDoc="0" locked="0" layoutInCell="1" allowOverlap="1" wp14:anchorId="08157E1C" wp14:editId="71E3CFA2">
+                <wp:simplePos x="0" y="0"/>
+                <wp:positionH relativeFrom="column">
+                  <wp:posOffset>4295140</wp:posOffset>
+                </wp:positionH>
+                <wp:positionV relativeFrom="paragraph">
+                  <wp:posOffset>2465705</wp:posOffset>
+                </wp:positionV>
+                <wp:extent cx="296385" cy="216535"/>
+                <wp:effectExtent l="57150" t="76200" r="46990" b="50165"/>
+                <wp:wrapNone/>
+                <wp:docPr id="112827200" name="Ink 36"/>
+                <wp:cNvGraphicFramePr>
+                  <a:graphicFrameLocks xmlns:a="http://schemas.openxmlformats.org/drawingml/2006/main"/>
+                </wp:cNvGraphicFramePr>
+                <a:graphic xmlns:a="http://schemas.openxmlformats.org/drawingml/2006/main">
+                  <a:graphicData uri="http://schemas.microsoft.com/office/word/2010/wordprocessingInk">
+                    <w14:contentPart bwMode="auto" r:id="rId19">
+                      <w14:nvContentPartPr>
+                        <w14:cNvContentPartPr>
+                          <a14:cpLocks xmlns:a14="http://schemas.microsoft.com/office/drawing/2010/main" noRot="1"/>
+                        </w14:cNvContentPartPr>
+                      </w14:nvContentPartPr>
+                      <w14:xfrm>
+                        <a:off x="0" y="0"/>
+                        <a:ext cx="296385" cy="216535"/>
+                      </w14:xfrm>
+                    </w14:contentPart>
+                  </a:graphicData>
+                </a:graphic>
+              </wp:anchor>
+            </w:drawing>
+          </mc:Choice>
+          <mc:Fallback>
+            <w:pict>
+              <v:shape w14:anchorId="1D4C2071" id="Ink 36" o:spid="_x0000_s1026" type="#_x0000_t75" style="position:absolute;margin-left:336.8pt;margin-top:192.75pt;width:26.2pt;height:19.85pt;z-index:251695104;visibility:visible;mso-wrap-style:square;mso-wrap-distance-left:9pt;mso-wrap-distance-top:0;mso-wrap-distance-right:9pt;mso-wrap-distance-bottom:0;mso-position-horizontal:absolute;mso-position-horizontal-relative:text;mso-position-vertical:absolute;mso-position-vertical-relative:text" o:gfxdata="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">
+                <v:imagedata r:id="rId20" o:title=""/>
+                <o:lock v:ext="edit" rotation="t" aspectratio="f"/>
+              </v:shape>
+            </w:pict>
+          </mc:Fallback>
+        </mc:AlternateContent>
+      </w:r>
+      <w:r>
+        <w:rPr>
+          <w:b/>
+          <w:bCs/>
+          <w:noProof/>
+          <w:sz w:val="32"/>
+          <w:szCs w:val="32"/>
+        </w:rPr>
+        <mc:AlternateContent>
+          <mc:Choice Requires="wpi">
+            <w:drawing>
+              <wp:anchor distT="0" distB="0" distL="114300" distR="114300" simplePos="0" relativeHeight="251689984" behindDoc="0" locked="0" layoutInCell="1" allowOverlap="1" wp14:anchorId="7D00F673" wp14:editId="3D05B8B7">
+                <wp:simplePos x="0" y="0"/>
+                <wp:positionH relativeFrom="column">
+                  <wp:posOffset>333030</wp:posOffset>
+                </wp:positionH>
+                <wp:positionV relativeFrom="paragraph">
+                  <wp:posOffset>2482930</wp:posOffset>
+                </wp:positionV>
+                <wp:extent cx="3969360" cy="360"/>
+                <wp:effectExtent l="57150" t="57150" r="50800" b="38100"/>
+                <wp:wrapNone/>
+                <wp:docPr id="309653754" name="Ink 31"/>
+                <wp:cNvGraphicFramePr>
+                  <a:graphicFrameLocks xmlns:a="http://schemas.openxmlformats.org/drawingml/2006/main"/>
+                </wp:cNvGraphicFramePr>
+                <a:graphic xmlns:a="http://schemas.openxmlformats.org/drawingml/2006/main">
+                  <a:graphicData uri="http://schemas.microsoft.com/office/word/2010/wordprocessingInk">
+                    <w14:contentPart bwMode="auto" r:id="rId21">
+                      <w14:nvContentPartPr>
+                        <w14:cNvContentPartPr>
+                          <a14:cpLocks xmlns:a14="http://schemas.microsoft.com/office/drawing/2010/main" noRot="1"/>
+                        </w14:cNvContentPartPr>
+                      </w14:nvContentPartPr>
+                      <w14:xfrm>
+                        <a:off x="0" y="0"/>
+                        <a:ext cx="3969360" cy="360"/>
+                      </w14:xfrm>
+                    </w14:contentPart>
+                  </a:graphicData>
+                </a:graphic>
+              </wp:anchor>
+            </w:drawing>
+          </mc:Choice>
+          <mc:Fallback>
+            <w:pict>
+              <v:shape w14:anchorId="1E0427CA" id="Ink 31" o:spid="_x0000_s1026" type="#_x0000_t75" style="position:absolute;margin-left:24.8pt;margin-top:194.1pt;width:315.4pt;height:2.9pt;z-index:251689984;visibility:visible;mso-wrap-style:square;mso-wrap-distance-left:9pt;mso-wrap-distance-top:0;mso-wrap-distance-right:9pt;mso-wrap-distance-bottom:0;mso-position-horizontal:absolute;mso-position-horizontal-relative:text;mso-position-vertical:absolute;mso-position-vertical-relative:text" o:gfxdata="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">
+                <v:imagedata r:id="rId22" o:title=""/>
+                <o:lock v:ext="edit" rotation="t" aspectratio="f"/>
+              </v:shape>
+            </w:pict>
+          </mc:Fallback>
+        </mc:AlternateContent>
+      </w:r>
+      <w:r>
+        <w:rPr>
+          <w:b/>
+          <w:bCs/>
+          <w:noProof/>
+          <w:sz w:val="32"/>
+          <w:szCs w:val="32"/>
+        </w:rPr>
+        <mc:AlternateContent>
+          <mc:Choice Requires="wpi">
+            <w:drawing>
+              <wp:anchor distT="0" distB="0" distL="114300" distR="114300" simplePos="0" relativeHeight="251688960" behindDoc="0" locked="0" layoutInCell="1" allowOverlap="1" wp14:anchorId="08A84D61" wp14:editId="053C7CFE">
+                <wp:simplePos x="0" y="0"/>
+                <wp:positionH relativeFrom="column">
+                  <wp:posOffset>304590</wp:posOffset>
+                </wp:positionH>
+                <wp:positionV relativeFrom="paragraph">
+                  <wp:posOffset>2673370</wp:posOffset>
+                </wp:positionV>
+                <wp:extent cx="740880" cy="360"/>
+                <wp:effectExtent l="57150" t="57150" r="40640" b="38100"/>
+                <wp:wrapNone/>
+                <wp:docPr id="1043616185" name="Ink 30"/>
+                <wp:cNvGraphicFramePr>
+                  <a:graphicFrameLocks xmlns:a="http://schemas.openxmlformats.org/drawingml/2006/main"/>
+                </wp:cNvGraphicFramePr>
+                <a:graphic xmlns:a="http://schemas.openxmlformats.org/drawingml/2006/main">
+                  <a:graphicData uri="http://schemas.microsoft.com/office/word/2010/wordprocessingInk">
+                    <w14:contentPart bwMode="auto" r:id="rId23">
+                      <w14:nvContentPartPr>
+                        <w14:cNvContentPartPr>
+                          <a14:cpLocks xmlns:a14="http://schemas.microsoft.com/office/drawing/2010/main" noRot="1"/>
+                        </w14:cNvContentPartPr>
+                      </w14:nvContentPartPr>
+                      <w14:xfrm>
+                        <a:off x="0" y="0"/>
+                        <a:ext cx="740880" cy="360"/>
+                      </w14:xfrm>
+                    </w14:contentPart>
+                  </a:graphicData>
+                </a:graphic>
+              </wp:anchor>
+            </w:drawing>
+          </mc:Choice>
+          <mc:Fallback>
+            <w:pict>
+              <v:shape w14:anchorId="0CB0BBBA" id="Ink 30" o:spid="_x0000_s1026" type="#_x0000_t75" style="position:absolute;margin-left:22.6pt;margin-top:209.1pt;width:61.2pt;height:2.9pt;z-index:251688960;visibility:visible;mso-wrap-style:square;mso-wrap-distance-left:9pt;mso-wrap-distance-top:0;mso-wrap-distance-right:9pt;mso-wrap-distance-bottom:0;mso-position-horizontal:absolute;mso-position-horizontal-relative:text;mso-position-vertical:absolute;mso-position-vertical-relative:text" o:gfxdata="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">
+                <v:imagedata r:id="rId24" o:title=""/>
+                <o:lock v:ext="edit" rotation="t" aspectratio="f"/>
+              </v:shape>
+            </w:pict>
+          </mc:Fallback>
+        </mc:AlternateContent>
+      </w:r>
+      <w:r>
+        <w:rPr>
+          <w:b/>
+          <w:bCs/>
+          <w:noProof/>
+          <w:sz w:val="32"/>
+          <w:szCs w:val="32"/>
+        </w:rPr>
+        <mc:AlternateContent>
+          <mc:Choice Requires="wpi">
+            <w:drawing>
+              <wp:anchor distT="0" distB="0" distL="114300" distR="114300" simplePos="0" relativeHeight="251687936" behindDoc="0" locked="0" layoutInCell="1" allowOverlap="1" wp14:anchorId="3DC72A87" wp14:editId="6A7DCFCD">
+                <wp:simplePos x="0" y="0"/>
+                <wp:positionH relativeFrom="column">
+                  <wp:posOffset>790230</wp:posOffset>
+                </wp:positionH>
+                <wp:positionV relativeFrom="paragraph">
+                  <wp:posOffset>2663650</wp:posOffset>
+                </wp:positionV>
+                <wp:extent cx="3507120" cy="360"/>
+                <wp:effectExtent l="57150" t="57150" r="36195" b="38100"/>
+                <wp:wrapNone/>
+                <wp:docPr id="1361139311" name="Ink 29"/>
+                <wp:cNvGraphicFramePr>
+                  <a:graphicFrameLocks xmlns:a="http://schemas.openxmlformats.org/drawingml/2006/main"/>
+                </wp:cNvGraphicFramePr>
+                <a:graphic xmlns:a="http://schemas.openxmlformats.org/drawingml/2006/main">
+                  <a:graphicData uri="http://schemas.microsoft.com/office/word/2010/wordprocessingInk">
+                    <w14:contentPart bwMode="auto" r:id="rId25">
+                      <w14:nvContentPartPr>
+                        <w14:cNvContentPartPr>
+                          <a14:cpLocks xmlns:a14="http://schemas.microsoft.com/office/drawing/2010/main" noRot="1"/>
+                        </w14:cNvContentPartPr>
+                      </w14:nvContentPartPr>
+                      <w14:xfrm>
+                        <a:off x="0" y="0"/>
+                        <a:ext cx="3507120" cy="360"/>
+                      </w14:xfrm>
+                    </w14:contentPart>
+                  </a:graphicData>
+                </a:graphic>
+              </wp:anchor>
+            </w:drawing>
+          </mc:Choice>
+          <mc:Fallback>
+            <w:pict>
+              <v:shape w14:anchorId="224DCB3D" id="Ink 29" o:spid="_x0000_s1026" type="#_x0000_t75" style="position:absolute;margin-left:60.8pt;margin-top:208.35pt;width:278.95pt;height:2.9pt;z-index:251687936;visibility:visible;mso-wrap-style:square;mso-wrap-distance-left:9pt;mso-wrap-distance-top:0;mso-wrap-distance-right:9pt;mso-wrap-distance-bottom:0;mso-position-horizontal:absolute;mso-position-horizontal-relative:text;mso-position-vertical:absolute;mso-position-vertical-relative:text" o:gfxdata="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">
+                <v:imagedata r:id="rId26" o:title=""/>
+                <o:lock v:ext="edit" rotation="t" aspectratio="f"/>
+              </v:shape>
+            </w:pict>
+          </mc:Fallback>
+        </mc:AlternateContent>
+      </w:r>
+      <w:r>
+        <w:rPr>
+          <w:b/>
+          <w:bCs/>
+          <w:noProof/>
+          <w:sz w:val="32"/>
+          <w:szCs w:val="32"/>
+        </w:rPr>
+        <mc:AlternateContent>
+          <mc:Choice Requires="wpi">
+            <w:drawing>
+              <wp:anchor distT="0" distB="0" distL="114300" distR="114300" simplePos="0" relativeHeight="251686912" behindDoc="0" locked="0" layoutInCell="1" allowOverlap="1" wp14:anchorId="56062B13" wp14:editId="25DEAF5A">
+                <wp:simplePos x="0" y="0"/>
+                <wp:positionH relativeFrom="column">
+                  <wp:posOffset>237490</wp:posOffset>
+                </wp:positionH>
+                <wp:positionV relativeFrom="paragraph">
+                  <wp:posOffset>834390</wp:posOffset>
+                </wp:positionV>
+                <wp:extent cx="3038735" cy="224155"/>
+                <wp:effectExtent l="76200" t="57150" r="0" b="42545"/>
+                <wp:wrapNone/>
+                <wp:docPr id="1609573376" name="Ink 28"/>
+                <wp:cNvGraphicFramePr>
+                  <a:graphicFrameLocks xmlns:a="http://schemas.openxmlformats.org/drawingml/2006/main"/>
+                </wp:cNvGraphicFramePr>
+                <a:graphic xmlns:a="http://schemas.openxmlformats.org/drawingml/2006/main">
+                  <a:graphicData uri="http://schemas.microsoft.com/office/word/2010/wordprocessingInk">
+                    <w14:contentPart bwMode="auto" r:id="rId27">
+                      <w14:nvContentPartPr>
+                        <w14:cNvContentPartPr>
+                          <a14:cpLocks xmlns:a14="http://schemas.microsoft.com/office/drawing/2010/main" noRot="1"/>
+                        </w14:cNvContentPartPr>
+                      </w14:nvContentPartPr>
+                      <w14:xfrm>
+                        <a:off x="0" y="0"/>
+                        <a:ext cx="3038735" cy="224155"/>
+                      </w14:xfrm>
+                    </w14:contentPart>
+                  </a:graphicData>
+                </a:graphic>
+              </wp:anchor>
+            </w:drawing>
+          </mc:Choice>
+          <mc:Fallback>
+            <w:pict>
+              <v:shape w14:anchorId="5B5E8490" id="Ink 28" o:spid="_x0000_s1026" type="#_x0000_t75" style="position:absolute;margin-left:17.3pt;margin-top:64.3pt;width:242.1pt;height:20.45pt;z-index:251686912;visibility:visible;mso-wrap-style:square;mso-wrap-distance-left:9pt;mso-wrap-distance-top:0;mso-wrap-distance-right:9pt;mso-wrap-distance-bottom:0;mso-position-horizontal:absolute;mso-position-horizontal-relative:text;mso-position-vertical:absolute;mso-position-vertical-relative:text" o:gfxdata="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">
+                <v:imagedata r:id="rId28" o:title=""/>
+                <o:lock v:ext="edit" rotation="t" aspectratio="f"/>
+              </v:shape>
+            </w:pict>
+          </mc:Fallback>
+        </mc:AlternateContent>
+      </w:r>
+      <w:r>
+        <w:rPr>
+          <w:b/>
+          <w:bCs/>
+          <w:noProof/>
+          <w:sz w:val="32"/>
+          <w:szCs w:val="32"/>
+        </w:rPr>
+        <mc:AlternateContent>
+          <mc:Choice Requires="wpi">
+            <w:drawing>
+              <wp:anchor distT="0" distB="0" distL="114300" distR="114300" simplePos="0" relativeHeight="251681792" behindDoc="0" locked="0" layoutInCell="1" allowOverlap="1" wp14:anchorId="06303809" wp14:editId="18B2C0A9">
+                <wp:simplePos x="0" y="0"/>
+                <wp:positionH relativeFrom="column">
+                  <wp:posOffset>266430</wp:posOffset>
+                </wp:positionH>
+                <wp:positionV relativeFrom="paragraph">
+                  <wp:posOffset>1044730</wp:posOffset>
+                </wp:positionV>
+                <wp:extent cx="2850480" cy="360"/>
+                <wp:effectExtent l="57150" t="57150" r="45720" b="38100"/>
+                <wp:wrapNone/>
+                <wp:docPr id="1646937557" name="Ink 23"/>
+                <wp:cNvGraphicFramePr>
+                  <a:graphicFrameLocks xmlns:a="http://schemas.openxmlformats.org/drawingml/2006/main"/>
+                </wp:cNvGraphicFramePr>
+                <a:graphic xmlns:a="http://schemas.openxmlformats.org/drawingml/2006/main">
+                  <a:graphicData uri="http://schemas.microsoft.com/office/word/2010/wordprocessingInk">
+                    <w14:contentPart bwMode="auto" r:id="rId29">
+                      <w14:nvContentPartPr>
+                        <w14:cNvContentPartPr>
+                          <a14:cpLocks xmlns:a14="http://schemas.microsoft.com/office/drawing/2010/main" noRot="1"/>
+                        </w14:cNvContentPartPr>
+                      </w14:nvContentPartPr>
+                      <w14:xfrm>
+                        <a:off x="0" y="0"/>
+                        <a:ext cx="2850480" cy="360"/>
+                      </w14:xfrm>
+                    </w14:contentPart>
+                  </a:graphicData>
+                </a:graphic>
+              </wp:anchor>
+            </w:drawing>
+          </mc:Choice>
+          <mc:Fallback>
+            <w:pict>
+              <v:shape w14:anchorId="57D4AE11" id="Ink 23" o:spid="_x0000_s1026" type="#_x0000_t75" style="position:absolute;margin-left:19.6pt;margin-top:80.85pt;width:227.3pt;height:2.9pt;z-index:251681792;visibility:visible;mso-wrap-style:square;mso-wrap-distance-left:9pt;mso-wrap-distance-top:0;mso-wrap-distance-right:9pt;mso-wrap-distance-bottom:0;mso-position-horizontal:absolute;mso-position-horizontal-relative:text;mso-position-vertical:absolute;mso-position-vertical-relative:text" o:gfxdata="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">
+                <v:imagedata r:id="rId30" o:title=""/>
+                <o:lock v:ext="edit" rotation="t" aspectratio="f"/>
+              </v:shape>
+            </w:pict>
+          </mc:Fallback>
+        </mc:AlternateContent>
+      </w:r>
+      <w:r>
+        <w:rPr>
+          <w:b/>
+          <w:bCs/>
+          <w:sz w:val="32"/>
+          <w:szCs w:val="32"/>
+        </w:rPr>
+        <w:drawing>
+          <wp:inline distT="0" distB="0" distL="0" distR="0" wp14:anchorId="51FE0251" wp14:editId="18ABBFA9">
+            <wp:extent cx="4801270" cy="2915057"/>
+            <wp:effectExtent l="0" t="0" r="0" b="0"/>
+            <wp:docPr id="1011159257" name="Picture 1"/>
+            <wp:cNvGraphicFramePr>
+              <a:graphicFrameLocks xmlns:a="http://schemas.openxmlformats.org/drawingml/2006/main" noChangeAspect="1"/>
+            </wp:cNvGraphicFramePr>
+            <a:graphic xmlns:a="http://schemas.openxmlformats.org/drawingml/2006/main">
+              <a:graphicData uri="http://schemas.openxmlformats.org/drawingml/2006/picture">
+                <pic:pic xmlns:pic="http://schemas.openxmlformats.org/drawingml/2006/picture">
+                  <pic:nvPicPr>
+                    <pic:cNvPr id="1011159257" name=""/>
+                    <pic:cNvPicPr/>
+                  </pic:nvPicPr>
+                  <pic:blipFill>
+                    <a:blip r:embed="rId31"/>
+                    <a:stretch>
+                      <a:fillRect/>
+                    </a:stretch>
+                  </pic:blipFill>
+                  <pic:spPr>
+                    <a:xfrm>
+                      <a:off x="0" y="0"/>
+                      <a:ext cx="4801270" cy="2915057"/>
+                    </a:xfrm>
+                    <a:prstGeom prst="rect">
+                      <a:avLst/>
+                    </a:prstGeom>
+                  </pic:spPr>
+                </pic:pic>
+              </a:graphicData>
+            </a:graphic>
+          </wp:inline>
+        </w:drawing>
+      </w:r>
+    </w:p>
+    <w:p>
+      <w:pPr>
+        <w:rPr>
+          <w:b/>
+          <w:bCs/>
+          <w:sz w:val="32"/>
+          <w:szCs w:val="32"/>
+        </w:rPr>
+      </w:pPr>
+    </w:p>
+    <w:p>
+      <w:pPr>
+        <w:rPr>
+          <w:b/>
+          <w:bCs/>
+          <w:sz w:val="32"/>
+          <w:szCs w:val="32"/>
+        </w:rPr>
+      </w:pPr>
+    </w:p>
+    <w:p>
+      <w:pPr>
+        <w:rPr>
+          <w:b/>
+          <w:bCs/>
+          <w:sz w:val="32"/>
+          <w:szCs w:val="32"/>
+        </w:rPr>
+      </w:pPr>
+      <w:r>
+        <w:rPr>
+          <w:b/>
+          <w:bCs/>
+          <w:noProof/>
+          <w:sz w:val="32"/>
+          <w:szCs w:val="32"/>
+        </w:rPr>
+        <w:lastRenderedPageBreak/>
+        <mc:AlternateContent>
+          <mc:Choice Requires="wpi">
+            <w:drawing>
+              <wp:anchor distT="0" distB="0" distL="114300" distR="114300" simplePos="0" relativeHeight="251680768" behindDoc="0" locked="0" layoutInCell="1" allowOverlap="1" wp14:anchorId="19AB10F9" wp14:editId="20C9EEC1">
+                <wp:simplePos x="0" y="0"/>
+                <wp:positionH relativeFrom="column">
+                  <wp:posOffset>3362070</wp:posOffset>
+                </wp:positionH>
+                <wp:positionV relativeFrom="paragraph">
+                  <wp:posOffset>971430</wp:posOffset>
+                </wp:positionV>
+                <wp:extent cx="66600" cy="178200"/>
+                <wp:effectExtent l="57150" t="76200" r="0" b="50800"/>
+                <wp:wrapNone/>
+                <wp:docPr id="1296675188" name="Ink 22"/>
+                <wp:cNvGraphicFramePr>
+                  <a:graphicFrameLocks xmlns:a="http://schemas.openxmlformats.org/drawingml/2006/main"/>
+                </wp:cNvGraphicFramePr>
+                <a:graphic xmlns:a="http://schemas.openxmlformats.org/drawingml/2006/main">
+                  <a:graphicData uri="http://schemas.microsoft.com/office/word/2010/wordprocessingInk">
+                    <w14:contentPart bwMode="auto" r:id="rId32">
+                      <w14:nvContentPartPr>
+                        <w14:cNvContentPartPr>
+                          <a14:cpLocks xmlns:a14="http://schemas.microsoft.com/office/drawing/2010/main" noRot="1"/>
+                        </w14:cNvContentPartPr>
+                      </w14:nvContentPartPr>
+                      <w14:xfrm>
+                        <a:off x="0" y="0"/>
+                        <a:ext cx="66600" cy="178200"/>
+                      </w14:xfrm>
+                    </w14:contentPart>
+                  </a:graphicData>
+                </a:graphic>
+              </wp:anchor>
+            </w:drawing>
+          </mc:Choice>
+          <mc:Fallback>
+            <w:pict>
+              <v:shape w14:anchorId="147474BE" id="Ink 22" o:spid="_x0000_s1026" type="#_x0000_t75" style="position:absolute;margin-left:263.35pt;margin-top:75.1pt;width:8.1pt;height:16.9pt;z-index:251680768;visibility:visible;mso-wrap-style:square;mso-wrap-distance-left:9pt;mso-wrap-distance-top:0;mso-wrap-distance-right:9pt;mso-wrap-distance-bottom:0;mso-position-horizontal:absolute;mso-position-horizontal-relative:text;mso-position-vertical:absolute;mso-position-vertical-relative:text" o:gfxdata="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">
+                <v:imagedata r:id="rId33" o:title=""/>
+                <o:lock v:ext="edit" rotation="t" aspectratio="f"/>
+              </v:shape>
+            </w:pict>
+          </mc:Fallback>
+        </mc:AlternateContent>
+      </w:r>
+      <w:r>
+        <w:rPr>
+          <w:b/>
+          <w:bCs/>
+          <w:noProof/>
+          <w:sz w:val="32"/>
+          <w:szCs w:val="32"/>
+        </w:rPr>
+        <mc:AlternateContent>
+          <mc:Choice Requires="wpi">
+            <w:drawing>
+              <wp:anchor distT="0" distB="0" distL="114300" distR="114300" simplePos="0" relativeHeight="251679744" behindDoc="0" locked="0" layoutInCell="1" allowOverlap="1" wp14:anchorId="2737C48C" wp14:editId="2BDE7482">
+                <wp:simplePos x="0" y="0"/>
+                <wp:positionH relativeFrom="column">
+                  <wp:posOffset>3361690</wp:posOffset>
+                </wp:positionH>
+                <wp:positionV relativeFrom="paragraph">
+                  <wp:posOffset>1207135</wp:posOffset>
+                </wp:positionV>
+                <wp:extent cx="27125" cy="360"/>
+                <wp:effectExtent l="57150" t="57150" r="49530" b="38100"/>
+                <wp:wrapNone/>
+                <wp:docPr id="601690735" name="Ink 21"/>
+                <wp:cNvGraphicFramePr>
+                  <a:graphicFrameLocks xmlns:a="http://schemas.openxmlformats.org/drawingml/2006/main"/>
+                </wp:cNvGraphicFramePr>
+                <a:graphic xmlns:a="http://schemas.openxmlformats.org/drawingml/2006/main">
+                  <a:graphicData uri="http://schemas.microsoft.com/office/word/2010/wordprocessingInk">
+                    <w14:contentPart bwMode="auto" r:id="rId34">
+                      <w14:nvContentPartPr>
+                        <w14:cNvContentPartPr>
+                          <a14:cpLocks xmlns:a14="http://schemas.microsoft.com/office/drawing/2010/main" noRot="1"/>
+                        </w14:cNvContentPartPr>
+                      </w14:nvContentPartPr>
+                      <w14:xfrm>
+                        <a:off x="0" y="0"/>
+                        <a:ext cx="27125" cy="360"/>
+                      </w14:xfrm>
+                    </w14:contentPart>
+                  </a:graphicData>
+                </a:graphic>
+              </wp:anchor>
+            </w:drawing>
+          </mc:Choice>
+          <mc:Fallback>
+            <w:pict>
+              <v:shape w14:anchorId="707D3930" id="Ink 21" o:spid="_x0000_s1026" type="#_x0000_t75" style="position:absolute;margin-left:263.3pt;margin-top:93.65pt;width:5pt;height:2.9pt;z-index:251679744;visibility:visible;mso-wrap-style:square;mso-wrap-distance-left:9pt;mso-wrap-distance-top:0;mso-wrap-distance-right:9pt;mso-wrap-distance-bottom:0;mso-position-horizontal:absolute;mso-position-horizontal-relative:text;mso-position-vertical:absolute;mso-position-vertical-relative:text" o:gfxdata="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">
+                <v:imagedata r:id="rId35" o:title=""/>
+                <o:lock v:ext="edit" rotation="t" aspectratio="f"/>
+              </v:shape>
+            </w:pict>
+          </mc:Fallback>
+        </mc:AlternateContent>
+      </w:r>
+      <w:r>
+        <w:rPr>
+          <w:b/>
+          <w:bCs/>
+          <w:noProof/>
+          <w:sz w:val="32"/>
+          <w:szCs w:val="32"/>
+        </w:rPr>
+        <mc:AlternateContent>
+          <mc:Choice Requires="wpi">
+            <w:drawing>
+              <wp:anchor distT="0" distB="0" distL="114300" distR="114300" simplePos="0" relativeHeight="251675648" behindDoc="0" locked="0" layoutInCell="1" allowOverlap="1" wp14:anchorId="48F12869" wp14:editId="429CB9AC">
+                <wp:simplePos x="0" y="0"/>
+                <wp:positionH relativeFrom="column">
+                  <wp:posOffset>1028550</wp:posOffset>
+                </wp:positionH>
+                <wp:positionV relativeFrom="paragraph">
+                  <wp:posOffset>959550</wp:posOffset>
+                </wp:positionV>
+                <wp:extent cx="2331000" cy="360"/>
+                <wp:effectExtent l="57150" t="57150" r="50800" b="38100"/>
+                <wp:wrapNone/>
+                <wp:docPr id="2033056170" name="Ink 17"/>
+                <wp:cNvGraphicFramePr>
+                  <a:graphicFrameLocks xmlns:a="http://schemas.openxmlformats.org/drawingml/2006/main"/>
+                </wp:cNvGraphicFramePr>
+                <a:graphic xmlns:a="http://schemas.openxmlformats.org/drawingml/2006/main">
+                  <a:graphicData uri="http://schemas.microsoft.com/office/word/2010/wordprocessingInk">
+                    <w14:contentPart bwMode="auto" r:id="rId36">
+                      <w14:nvContentPartPr>
+                        <w14:cNvContentPartPr>
+                          <a14:cpLocks xmlns:a14="http://schemas.microsoft.com/office/drawing/2010/main" noRot="1"/>
+                        </w14:cNvContentPartPr>
+                      </w14:nvContentPartPr>
+                      <w14:xfrm>
+                        <a:off x="0" y="0"/>
+                        <a:ext cx="2331000" cy="360"/>
+                      </w14:xfrm>
+                    </w14:contentPart>
+                  </a:graphicData>
+                </a:graphic>
+              </wp:anchor>
+            </w:drawing>
+          </mc:Choice>
+          <mc:Fallback>
+            <w:pict>
+              <v:shape w14:anchorId="0958F2F2" id="Ink 17" o:spid="_x0000_s1026" type="#_x0000_t75" style="position:absolute;margin-left:79.6pt;margin-top:74.15pt;width:186.4pt;height:2.9pt;z-index:251675648;visibility:visible;mso-wrap-style:square;mso-wrap-distance-left:9pt;mso-wrap-distance-top:0;mso-wrap-distance-right:9pt;mso-wrap-distance-bottom:0;mso-position-horizontal:absolute;mso-position-horizontal-relative:text;mso-position-vertical:absolute;mso-position-vertical-relative:text" o:gfxdata="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">
+                <v:imagedata r:id="rId37" o:title=""/>
+                <o:lock v:ext="edit" rotation="t" aspectratio="f"/>
+              </v:shape>
+            </w:pict>
+          </mc:Fallback>
+        </mc:AlternateContent>
+      </w:r>
+      <w:r>
+        <w:rPr>
+          <w:b/>
+          <w:bCs/>
+          <w:noProof/>
+          <w:sz w:val="32"/>
+          <w:szCs w:val="32"/>
+        </w:rPr>
+        <mc:AlternateContent>
+          <mc:Choice Requires="wpi">
+            <w:drawing>
+              <wp:anchor distT="0" distB="0" distL="114300" distR="114300" simplePos="0" relativeHeight="251674624" behindDoc="0" locked="0" layoutInCell="1" allowOverlap="1" wp14:anchorId="6C3044F7" wp14:editId="4FE1923F">
+                <wp:simplePos x="0" y="0"/>
+                <wp:positionH relativeFrom="column">
+                  <wp:posOffset>1733430</wp:posOffset>
+                </wp:positionH>
+                <wp:positionV relativeFrom="paragraph">
+                  <wp:posOffset>1169070</wp:posOffset>
+                </wp:positionV>
+                <wp:extent cx="1641960" cy="360"/>
+                <wp:effectExtent l="57150" t="57150" r="53975" b="38100"/>
+                <wp:wrapNone/>
+                <wp:docPr id="394337731" name="Ink 16"/>
+                <wp:cNvGraphicFramePr>
+                  <a:graphicFrameLocks xmlns:a="http://schemas.openxmlformats.org/drawingml/2006/main"/>
+                </wp:cNvGraphicFramePr>
+                <a:graphic xmlns:a="http://schemas.openxmlformats.org/drawingml/2006/main">
+                  <a:graphicData uri="http://schemas.microsoft.com/office/word/2010/wordprocessingInk">
+                    <w14:contentPart bwMode="auto" r:id="rId38">
+                      <w14:nvContentPartPr>
+                        <w14:cNvContentPartPr>
+                          <a14:cpLocks xmlns:a14="http://schemas.microsoft.com/office/drawing/2010/main" noRot="1"/>
+                        </w14:cNvContentPartPr>
+                      </w14:nvContentPartPr>
+                      <w14:xfrm>
+                        <a:off x="0" y="0"/>
+                        <a:ext cx="1641960" cy="360"/>
+                      </w14:xfrm>
+                    </w14:contentPart>
+                  </a:graphicData>
+                </a:graphic>
+              </wp:anchor>
+            </w:drawing>
+          </mc:Choice>
+          <mc:Fallback>
+            <w:pict>
+              <v:shape w14:anchorId="01D397AA" id="Ink 16" o:spid="_x0000_s1026" type="#_x0000_t75" style="position:absolute;margin-left:135.1pt;margin-top:90.65pt;width:132.15pt;height:2.9pt;z-index:251674624;visibility:visible;mso-wrap-style:square;mso-wrap-distance-left:9pt;mso-wrap-distance-top:0;mso-wrap-distance-right:9pt;mso-wrap-distance-bottom:0;mso-position-horizontal:absolute;mso-position-horizontal-relative:text;mso-position-vertical:absolute;mso-position-vertical-relative:text" o:gfxdata="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">
+                <v:imagedata r:id="rId39" o:title=""/>
+                <o:lock v:ext="edit" rotation="t" aspectratio="f"/>
+              </v:shape>
+            </w:pict>
+          </mc:Fallback>
+        </mc:AlternateContent>
+      </w:r>
+      <w:r>
+        <w:rPr>
+          <w:b/>
+          <w:bCs/>
+          <w:noProof/>
+          <w:sz w:val="32"/>
+          <w:szCs w:val="32"/>
+        </w:rPr>
+        <mc:AlternateContent>
+          <mc:Choice Requires="wpi">
+            <w:drawing>
+              <wp:anchor distT="0" distB="0" distL="114300" distR="114300" simplePos="0" relativeHeight="251673600" behindDoc="0" locked="0" layoutInCell="1" allowOverlap="1" wp14:anchorId="77680FE4" wp14:editId="02FF95E7">
+                <wp:simplePos x="0" y="0"/>
+                <wp:positionH relativeFrom="column">
+                  <wp:posOffset>55245</wp:posOffset>
+                </wp:positionH>
+                <wp:positionV relativeFrom="paragraph">
+                  <wp:posOffset>1170940</wp:posOffset>
+                </wp:positionV>
+                <wp:extent cx="1648925" cy="173990"/>
+                <wp:effectExtent l="76200" t="76200" r="46990" b="35560"/>
+                <wp:wrapNone/>
+                <wp:docPr id="1008493902" name="Ink 15"/>
+                <wp:cNvGraphicFramePr>
+                  <a:graphicFrameLocks xmlns:a="http://schemas.openxmlformats.org/drawingml/2006/main"/>
+                </wp:cNvGraphicFramePr>
+                <a:graphic xmlns:a="http://schemas.openxmlformats.org/drawingml/2006/main">
+                  <a:graphicData uri="http://schemas.microsoft.com/office/word/2010/wordprocessingInk">
+                    <w14:contentPart bwMode="auto" r:id="rId40">
+                      <w14:nvContentPartPr>
+                        <w14:cNvContentPartPr>
+                          <a14:cpLocks xmlns:a14="http://schemas.microsoft.com/office/drawing/2010/main" noRot="1"/>
+                        </w14:cNvContentPartPr>
+                      </w14:nvContentPartPr>
+                      <w14:xfrm>
+                        <a:off x="0" y="0"/>
+                        <a:ext cx="1648925" cy="173990"/>
+                      </w14:xfrm>
+                    </w14:contentPart>
+                  </a:graphicData>
+                </a:graphic>
+              </wp:anchor>
+            </w:drawing>
+          </mc:Choice>
+          <mc:Fallback>
+            <w:pict>
+              <v:shape w14:anchorId="5BEA0423" id="Ink 15" o:spid="_x0000_s1026" type="#_x0000_t75" style="position:absolute;margin-left:2.95pt;margin-top:90.8pt;width:132.7pt;height:16.5pt;z-index:251673600;visibility:visible;mso-wrap-style:square;mso-wrap-distance-left:9pt;mso-wrap-distance-top:0;mso-wrap-distance-right:9pt;mso-wrap-distance-bottom:0;mso-position-horizontal:absolute;mso-position-horizontal-relative:text;mso-position-vertical:absolute;mso-position-vertical-relative:text" o:gfxdata="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">
+                <v:imagedata r:id="rId41" o:title=""/>
+                <o:lock v:ext="edit" rotation="t" aspectratio="f"/>
+              </v:shape>
+            </w:pict>
+          </mc:Fallback>
+        </mc:AlternateContent>
+      </w:r>
+      <w:r>
+        <w:rPr>
+          <w:b/>
+          <w:bCs/>
+          <w:noProof/>
+          <w:sz w:val="32"/>
+          <w:szCs w:val="32"/>
+        </w:rPr>
+        <mc:AlternateContent>
+          <mc:Choice Requires="wpi">
+            <w:drawing>
+              <wp:anchor distT="0" distB="0" distL="114300" distR="114300" simplePos="0" relativeHeight="251670528" behindDoc="0" locked="0" layoutInCell="1" allowOverlap="1" wp14:anchorId="721A013B" wp14:editId="0016DDBF">
+                <wp:simplePos x="0" y="0"/>
+                <wp:positionH relativeFrom="column">
+                  <wp:posOffset>114150</wp:posOffset>
+                </wp:positionH>
+                <wp:positionV relativeFrom="paragraph">
+                  <wp:posOffset>1159350</wp:posOffset>
+                </wp:positionV>
+                <wp:extent cx="1666800" cy="360"/>
+                <wp:effectExtent l="57150" t="57150" r="48260" b="38100"/>
+                <wp:wrapNone/>
+                <wp:docPr id="70828882" name="Ink 12"/>
+                <wp:cNvGraphicFramePr>
+                  <a:graphicFrameLocks xmlns:a="http://schemas.openxmlformats.org/drawingml/2006/main"/>
+                </wp:cNvGraphicFramePr>
+                <a:graphic xmlns:a="http://schemas.openxmlformats.org/drawingml/2006/main">
+                  <a:graphicData uri="http://schemas.microsoft.com/office/word/2010/wordprocessingInk">
+                    <w14:contentPart bwMode="auto" r:id="rId42">
+                      <w14:nvContentPartPr>
+                        <w14:cNvContentPartPr>
+                          <a14:cpLocks xmlns:a14="http://schemas.microsoft.com/office/drawing/2010/main" noRot="1"/>
+                        </w14:cNvContentPartPr>
+                      </w14:nvContentPartPr>
+                      <w14:xfrm>
+                        <a:off x="0" y="0"/>
+                        <a:ext cx="1666800" cy="360"/>
+                      </w14:xfrm>
+                    </w14:contentPart>
+                  </a:graphicData>
+                </a:graphic>
+              </wp:anchor>
+            </w:drawing>
+          </mc:Choice>
+          <mc:Fallback>
+            <w:pict>
+              <v:shape w14:anchorId="7038F98F" id="Ink 12" o:spid="_x0000_s1026" type="#_x0000_t75" style="position:absolute;margin-left:7.6pt;margin-top:89.9pt;width:134.1pt;height:2.9pt;z-index:251670528;visibility:visible;mso-wrap-style:square;mso-wrap-distance-left:9pt;mso-wrap-distance-top:0;mso-wrap-distance-right:9pt;mso-wrap-distance-bottom:0;mso-position-horizontal:absolute;mso-position-horizontal-relative:text;mso-position-vertical:absolute;mso-position-vertical-relative:text" o:gfxdata="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">
+                <v:imagedata r:id="rId43" o:title=""/>
+                <o:lock v:ext="edit" rotation="t" aspectratio="f"/>
+              </v:shape>
+            </w:pict>
+          </mc:Fallback>
+        </mc:AlternateContent>
+      </w:r>
+      <w:r>
+        <w:rPr>
+          <w:b/>
+          <w:bCs/>
+          <w:noProof/>
+          <w:sz w:val="32"/>
+          <w:szCs w:val="32"/>
+        </w:rPr>
+        <mc:AlternateContent>
+          <mc:Choice Requires="wpi">
+            <w:drawing>
+              <wp:anchor distT="0" distB="0" distL="114300" distR="114300" simplePos="0" relativeHeight="251669504" behindDoc="0" locked="0" layoutInCell="1" allowOverlap="1" wp14:anchorId="218042D4" wp14:editId="6F29D641">
+                <wp:simplePos x="0" y="0"/>
+                <wp:positionH relativeFrom="column">
+                  <wp:posOffset>104430</wp:posOffset>
+                </wp:positionH>
+                <wp:positionV relativeFrom="paragraph">
+                  <wp:posOffset>1321350</wp:posOffset>
+                </wp:positionV>
+                <wp:extent cx="1377360" cy="360"/>
+                <wp:effectExtent l="57150" t="57150" r="51435" b="38100"/>
+                <wp:wrapNone/>
+                <wp:docPr id="622858866" name="Ink 11"/>
+                <wp:cNvGraphicFramePr>
+                  <a:graphicFrameLocks xmlns:a="http://schemas.openxmlformats.org/drawingml/2006/main"/>
+                </wp:cNvGraphicFramePr>
+                <a:graphic xmlns:a="http://schemas.openxmlformats.org/drawingml/2006/main">
+                  <a:graphicData uri="http://schemas.microsoft.com/office/word/2010/wordprocessingInk">
+                    <w14:contentPart bwMode="auto" r:id="rId44">
+                      <w14:nvContentPartPr>
+                        <w14:cNvContentPartPr>
+                          <a14:cpLocks xmlns:a14="http://schemas.microsoft.com/office/drawing/2010/main" noRot="1"/>
+                        </w14:cNvContentPartPr>
+                      </w14:nvContentPartPr>
+                      <w14:xfrm>
+                        <a:off x="0" y="0"/>
+                        <a:ext cx="1377360" cy="360"/>
+                      </w14:xfrm>
+                    </w14:contentPart>
+                  </a:graphicData>
+                </a:graphic>
+              </wp:anchor>
+            </w:drawing>
+          </mc:Choice>
+          <mc:Fallback>
+            <w:pict>
+              <v:shape w14:anchorId="47DC68B9" id="Ink 11" o:spid="_x0000_s1026" type="#_x0000_t75" style="position:absolute;margin-left:6.8pt;margin-top:102.65pt;width:111.25pt;height:2.9pt;z-index:251669504;visibility:visible;mso-wrap-style:square;mso-wrap-distance-left:9pt;mso-wrap-distance-top:0;mso-wrap-distance-right:9pt;mso-wrap-distance-bottom:0;mso-position-horizontal:absolute;mso-position-horizontal-relative:text;mso-position-vertical:absolute;mso-position-vertical-relative:text" o:gfxdata="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">
+                <v:imagedata r:id="rId45" o:title=""/>
+                <o:lock v:ext="edit" rotation="t" aspectratio="f"/>
+              </v:shape>
+            </w:pict>
+          </mc:Fallback>
+        </mc:AlternateContent>
+      </w:r>
+      <w:r>
+        <w:rPr>
+          <w:b/>
+          <w:bCs/>
+          <w:noProof/>
+          <w:sz w:val="32"/>
+          <w:szCs w:val="32"/>
+        </w:rPr>
+        <mc:AlternateContent>
+          <mc:Choice Requires="wpi">
+            <w:drawing>
+              <wp:anchor distT="0" distB="0" distL="114300" distR="114300" simplePos="0" relativeHeight="251668480" behindDoc="0" locked="0" layoutInCell="1" allowOverlap="1" wp14:anchorId="19FEA5DD" wp14:editId="7B509FE0">
+                <wp:simplePos x="0" y="0"/>
+                <wp:positionH relativeFrom="column">
+                  <wp:posOffset>4619190</wp:posOffset>
+                </wp:positionH>
+                <wp:positionV relativeFrom="paragraph">
+                  <wp:posOffset>142710</wp:posOffset>
+                </wp:positionV>
+                <wp:extent cx="19800" cy="180360"/>
+                <wp:effectExtent l="76200" t="76200" r="37465" b="48260"/>
+                <wp:wrapNone/>
+                <wp:docPr id="1636797666" name="Ink 10"/>
+                <wp:cNvGraphicFramePr>
+                  <a:graphicFrameLocks xmlns:a="http://schemas.openxmlformats.org/drawingml/2006/main"/>
+                </wp:cNvGraphicFramePr>
+                <a:graphic xmlns:a="http://schemas.openxmlformats.org/drawingml/2006/main">
+                  <a:graphicData uri="http://schemas.microsoft.com/office/word/2010/wordprocessingInk">
+                    <w14:contentPart bwMode="auto" r:id="rId46">
+                      <w14:nvContentPartPr>
+                        <w14:cNvContentPartPr>
+                          <a14:cpLocks xmlns:a14="http://schemas.microsoft.com/office/drawing/2010/main" noRot="1"/>
+                        </w14:cNvContentPartPr>
+                      </w14:nvContentPartPr>
+                      <w14:xfrm>
+                        <a:off x="0" y="0"/>
+                        <a:ext cx="19800" cy="180360"/>
+                      </w14:xfrm>
+                    </w14:contentPart>
+                  </a:graphicData>
+                </a:graphic>
+              </wp:anchor>
+            </w:drawing>
+          </mc:Choice>
+          <mc:Fallback>
+            <w:pict>
+              <v:shape w14:anchorId="19EE6740" id="Ink 10" o:spid="_x0000_s1026" type="#_x0000_t75" style="position:absolute;margin-left:362.3pt;margin-top:9.85pt;width:4.35pt;height:17pt;z-index:251668480;visibility:visible;mso-wrap-style:square;mso-wrap-distance-left:9pt;mso-wrap-distance-top:0;mso-wrap-distance-right:9pt;mso-wrap-distance-bottom:0;mso-position-horizontal:absolute;mso-position-horizontal-relative:text;mso-position-vertical:absolute;mso-position-vertical-relative:text" o:gfxdata="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">
+                <v:imagedata r:id="rId47" o:title=""/>
+                <o:lock v:ext="edit" rotation="t" aspectratio="f"/>
+              </v:shape>
+            </w:pict>
+          </mc:Fallback>
+        </mc:AlternateContent>
+      </w:r>
+      <w:r>
+        <w:rPr>
+          <w:b/>
+          <w:bCs/>
+          <w:noProof/>
+          <w:sz w:val="32"/>
+          <w:szCs w:val="32"/>
+        </w:rPr>
+        <mc:AlternateContent>
+          <mc:Choice Requires="wpi">
+            <w:drawing>
+              <wp:anchor distT="0" distB="0" distL="114300" distR="114300" simplePos="0" relativeHeight="251667456" behindDoc="0" locked="0" layoutInCell="1" allowOverlap="1" wp14:anchorId="7792B23E" wp14:editId="1846EDE8">
+                <wp:simplePos x="0" y="0"/>
+                <wp:positionH relativeFrom="column">
+                  <wp:posOffset>185070</wp:posOffset>
+                </wp:positionH>
+                <wp:positionV relativeFrom="paragraph">
+                  <wp:posOffset>123270</wp:posOffset>
+                </wp:positionV>
+                <wp:extent cx="40320" cy="164880"/>
+                <wp:effectExtent l="76200" t="57150" r="36195" b="45085"/>
+                <wp:wrapNone/>
+                <wp:docPr id="1687247856" name="Ink 9"/>
+                <wp:cNvGraphicFramePr>
+                  <a:graphicFrameLocks xmlns:a="http://schemas.openxmlformats.org/drawingml/2006/main"/>
+                </wp:cNvGraphicFramePr>
+                <a:graphic xmlns:a="http://schemas.openxmlformats.org/drawingml/2006/main">
+                  <a:graphicData uri="http://schemas.microsoft.com/office/word/2010/wordprocessingInk">
+                    <w14:contentPart bwMode="auto" r:id="rId48">
+                      <w14:nvContentPartPr>
+                        <w14:cNvContentPartPr>
+                          <a14:cpLocks xmlns:a14="http://schemas.microsoft.com/office/drawing/2010/main" noRot="1"/>
+                        </w14:cNvContentPartPr>
+                      </w14:nvContentPartPr>
+                      <w14:xfrm>
+                        <a:off x="0" y="0"/>
+                        <a:ext cx="40320" cy="164880"/>
+                      </w14:xfrm>
+                    </w14:contentPart>
+                  </a:graphicData>
+                </a:graphic>
+              </wp:anchor>
+            </w:drawing>
+          </mc:Choice>
+          <mc:Fallback>
+            <w:pict>
+              <v:shape w14:anchorId="67113115" id="Ink 9" o:spid="_x0000_s1026" type="#_x0000_t75" style="position:absolute;margin-left:13.15pt;margin-top:8.3pt;width:6pt;height:15.85pt;z-index:251667456;visibility:visible;mso-wrap-style:square;mso-wrap-distance-left:9pt;mso-wrap-distance-top:0;mso-wrap-distance-right:9pt;mso-wrap-distance-bottom:0;mso-position-horizontal:absolute;mso-position-horizontal-relative:text;mso-position-vertical:absolute;mso-position-vertical-relative:text" o:gfxdata="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">
+                <v:imagedata r:id="rId49" o:title=""/>
+                <o:lock v:ext="edit" rotation="t" aspectratio="f"/>
+              </v:shape>
+            </w:pict>
+          </mc:Fallback>
+        </mc:AlternateContent>
+      </w:r>
+      <w:r>
+        <w:rPr>
+          <w:b/>
+          <w:bCs/>
+          <w:noProof/>
+          <w:sz w:val="32"/>
+          <w:szCs w:val="32"/>
+        </w:rPr>
+        <mc:AlternateContent>
+          <mc:Choice Requires="wpi">
+            <w:drawing>
+              <wp:anchor distT="0" distB="0" distL="114300" distR="114300" simplePos="0" relativeHeight="251666432" behindDoc="0" locked="0" layoutInCell="1" allowOverlap="1" wp14:anchorId="1380C6E1" wp14:editId="5BD42656">
+                <wp:simplePos x="0" y="0"/>
+                <wp:positionH relativeFrom="column">
+                  <wp:posOffset>247350</wp:posOffset>
+                </wp:positionH>
+                <wp:positionV relativeFrom="paragraph">
+                  <wp:posOffset>121110</wp:posOffset>
+                </wp:positionV>
+                <wp:extent cx="4371480" cy="360"/>
+                <wp:effectExtent l="57150" t="57150" r="48260" b="38100"/>
+                <wp:wrapNone/>
+                <wp:docPr id="517188934" name="Ink 8"/>
+                <wp:cNvGraphicFramePr>
+                  <a:graphicFrameLocks xmlns:a="http://schemas.openxmlformats.org/drawingml/2006/main"/>
+                </wp:cNvGraphicFramePr>
+                <a:graphic xmlns:a="http://schemas.openxmlformats.org/drawingml/2006/main">
+                  <a:graphicData uri="http://schemas.microsoft.com/office/word/2010/wordprocessingInk">
+                    <w14:contentPart bwMode="auto" r:id="rId50">
+                      <w14:nvContentPartPr>
+                        <w14:cNvContentPartPr>
+                          <a14:cpLocks xmlns:a14="http://schemas.microsoft.com/office/drawing/2010/main" noRot="1"/>
+                        </w14:cNvContentPartPr>
+                      </w14:nvContentPartPr>
+                      <w14:xfrm>
+                        <a:off x="0" y="0"/>
+                        <a:ext cx="4371480" cy="360"/>
+                      </w14:xfrm>
+                    </w14:contentPart>
+                  </a:graphicData>
+                </a:graphic>
+              </wp:anchor>
+            </w:drawing>
+          </mc:Choice>
+          <mc:Fallback>
+            <w:pict>
+              <v:shape w14:anchorId="7BE1C6C6" id="Ink 8" o:spid="_x0000_s1026" type="#_x0000_t75" style="position:absolute;margin-left:18.1pt;margin-top:8.15pt;width:347pt;height:2.9pt;z-index:251666432;visibility:visible;mso-wrap-style:square;mso-wrap-distance-left:9pt;mso-wrap-distance-top:0;mso-wrap-distance-right:9pt;mso-wrap-distance-bottom:0;mso-position-horizontal:absolute;mso-position-horizontal-relative:text;mso-position-vertical:absolute;mso-position-vertical-relative:text" o:gfxdata="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">
+                <v:imagedata r:id="rId51" o:title=""/>
+                <o:lock v:ext="edit" rotation="t" aspectratio="f"/>
+              </v:shape>
+            </w:pict>
+          </mc:Fallback>
+        </mc:AlternateContent>
+      </w:r>
+      <w:r>
+        <w:rPr>
+          <w:b/>
+          <w:bCs/>
+          <w:noProof/>
+          <w:sz w:val="32"/>
+          <w:szCs w:val="32"/>
+        </w:rPr>
+        <mc:AlternateContent>
+          <mc:Choice Requires="wpi">
+            <w:drawing>
+              <wp:anchor distT="0" distB="0" distL="114300" distR="114300" simplePos="0" relativeHeight="251665408" behindDoc="0" locked="0" layoutInCell="1" allowOverlap="1" wp14:anchorId="0E85B112" wp14:editId="31CC1EBC">
+                <wp:simplePos x="0" y="0"/>
+                <wp:positionH relativeFrom="column">
+                  <wp:posOffset>218910</wp:posOffset>
+                </wp:positionH>
+                <wp:positionV relativeFrom="paragraph">
+                  <wp:posOffset>302190</wp:posOffset>
+                </wp:positionV>
+                <wp:extent cx="4390560" cy="360"/>
+                <wp:effectExtent l="57150" t="57150" r="48260" b="38100"/>
+                <wp:wrapNone/>
+                <wp:docPr id="1750726217" name="Ink 7"/>
+                <wp:cNvGraphicFramePr>
+                  <a:graphicFrameLocks xmlns:a="http://schemas.openxmlformats.org/drawingml/2006/main"/>
+                </wp:cNvGraphicFramePr>
+                <a:graphic xmlns:a="http://schemas.openxmlformats.org/drawingml/2006/main">
+                  <a:graphicData uri="http://schemas.microsoft.com/office/word/2010/wordprocessingInk">
+                    <w14:contentPart bwMode="auto" r:id="rId52">
+                      <w14:nvContentPartPr>
+                        <w14:cNvContentPartPr>
+                          <a14:cpLocks xmlns:a14="http://schemas.microsoft.com/office/drawing/2010/main" noRot="1"/>
+                        </w14:cNvContentPartPr>
+                      </w14:nvContentPartPr>
+                      <w14:xfrm>
+                        <a:off x="0" y="0"/>
+                        <a:ext cx="4390560" cy="360"/>
+                      </w14:xfrm>
+                    </w14:contentPart>
+                  </a:graphicData>
+                </a:graphic>
+              </wp:anchor>
+            </w:drawing>
+          </mc:Choice>
+          <mc:Fallback>
+            <w:pict>
+              <v:shape w14:anchorId="1ACBF635" id="Ink 7" o:spid="_x0000_s1026" type="#_x0000_t75" style="position:absolute;margin-left:15.85pt;margin-top:22.4pt;width:348.5pt;height:2.9pt;z-index:251665408;visibility:visible;mso-wrap-style:square;mso-wrap-distance-left:9pt;mso-wrap-distance-top:0;mso-wrap-distance-right:9pt;mso-wrap-distance-bottom:0;mso-position-horizontal:absolute;mso-position-horizontal-relative:text;mso-position-vertical:absolute;mso-position-vertical-relative:text" o:gfxdata="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">
+                <v:imagedata r:id="rId53" o:title=""/>
+                <o:lock v:ext="edit" rotation="t" aspectratio="f"/>
+              </v:shape>
+            </w:pict>
+          </mc:Fallback>
+        </mc:AlternateContent>
+      </w:r>
+      <w:r>
+        <w:rPr>
+          <w:b/>
+          <w:bCs/>
+          <w:sz w:val="32"/>
+          <w:szCs w:val="32"/>
+        </w:rPr>
+        <w:drawing>
+          <wp:inline distT="0" distB="0" distL="0" distR="0" wp14:anchorId="12B89B4C" wp14:editId="4F2A7D2A">
+            <wp:extent cx="4677428" cy="3391373"/>
+            <wp:effectExtent l="0" t="0" r="8890" b="0"/>
+            <wp:docPr id="587906481" name="Picture 1"/>
+            <wp:cNvGraphicFramePr>
+              <a:graphicFrameLocks xmlns:a="http://schemas.openxmlformats.org/drawingml/2006/main" noChangeAspect="1"/>
+            </wp:cNvGraphicFramePr>
+            <a:graphic xmlns:a="http://schemas.openxmlformats.org/drawingml/2006/main">
+              <a:graphicData uri="http://schemas.openxmlformats.org/drawingml/2006/picture">
+                <pic:pic xmlns:pic="http://schemas.openxmlformats.org/drawingml/2006/picture">
+                  <pic:nvPicPr>
+                    <pic:cNvPr id="587906481" name=""/>
+                    <pic:cNvPicPr/>
+                  </pic:nvPicPr>
+                  <pic:blipFill>
+                    <a:blip r:embed="rId54"/>
+                    <a:stretch>
+                      <a:fillRect/>
+                    </a:stretch>
+                  </pic:blipFill>
+                  <pic:spPr>
+                    <a:xfrm>
+                      <a:off x="0" y="0"/>
+                      <a:ext cx="4677428" cy="3391373"/>
+                    </a:xfrm>
+                    <a:prstGeom prst="rect">
+                      <a:avLst/>
+                    </a:prstGeom>
+                  </pic:spPr>
+                </pic:pic>
+              </a:graphicData>
+            </a:graphic>
+          </wp:inline>
+        </w:drawing>
+      </w:r>
+    </w:p>
+    <w:p>
+      <w:pPr>
+        <w:rPr>
+          <w:b/>
+          <w:bCs/>
+          <w:sz w:val="32"/>
+          <w:szCs w:val="32"/>
+        </w:rPr>
+      </w:pPr>
+    </w:p>
+    <w:p>
+      <w:pPr>
+        <w:rPr>
+          <w:b/>
+          <w:bCs/>
+          <w:sz w:val="32"/>
+          <w:szCs w:val="32"/>
+        </w:rPr>
+      </w:pPr>
+      <w:r>
+        <w:rPr>
+          <w:b/>
+          <w:bCs/>
+          <w:sz w:val="32"/>
+          <w:szCs w:val="32"/>
+          <w:highlight w:val="yellow"/>
+        </w:rPr>
+        <w:t>Adding and removing class in react</w:t>
+      </w:r>
+    </w:p>
+    <w:p>
+      <w:pPr>
+        <w:rPr>
+          <w:b/>
+          <w:bCs/>
+          <w:sz w:val="32"/>
+          <w:szCs w:val="32"/>
+        </w:rPr>
+      </w:pPr>
+    </w:p>
+    <w:p>
+      <w:pPr>
+        <w:rPr>
+          <w:b/>
+          <w:bCs/>
+          <w:sz w:val="32"/>
+          <w:szCs w:val="32"/>
+        </w:rPr>
+      </w:pPr>
+      <w:r>
+        <w:rPr>
+          <w:b/>
+          <w:bCs/>
+          <w:noProof/>
+          <w:sz w:val="32"/>
+          <w:szCs w:val="32"/>
+        </w:rPr>
+        <mc:AlternateContent>
+          <mc:Choice Requires="wpi">
+            <w:drawing>
+              <wp:anchor distT="0" distB="0" distL="114300" distR="114300" simplePos="0" relativeHeight="251664384" behindDoc="0" locked="0" layoutInCell="1" allowOverlap="1" wp14:anchorId="5300077E" wp14:editId="4176E43E">
+                <wp:simplePos x="0" y="0"/>
+                <wp:positionH relativeFrom="column">
+                  <wp:posOffset>3161910</wp:posOffset>
+                </wp:positionH>
+                <wp:positionV relativeFrom="paragraph">
+                  <wp:posOffset>1675750</wp:posOffset>
+                </wp:positionV>
+                <wp:extent cx="48240" cy="246960"/>
+                <wp:effectExtent l="76200" t="76200" r="28575" b="39370"/>
+                <wp:wrapNone/>
+                <wp:docPr id="625750252" name="Ink 6"/>
+                <wp:cNvGraphicFramePr>
+                  <a:graphicFrameLocks xmlns:a="http://schemas.openxmlformats.org/drawingml/2006/main"/>
+                </wp:cNvGraphicFramePr>
+                <a:graphic xmlns:a="http://schemas.openxmlformats.org/drawingml/2006/main">
+                  <a:graphicData uri="http://schemas.microsoft.com/office/word/2010/wordprocessingInk">
+                    <w14:contentPart bwMode="auto" r:id="rId55">
+                      <w14:nvContentPartPr>
+                        <w14:cNvContentPartPr>
+                          <a14:cpLocks xmlns:a14="http://schemas.microsoft.com/office/drawing/2010/main" noRot="1"/>
+                        </w14:cNvContentPartPr>
+                      </w14:nvContentPartPr>
+                      <w14:xfrm>
+                        <a:off x="0" y="0"/>
+                        <a:ext cx="48240" cy="246960"/>
+                      </w14:xfrm>
+                    </w14:contentPart>
+                  </a:graphicData>
+                </a:graphic>
+              </wp:anchor>
+            </w:drawing>
+          </mc:Choice>
+          <mc:Fallback>
+            <w:pict>
+              <v:shape w14:anchorId="41DCED90" id="Ink 6" o:spid="_x0000_s1026" type="#_x0000_t75" style="position:absolute;margin-left:247.55pt;margin-top:130.55pt;width:6.65pt;height:22.3pt;z-index:251664384;visibility:visible;mso-wrap-style:square;mso-wrap-distance-left:9pt;mso-wrap-distance-top:0;mso-wrap-distance-right:9pt;mso-wrap-distance-bottom:0;mso-position-horizontal:absolute;mso-position-horizontal-relative:text;mso-position-vertical:absolute;mso-position-vertical-relative:text" o:gfxdata="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">
+                <v:imagedata r:id="rId56" o:title=""/>
+                <o:lock v:ext="edit" rotation="t" aspectratio="f"/>
+              </v:shape>
+            </w:pict>
+          </mc:Fallback>
+        </mc:AlternateContent>
+      </w:r>
+      <w:r>
+        <w:rPr>
+          <w:b/>
+          <w:bCs/>
+          <w:noProof/>
+          <w:sz w:val="32"/>
+          <w:szCs w:val="32"/>
+        </w:rPr>
+        <mc:AlternateContent>
+          <mc:Choice Requires="wpi">
+            <w:drawing>
+              <wp:anchor distT="0" distB="0" distL="114300" distR="114300" simplePos="0" relativeHeight="251663360" behindDoc="0" locked="0" layoutInCell="1" allowOverlap="1" wp14:anchorId="1C5D65EF" wp14:editId="30539435">
+                <wp:simplePos x="0" y="0"/>
+                <wp:positionH relativeFrom="column">
+                  <wp:posOffset>466590</wp:posOffset>
+                </wp:positionH>
+                <wp:positionV relativeFrom="paragraph">
+                  <wp:posOffset>1675750</wp:posOffset>
+                </wp:positionV>
+                <wp:extent cx="65880" cy="203400"/>
+                <wp:effectExtent l="57150" t="76200" r="29845" b="44450"/>
+                <wp:wrapNone/>
+                <wp:docPr id="5638213" name="Ink 5"/>
+                <wp:cNvGraphicFramePr>
+                  <a:graphicFrameLocks xmlns:a="http://schemas.openxmlformats.org/drawingml/2006/main"/>
+                </wp:cNvGraphicFramePr>
+                <a:graphic xmlns:a="http://schemas.openxmlformats.org/drawingml/2006/main">
+                  <a:graphicData uri="http://schemas.microsoft.com/office/word/2010/wordprocessingInk">
+                    <w14:contentPart bwMode="auto" r:id="rId57">
+                      <w14:nvContentPartPr>
+                        <w14:cNvContentPartPr>
+                          <a14:cpLocks xmlns:a14="http://schemas.microsoft.com/office/drawing/2010/main" noRot="1"/>
+                        </w14:cNvContentPartPr>
+                      </w14:nvContentPartPr>
+                      <w14:xfrm>
+                        <a:off x="0" y="0"/>
+                        <a:ext cx="65880" cy="203400"/>
+                      </w14:xfrm>
+                    </w14:contentPart>
+                  </a:graphicData>
+                </a:graphic>
+              </wp:anchor>
+            </w:drawing>
+          </mc:Choice>
+          <mc:Fallback>
+            <w:pict>
+              <v:shape w14:anchorId="61B67AA9" id="Ink 5" o:spid="_x0000_s1026" type="#_x0000_t75" style="position:absolute;margin-left:35.35pt;margin-top:130.55pt;width:8.05pt;height:18.8pt;z-index:251663360;visibility:visible;mso-wrap-style:square;mso-wrap-distance-left:9pt;mso-wrap-distance-top:0;mso-wrap-distance-right:9pt;mso-wrap-distance-bottom:0;mso-position-horizontal:absolute;mso-position-horizontal-relative:text;mso-position-vertical:absolute;mso-position-vertical-relative:text" o:gfxdata="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">
+                <v:imagedata r:id="rId58" o:title=""/>
+                <o:lock v:ext="edit" rotation="t" aspectratio="f"/>
+              </v:shape>
+            </w:pict>
+          </mc:Fallback>
+        </mc:AlternateContent>
+      </w:r>
+      <w:r>
+        <w:rPr>
+          <w:b/>
+          <w:bCs/>
+          <w:noProof/>
+          <w:sz w:val="32"/>
+          <w:szCs w:val="32"/>
+        </w:rPr>
+        <mc:AlternateContent>
+          <mc:Choice Requires="wpi">
+            <w:drawing>
+              <wp:anchor distT="0" distB="0" distL="114300" distR="114300" simplePos="0" relativeHeight="251662336" behindDoc="0" locked="0" layoutInCell="1" allowOverlap="1" wp14:anchorId="204D9585" wp14:editId="1D925BED">
+                <wp:simplePos x="0" y="0"/>
+                <wp:positionH relativeFrom="column">
+                  <wp:posOffset>466590</wp:posOffset>
+                </wp:positionH>
+                <wp:positionV relativeFrom="paragraph">
+                  <wp:posOffset>1673230</wp:posOffset>
+                </wp:positionV>
+                <wp:extent cx="2722320" cy="360"/>
+                <wp:effectExtent l="57150" t="57150" r="40005" b="38100"/>
+                <wp:wrapNone/>
+                <wp:docPr id="237956894" name="Ink 4"/>
+                <wp:cNvGraphicFramePr>
+                  <a:graphicFrameLocks xmlns:a="http://schemas.openxmlformats.org/drawingml/2006/main"/>
+                </wp:cNvGraphicFramePr>
+                <a:graphic xmlns:a="http://schemas.openxmlformats.org/drawingml/2006/main">
+                  <a:graphicData uri="http://schemas.microsoft.com/office/word/2010/wordprocessingInk">
+                    <w14:contentPart bwMode="auto" r:id="rId59">
+                      <w14:nvContentPartPr>
+                        <w14:cNvContentPartPr>
+                          <a14:cpLocks xmlns:a14="http://schemas.microsoft.com/office/drawing/2010/main" noRot="1"/>
+                        </w14:cNvContentPartPr>
+                      </w14:nvContentPartPr>
+                      <w14:xfrm>
+                        <a:off x="0" y="0"/>
+                        <a:ext cx="2722320" cy="360"/>
+                      </w14:xfrm>
+                    </w14:contentPart>
+                  </a:graphicData>
+                </a:graphic>
+              </wp:anchor>
+            </w:drawing>
+          </mc:Choice>
+          <mc:Fallback>
+            <w:pict>
+              <v:shape w14:anchorId="6E34E256" id="Ink 4" o:spid="_x0000_s1026" type="#_x0000_t75" style="position:absolute;margin-left:35.35pt;margin-top:130.35pt;width:217.15pt;height:2.9pt;z-index:251662336;visibility:visible;mso-wrap-style:square;mso-wrap-distance-left:9pt;mso-wrap-distance-top:0;mso-wrap-distance-right:9pt;mso-wrap-distance-bottom:0;mso-position-horizontal:absolute;mso-position-horizontal-relative:text;mso-position-vertical:absolute;mso-position-vertical-relative:text" o:gfxdata="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">
+                <v:imagedata r:id="rId60" o:title=""/>
+                <o:lock v:ext="edit" rotation="t" aspectratio="f"/>
+              </v:shape>
+            </w:pict>
+          </mc:Fallback>
+        </mc:AlternateContent>
+      </w:r>
+      <w:r>
+        <w:rPr>
+          <w:b/>
+          <w:bCs/>
+          <w:noProof/>
+          <w:sz w:val="32"/>
+          <w:szCs w:val="32"/>
+        </w:rPr>
+        <mc:AlternateContent>
+          <mc:Choice Requires="wpi">
+            <w:drawing>
+              <wp:anchor distT="0" distB="0" distL="114300" distR="114300" simplePos="0" relativeHeight="251661312" behindDoc="0" locked="0" layoutInCell="1" allowOverlap="1" wp14:anchorId="739DE93A" wp14:editId="7AF6019C">
+                <wp:simplePos x="0" y="0"/>
+                <wp:positionH relativeFrom="column">
+                  <wp:posOffset>485670</wp:posOffset>
+                </wp:positionH>
+                <wp:positionV relativeFrom="paragraph">
+                  <wp:posOffset>1920910</wp:posOffset>
+                </wp:positionV>
+                <wp:extent cx="2675880" cy="360"/>
+                <wp:effectExtent l="57150" t="57150" r="48895" b="38100"/>
+                <wp:wrapNone/>
+                <wp:docPr id="1847654144" name="Ink 3"/>
+                <wp:cNvGraphicFramePr>
+                  <a:graphicFrameLocks xmlns:a="http://schemas.openxmlformats.org/drawingml/2006/main"/>
+                </wp:cNvGraphicFramePr>
+                <a:graphic xmlns:a="http://schemas.openxmlformats.org/drawingml/2006/main">
+                  <a:graphicData uri="http://schemas.microsoft.com/office/word/2010/wordprocessingInk">
+                    <w14:contentPart bwMode="auto" r:id="rId61">
+                      <w14:nvContentPartPr>
+                        <w14:cNvContentPartPr>
+                          <a14:cpLocks xmlns:a14="http://schemas.microsoft.com/office/drawing/2010/main" noRot="1"/>
+                        </w14:cNvContentPartPr>
+                      </w14:nvContentPartPr>
+                      <w14:xfrm>
+                        <a:off x="0" y="0"/>
+                        <a:ext cx="2675880" cy="360"/>
+                      </w14:xfrm>
+                    </w14:contentPart>
+                  </a:graphicData>
+                </a:graphic>
+              </wp:anchor>
+            </w:drawing>
+          </mc:Choice>
+          <mc:Fallback>
+            <w:pict>
+              <v:shape w14:anchorId="19FB4336" id="Ink 3" o:spid="_x0000_s1026" type="#_x0000_t75" style="position:absolute;margin-left:36.85pt;margin-top:149.85pt;width:213.55pt;height:2.9pt;z-index:251661312;visibility:visible;mso-wrap-style:square;mso-wrap-distance-left:9pt;mso-wrap-distance-top:0;mso-wrap-distance-right:9pt;mso-wrap-distance-bottom:0;mso-position-horizontal:absolute;mso-position-horizontal-relative:text;mso-position-vertical:absolute;mso-position-vertical-relative:text" o:gfxdata="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">
+                <v:imagedata r:id="rId62" o:title=""/>
+                <o:lock v:ext="edit" rotation="t" aspectratio="f"/>
+              </v:shape>
+            </w:pict>
+          </mc:Fallback>
+        </mc:AlternateContent>
+      </w:r>
+      <w:r>
+        <w:rPr>
+          <w:b/>
+          <w:bCs/>
+          <w:noProof/>
+          <w:sz w:val="32"/>
+          <w:szCs w:val="32"/>
+        </w:rPr>
+        <mc:AlternateContent>
+          <mc:Choice Requires="wpi">
+            <w:drawing>
+              <wp:anchor distT="0" distB="0" distL="114300" distR="114300" simplePos="0" relativeHeight="251660288" behindDoc="0" locked="0" layoutInCell="1" allowOverlap="1" wp14:anchorId="25150BEC" wp14:editId="66096609">
+                <wp:simplePos x="0" y="0"/>
+                <wp:positionH relativeFrom="column">
+                  <wp:posOffset>485670</wp:posOffset>
+                </wp:positionH>
+                <wp:positionV relativeFrom="paragraph">
+                  <wp:posOffset>1882750</wp:posOffset>
+                </wp:positionV>
+                <wp:extent cx="2650680" cy="360"/>
+                <wp:effectExtent l="57150" t="57150" r="54610" b="38100"/>
+                <wp:wrapNone/>
+                <wp:docPr id="1008193015" name="Ink 2"/>
+                <wp:cNvGraphicFramePr>
+                  <a:graphicFrameLocks xmlns:a="http://schemas.openxmlformats.org/drawingml/2006/main"/>
+                </wp:cNvGraphicFramePr>
+                <a:graphic xmlns:a="http://schemas.openxmlformats.org/drawingml/2006/main">
+                  <a:graphicData uri="http://schemas.microsoft.com/office/word/2010/wordprocessingInk">
+                    <w14:contentPart bwMode="auto" r:id="rId63">
+                      <w14:nvContentPartPr>
+                        <w14:cNvContentPartPr>
+                          <a14:cpLocks xmlns:a14="http://schemas.microsoft.com/office/drawing/2010/main" noRot="1"/>
+                        </w14:cNvContentPartPr>
+                      </w14:nvContentPartPr>
+                      <w14:xfrm>
+                        <a:off x="0" y="0"/>
+                        <a:ext cx="2650680" cy="360"/>
+                      </w14:xfrm>
+                    </w14:contentPart>
+                  </a:graphicData>
+                </a:graphic>
+              </wp:anchor>
+            </w:drawing>
+          </mc:Choice>
+          <mc:Fallback>
+            <w:pict>
+              <v:shape w14:anchorId="3376996F" id="Ink 2" o:spid="_x0000_s1026" type="#_x0000_t75" style="position:absolute;margin-left:36.85pt;margin-top:146.85pt;width:211.5pt;height:2.9pt;z-index:251660288;visibility:visible;mso-wrap-style:square;mso-wrap-distance-left:9pt;mso-wrap-distance-top:0;mso-wrap-distance-right:9pt;mso-wrap-distance-bottom:0;mso-position-horizontal:absolute;mso-position-horizontal-relative:text;mso-position-vertical:absolute;mso-position-vertical-relative:text" o:gfxdata="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">
+                <v:imagedata r:id="rId64" o:title=""/>
+                <o:lock v:ext="edit" rotation="t" aspectratio="f"/>
+              </v:shape>
+            </w:pict>
+          </mc:Fallback>
+        </mc:AlternateContent>
+      </w:r>
+      <w:r>
+        <w:rPr>
+          <w:b/>
+          <w:bCs/>
+          <w:noProof/>
+          <w:sz w:val="32"/>
+          <w:szCs w:val="32"/>
+        </w:rPr>
+        <mc:AlternateContent>
+          <mc:Choice Requires="wpi">
+            <w:drawing>
+              <wp:anchor distT="0" distB="0" distL="114300" distR="114300" simplePos="0" relativeHeight="251659264" behindDoc="0" locked="0" layoutInCell="1" allowOverlap="1" wp14:anchorId="3F82187F" wp14:editId="7E17E612">
+                <wp:simplePos x="0" y="0"/>
+                <wp:positionH relativeFrom="column">
+                  <wp:posOffset>504750</wp:posOffset>
+                </wp:positionH>
+                <wp:positionV relativeFrom="paragraph">
+                  <wp:posOffset>1903990</wp:posOffset>
+                </wp:positionV>
+                <wp:extent cx="2619720" cy="360"/>
+                <wp:effectExtent l="38100" t="38100" r="28575" b="19050"/>
+                <wp:wrapNone/>
+                <wp:docPr id="1645016112" name="Ink 1"/>
+                <wp:cNvGraphicFramePr>
+                  <a:graphicFrameLocks xmlns:a="http://schemas.openxmlformats.org/drawingml/2006/main"/>
+                </wp:cNvGraphicFramePr>
+                <a:graphic xmlns:a="http://schemas.openxmlformats.org/drawingml/2006/main">
+                  <a:graphicData uri="http://schemas.microsoft.com/office/word/2010/wordprocessingInk">
+                    <w14:contentPart bwMode="auto" r:id="rId65">
+                      <w14:nvContentPartPr>
+                        <w14:cNvContentPartPr>
+                          <a14:cpLocks xmlns:a14="http://schemas.microsoft.com/office/drawing/2010/main" noRot="1"/>
+                        </w14:cNvContentPartPr>
+                      </w14:nvContentPartPr>
+                      <w14:xfrm>
+                        <a:off x="0" y="0"/>
+                        <a:ext cx="2619720" cy="360"/>
+                      </w14:xfrm>
+                    </w14:contentPart>
+                  </a:graphicData>
+                </a:graphic>
+              </wp:anchor>
+            </w:drawing>
+          </mc:Choice>
+          <mc:Fallback>
+            <w:pict>
+              <v:shape w14:anchorId="2B56116E" id="Ink 1" o:spid="_x0000_s1026" type="#_x0000_t75" style="position:absolute;margin-left:39.25pt;margin-top:149.4pt;width:207.3pt;height:1.05pt;z-index:251659264;visibility:visible;mso-wrap-style:square;mso-wrap-distance-left:9pt;mso-wrap-distance-top:0;mso-wrap-distance-right:9pt;mso-wrap-distance-bottom:0;mso-position-horizontal:absolute;mso-position-horizontal-relative:text;mso-position-vertical:absolute;mso-position-vertical-relative:text" o:gfxdata="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">
+                <v:imagedata r:id="rId66" o:title=""/>
+                <o:lock v:ext="edit" rotation="t" aspectratio="f"/>
+              </v:shape>
+            </w:pict>
+          </mc:Fallback>
+        </mc:AlternateContent>
+      </w:r>
+      <w:r>
+        <w:rPr>
+          <w:b/>
+          <w:bCs/>
+          <w:sz w:val="32"/>
+          <w:szCs w:val="32"/>
+        </w:rPr>
+        <w:drawing>
+          <wp:inline distT="0" distB="0" distL="0" distR="0" wp14:anchorId="0E7DC40F" wp14:editId="09D72248">
+            <wp:extent cx="5229955" cy="3410426"/>
+            <wp:effectExtent l="0" t="0" r="8890" b="0"/>
+            <wp:docPr id="1302390717" name="Picture 1"/>
+            <wp:cNvGraphicFramePr>
+              <a:graphicFrameLocks xmlns:a="http://schemas.openxmlformats.org/drawingml/2006/main" noChangeAspect="1"/>
+            </wp:cNvGraphicFramePr>
+            <a:graphic xmlns:a="http://schemas.openxmlformats.org/drawingml/2006/main">
+              <a:graphicData uri="http://schemas.openxmlformats.org/drawingml/2006/picture">
+                <pic:pic xmlns:pic="http://schemas.openxmlformats.org/drawingml/2006/picture">
+                  <pic:nvPicPr>
+                    <pic:cNvPr id="1302390717" name=""/>
+                    <pic:cNvPicPr/>
+                  </pic:nvPicPr>
+                  <pic:blipFill>
+                    <a:blip r:embed="rId67"/>
+                    <a:stretch>
+                      <a:fillRect/>
+                    </a:stretch>
+                  </pic:blipFill>
+                  <pic:spPr>
+                    <a:xfrm>
+                      <a:off x="0" y="0"/>
+                      <a:ext cx="5229955" cy="3410426"/>
                     </a:xfrm>
                     <a:prstGeom prst="rect">
                       <a:avLst/>
@@ -2073,6 +4109,708 @@
 </w:styles>
 </file>
 
+<file path=word/ink/ink1.xml><?xml version="1.0" encoding="utf-8"?>
+<inkml:ink xmlns:inkml="http://www.w3.org/2003/InkML">
+  <inkml:definitions>
+    <inkml:context xml:id="ctx0">
+      <inkml:inkSource xml:id="inkSrc0">
+        <inkml:traceFormat>
+          <inkml:channel name="X" type="integer" min="-2.14748E9" max="2.14748E9" units="cm"/>
+          <inkml:channel name="Y" type="integer" min="-2.14748E9" max="2.14748E9" units="cm"/>
+          <inkml:channel name="F" type="integer" max="32767" units="dev"/>
+        </inkml:traceFormat>
+        <inkml:channelProperties>
+          <inkml:channelProperty channel="X" name="resolution" value="1000" units="1/cm"/>
+          <inkml:channelProperty channel="Y" name="resolution" value="1000" units="1/cm"/>
+          <inkml:channelProperty channel="F" name="resolution" value="0" units="1/dev"/>
+        </inkml:channelProperties>
+      </inkml:inkSource>
+      <inkml:timestamp xml:id="ts0" timeString="2025-05-28T14:38:28.738"/>
+    </inkml:context>
+    <inkml:brush xml:id="br0">
+      <inkml:brushProperty name="width" value="0.1" units="cm"/>
+      <inkml:brushProperty name="height" value="0.1" units="cm"/>
+      <inkml:brushProperty name="color" value="#33CCFF"/>
+    </inkml:brush>
+  </inkml:definitions>
+  <inkml:trace contextRef="#ctx0" brushRef="#br0">394 0 24575,'0'3'0,"-1"0"0,0-1 0,0 1 0,0 0 0,0-1 0,0 1 0,0-1 0,-1 1 0,1-1 0,-1 1 0,1-1 0,-1 0 0,0 0 0,-3 3 0,-37 31 0,27-24 0,-54 44 0,-38 34 0,95-78 0,1 0 0,0 1 0,1 0 0,0 1 0,1 0 0,-9 20 0,5-7 0,5-12 0,1 0 0,0 0 0,1 1 0,1-1 0,-6 32 0,10-44 0,1 1 0,0-1 0,0 0 0,0 0 0,1 1 0,-1-1 0,1 0 0,0 0 0,0 0 0,0 0 0,0 0 0,0 0 0,1 0 0,-1 0 0,1 0 0,0 0 0,0-1 0,0 1 0,0-1 0,0 1 0,0-1 0,1 0 0,-1 0 0,1 0 0,0 0 0,-1-1 0,1 1 0,0 0 0,0-1 0,0 0 0,0 0 0,0 0 0,1 0 0,-1-1 0,0 1 0,4-1 0,46 6-1365,-29-6-5461</inkml:trace>
+</inkml:ink>
+</file>
+
+<file path=word/ink/ink10.xml><?xml version="1.0" encoding="utf-8"?>
+<inkml:ink xmlns:inkml="http://www.w3.org/2003/InkML">
+  <inkml:definitions>
+    <inkml:context xml:id="ctx0">
+      <inkml:inkSource xml:id="inkSrc0">
+        <inkml:traceFormat>
+          <inkml:channel name="X" type="integer" min="-2.14748E9" max="2.14748E9" units="cm"/>
+          <inkml:channel name="Y" type="integer" min="-2.14748E9" max="2.14748E9" units="cm"/>
+        </inkml:traceFormat>
+        <inkml:channelProperties>
+          <inkml:channelProperty channel="X" name="resolution" value="1000" units="1/cm"/>
+          <inkml:channelProperty channel="Y" name="resolution" value="1000" units="1/cm"/>
+        </inkml:channelProperties>
+      </inkml:inkSource>
+      <inkml:timestamp xml:id="ts0" timeString="2025-05-28T14:37:21.725"/>
+    </inkml:context>
+    <inkml:brush xml:id="br0">
+      <inkml:brushProperty name="width" value="0.1" units="cm"/>
+      <inkml:brushProperty name="height" value="0.1" units="cm"/>
+      <inkml:brushProperty name="color" value="#33CCFF"/>
+      <inkml:brushProperty name="ignorePressure" value="1"/>
+    </inkml:brush>
+  </inkml:definitions>
+  <inkml:trace contextRef="#ctx0" brushRef="#br0">0 0,'6446'0,"-6418"0</inkml:trace>
+</inkml:ink>
+</file>
+
+<file path=word/ink/ink11.xml><?xml version="1.0" encoding="utf-8"?>
+<inkml:ink xmlns:inkml="http://www.w3.org/2003/InkML">
+  <inkml:definitions>
+    <inkml:context xml:id="ctx0">
+      <inkml:inkSource xml:id="inkSrc0">
+        <inkml:traceFormat>
+          <inkml:channel name="X" type="integer" min="-2.14748E9" max="2.14748E9" units="cm"/>
+          <inkml:channel name="Y" type="integer" min="-2.14748E9" max="2.14748E9" units="cm"/>
+        </inkml:traceFormat>
+        <inkml:channelProperties>
+          <inkml:channelProperty channel="X" name="resolution" value="1000" units="1/cm"/>
+          <inkml:channelProperty channel="Y" name="resolution" value="1000" units="1/cm"/>
+        </inkml:channelProperties>
+      </inkml:inkSource>
+      <inkml:timestamp xml:id="ts0" timeString="2025-05-28T14:37:16.731"/>
+    </inkml:context>
+    <inkml:brush xml:id="br0">
+      <inkml:brushProperty name="width" value="0.1" units="cm"/>
+      <inkml:brushProperty name="height" value="0.1" units="cm"/>
+      <inkml:brushProperty name="color" value="#33CCFF"/>
+      <inkml:brushProperty name="ignorePressure" value="1"/>
+    </inkml:brush>
+  </inkml:definitions>
+  <inkml:trace contextRef="#ctx0" brushRef="#br0">0 0,'4560'0,"-4668"0,94 0</inkml:trace>
+</inkml:ink>
+</file>
+
+<file path=word/ink/ink12.xml><?xml version="1.0" encoding="utf-8"?>
+<inkml:ink xmlns:inkml="http://www.w3.org/2003/InkML">
+  <inkml:definitions>
+    <inkml:context xml:id="ctx0">
+      <inkml:inkSource xml:id="inkSrc0">
+        <inkml:traceFormat>
+          <inkml:channel name="X" type="integer" min="-2.14748E9" max="2.14748E9" units="cm"/>
+          <inkml:channel name="Y" type="integer" min="-2.14748E9" max="2.14748E9" units="cm"/>
+          <inkml:channel name="F" type="integer" max="32767" units="dev"/>
+        </inkml:traceFormat>
+        <inkml:channelProperties>
+          <inkml:channelProperty channel="X" name="resolution" value="1000" units="1/cm"/>
+          <inkml:channelProperty channel="Y" name="resolution" value="1000" units="1/cm"/>
+          <inkml:channelProperty channel="F" name="resolution" value="0" units="1/dev"/>
+        </inkml:channelProperties>
+      </inkml:inkSource>
+      <inkml:timestamp xml:id="ts0" timeString="2025-05-28T14:37:00.448"/>
+    </inkml:context>
+    <inkml:brush xml:id="br0">
+      <inkml:brushProperty name="width" value="0.1" units="cm"/>
+      <inkml:brushProperty name="height" value="0.1" units="cm"/>
+      <inkml:brushProperty name="color" value="#33CCFF"/>
+    </inkml:brush>
+  </inkml:definitions>
+  <inkml:trace contextRef="#ctx0" brushRef="#br0">163 26 24575,'-3'1'0,"0"-1"0,1 1 0,-1 0 0,0 0 0,0 0 0,1 0 0,-1 0 0,1 1 0,-1-1 0,1 1 0,0 0 0,-1-1 0,1 1 0,0 0 0,-3 4 0,-29 38 0,28-35 0,-3 2 0,0 1 0,1 0 0,0 1 0,1 0 0,1 0 0,0 1 0,1 0 0,0 0 0,1 0 0,0 0 0,1 1 0,1-1 0,-1 26 0,3-24-111,-1 2-98,1 0 0,1-1 0,1 1 0,0 0 0,8 26 0,-4-27-6617</inkml:trace>
+  <inkml:trace contextRef="#ctx0" brushRef="#br0" timeOffset="2093.98">4580 0 24575,'0'1'0,"-1"0"0,1 1 0,-1-1 0,1 0 0,-1 0 0,0 0 0,1 0 0,-1 0 0,0 0 0,0 0 0,0 0 0,0 0 0,0-1 0,0 1 0,0 0 0,0 0 0,0-1 0,0 1 0,0-1 0,0 1 0,-1-1 0,0 1 0,-37 12 0,23-8 0,1 0 0,1 2 0,0 0 0,0 0 0,0 2 0,1 0 0,1 0 0,-1 1 0,1 0 0,1 1 0,0 1 0,1 0 0,0 0 0,1 1 0,-15 26 0,14-25 0,-1-1 0,0 0 0,-1 0 0,0-2 0,0 1 0,-2-2 0,1 1 0,-1-2 0,-1 0 0,-15 7 0,7-4 0,2 2 0,0 0 0,-25 22 0,39-29-195,-1 0 0,1-1 0,-1 0 0,0-1 0,-1 0 0,-17 8 0,6-6-6631</inkml:trace>
+</inkml:ink>
+</file>
+
+<file path=word/ink/ink13.xml><?xml version="1.0" encoding="utf-8"?>
+<inkml:ink xmlns:inkml="http://www.w3.org/2003/InkML">
+  <inkml:definitions>
+    <inkml:context xml:id="ctx0">
+      <inkml:inkSource xml:id="inkSrc0">
+        <inkml:traceFormat>
+          <inkml:channel name="X" type="integer" min="-2.14748E9" max="2.14748E9" units="cm"/>
+          <inkml:channel name="Y" type="integer" min="-2.14748E9" max="2.14748E9" units="cm"/>
+        </inkml:traceFormat>
+        <inkml:channelProperties>
+          <inkml:channelProperty channel="X" name="resolution" value="1000" units="1/cm"/>
+          <inkml:channelProperty channel="Y" name="resolution" value="1000" units="1/cm"/>
+        </inkml:channelProperties>
+      </inkml:inkSource>
+      <inkml:timestamp xml:id="ts0" timeString="2025-05-28T14:36:57.252"/>
+    </inkml:context>
+    <inkml:brush xml:id="br0">
+      <inkml:brushProperty name="width" value="0.1" units="cm"/>
+      <inkml:brushProperty name="height" value="0.1" units="cm"/>
+      <inkml:brushProperty name="color" value="#33CCFF"/>
+      <inkml:brushProperty name="ignorePressure" value="1"/>
+    </inkml:brush>
+  </inkml:definitions>
+  <inkml:trace contextRef="#ctx0" brushRef="#br0">0 1,'4605'0,"-4581"0</inkml:trace>
+</inkml:ink>
+</file>
+
+<file path=word/ink/ink14.xml><?xml version="1.0" encoding="utf-8"?>
+<inkml:ink xmlns:inkml="http://www.w3.org/2003/InkML">
+  <inkml:definitions>
+    <inkml:context xml:id="ctx0">
+      <inkml:inkSource xml:id="inkSrc0">
+        <inkml:traceFormat>
+          <inkml:channel name="X" type="integer" min="-2.14748E9" max="2.14748E9" units="cm"/>
+          <inkml:channel name="Y" type="integer" min="-2.14748E9" max="2.14748E9" units="cm"/>
+        </inkml:traceFormat>
+        <inkml:channelProperties>
+          <inkml:channelProperty channel="X" name="resolution" value="1000" units="1/cm"/>
+          <inkml:channelProperty channel="Y" name="resolution" value="1000" units="1/cm"/>
+        </inkml:channelProperties>
+      </inkml:inkSource>
+      <inkml:timestamp xml:id="ts0" timeString="2025-05-28T14:36:44.958"/>
+    </inkml:context>
+    <inkml:brush xml:id="br0">
+      <inkml:brushProperty name="width" value="0.1" units="cm"/>
+      <inkml:brushProperty name="height" value="0.1" units="cm"/>
+      <inkml:brushProperty name="color" value="#33CCFF"/>
+      <inkml:brushProperty name="ignorePressure" value="1"/>
+    </inkml:brush>
+  </inkml:definitions>
+  <inkml:trace contextRef="#ctx0" brushRef="#br0">0 1,'3808'0,"-3791"0</inkml:trace>
+</inkml:ink>
+</file>
+
+<file path=word/ink/ink15.xml><?xml version="1.0" encoding="utf-8"?>
+<inkml:ink xmlns:inkml="http://www.w3.org/2003/InkML">
+  <inkml:definitions>
+    <inkml:context xml:id="ctx0">
+      <inkml:inkSource xml:id="inkSrc0">
+        <inkml:traceFormat>
+          <inkml:channel name="X" type="integer" min="-2.14748E9" max="2.14748E9" units="cm"/>
+          <inkml:channel name="Y" type="integer" min="-2.14748E9" max="2.14748E9" units="cm"/>
+          <inkml:channel name="F" type="integer" max="32767" units="dev"/>
+        </inkml:traceFormat>
+        <inkml:channelProperties>
+          <inkml:channelProperty channel="X" name="resolution" value="1000" units="1/cm"/>
+          <inkml:channelProperty channel="Y" name="resolution" value="1000" units="1/cm"/>
+          <inkml:channelProperty channel="F" name="resolution" value="0" units="1/dev"/>
+        </inkml:channelProperties>
+      </inkml:inkSource>
+      <inkml:timestamp xml:id="ts0" timeString="2025-05-28T14:36:28.433"/>
+    </inkml:context>
+    <inkml:brush xml:id="br0">
+      <inkml:brushProperty name="width" value="0.1" units="cm"/>
+      <inkml:brushProperty name="height" value="0.1" units="cm"/>
+      <inkml:brushProperty name="color" value="#33CCFF"/>
+    </inkml:brush>
+  </inkml:definitions>
+  <inkml:trace contextRef="#ctx0" brushRef="#br0">54 0 24575,'-11'43'0,"1"-10"0,-12 151 0,16-135-315,2 0 0,3 58 0,1-95-105,1 11-6406</inkml:trace>
+</inkml:ink>
+</file>
+
+<file path=word/ink/ink16.xml><?xml version="1.0" encoding="utf-8"?>
+<inkml:ink xmlns:inkml="http://www.w3.org/2003/InkML">
+  <inkml:definitions>
+    <inkml:context xml:id="ctx0">
+      <inkml:inkSource xml:id="inkSrc0">
+        <inkml:traceFormat>
+          <inkml:channel name="X" type="integer" min="-2.14748E9" max="2.14748E9" units="cm"/>
+          <inkml:channel name="Y" type="integer" min="-2.14748E9" max="2.14748E9" units="cm"/>
+          <inkml:channel name="F" type="integer" max="32767" units="dev"/>
+        </inkml:traceFormat>
+        <inkml:channelProperties>
+          <inkml:channelProperty channel="X" name="resolution" value="1000" units="1/cm"/>
+          <inkml:channelProperty channel="Y" name="resolution" value="1000" units="1/cm"/>
+          <inkml:channelProperty channel="F" name="resolution" value="0" units="1/dev"/>
+        </inkml:channelProperties>
+      </inkml:inkSource>
+      <inkml:timestamp xml:id="ts0" timeString="2025-05-28T14:36:25.795"/>
+    </inkml:context>
+    <inkml:brush xml:id="br0">
+      <inkml:brushProperty name="width" value="0.1" units="cm"/>
+      <inkml:brushProperty name="height" value="0.1" units="cm"/>
+      <inkml:brushProperty name="color" value="#33CCFF"/>
+    </inkml:brush>
+  </inkml:definitions>
+  <inkml:trace contextRef="#ctx0" brushRef="#br0">94 1 24575,'-5'0'0,"0"0"0,0 0 0,0 0 0,0 1 0,0 0 0,1 0 0,-1 0 0,0 0 0,0 1 0,1 0 0,-1 0 0,1 0 0,-5 4 0,7-4 0,0 0 0,0 0 0,0 0 0,0 1 0,0-1 0,1 1 0,-1 0 0,1-1 0,0 1 0,-1 0 0,1 0 0,1-1 0,-1 1 0,0 0 0,1 0 0,-1 0 0,1 0 0,0 0 0,0 0 0,0 0 0,1 0 0,0 5 0,5 25 0,2-1 0,23 62 0,-17-54 0,11 47 0,-6-19-1365,-12-51-5461</inkml:trace>
+</inkml:ink>
+</file>
+
+<file path=word/ink/ink17.xml><?xml version="1.0" encoding="utf-8"?>
+<inkml:ink xmlns:inkml="http://www.w3.org/2003/InkML">
+  <inkml:definitions>
+    <inkml:context xml:id="ctx0">
+      <inkml:inkSource xml:id="inkSrc0">
+        <inkml:traceFormat>
+          <inkml:channel name="X" type="integer" min="-2.14748E9" max="2.14748E9" units="cm"/>
+          <inkml:channel name="Y" type="integer" min="-2.14748E9" max="2.14748E9" units="cm"/>
+        </inkml:traceFormat>
+        <inkml:channelProperties>
+          <inkml:channelProperty channel="X" name="resolution" value="1000" units="1/cm"/>
+          <inkml:channelProperty channel="Y" name="resolution" value="1000" units="1/cm"/>
+        </inkml:channelProperties>
+      </inkml:inkSource>
+      <inkml:timestamp xml:id="ts0" timeString="2025-05-28T14:36:21.397"/>
+    </inkml:context>
+    <inkml:brush xml:id="br0">
+      <inkml:brushProperty name="width" value="0.1" units="cm"/>
+      <inkml:brushProperty name="height" value="0.1" units="cm"/>
+      <inkml:brushProperty name="color" value="#33CCFF"/>
+      <inkml:brushProperty name="ignorePressure" value="1"/>
+    </inkml:brush>
+  </inkml:definitions>
+  <inkml:trace contextRef="#ctx0" brushRef="#br0">0 1,'12119'0,"-12096"0</inkml:trace>
+</inkml:ink>
+</file>
+
+<file path=word/ink/ink18.xml><?xml version="1.0" encoding="utf-8"?>
+<inkml:ink xmlns:inkml="http://www.w3.org/2003/InkML">
+  <inkml:definitions>
+    <inkml:context xml:id="ctx0">
+      <inkml:inkSource xml:id="inkSrc0">
+        <inkml:traceFormat>
+          <inkml:channel name="X" type="integer" min="-2.14748E9" max="2.14748E9" units="cm"/>
+          <inkml:channel name="Y" type="integer" min="-2.14748E9" max="2.14748E9" units="cm"/>
+        </inkml:traceFormat>
+        <inkml:channelProperties>
+          <inkml:channelProperty channel="X" name="resolution" value="1000" units="1/cm"/>
+          <inkml:channelProperty channel="Y" name="resolution" value="1000" units="1/cm"/>
+        </inkml:channelProperties>
+      </inkml:inkSource>
+      <inkml:timestamp xml:id="ts0" timeString="2025-05-28T14:36:11.856"/>
+    </inkml:context>
+    <inkml:brush xml:id="br0">
+      <inkml:brushProperty name="width" value="0.1" units="cm"/>
+      <inkml:brushProperty name="height" value="0.1" units="cm"/>
+      <inkml:brushProperty name="color" value="#33CCFF"/>
+      <inkml:brushProperty name="ignorePressure" value="1"/>
+    </inkml:brush>
+  </inkml:definitions>
+  <inkml:trace contextRef="#ctx0" brushRef="#br0">0 1,'12173'0,"-12151"0</inkml:trace>
+</inkml:ink>
+</file>
+
+<file path=word/ink/ink19.xml><?xml version="1.0" encoding="utf-8"?>
+<inkml:ink xmlns:inkml="http://www.w3.org/2003/InkML">
+  <inkml:definitions>
+    <inkml:context xml:id="ctx0">
+      <inkml:inkSource xml:id="inkSrc0">
+        <inkml:traceFormat>
+          <inkml:channel name="X" type="integer" min="-2.14748E9" max="2.14748E9" units="cm"/>
+          <inkml:channel name="Y" type="integer" min="-2.14748E9" max="2.14748E9" units="cm"/>
+          <inkml:channel name="F" type="integer" max="32767" units="dev"/>
+        </inkml:traceFormat>
+        <inkml:channelProperties>
+          <inkml:channelProperty channel="X" name="resolution" value="1000" units="1/cm"/>
+          <inkml:channelProperty channel="Y" name="resolution" value="1000" units="1/cm"/>
+          <inkml:channelProperty channel="F" name="resolution" value="0" units="1/dev"/>
+        </inkml:channelProperties>
+      </inkml:inkSource>
+      <inkml:timestamp xml:id="ts0" timeString="2025-05-28T14:35:54.490"/>
+    </inkml:context>
+    <inkml:brush xml:id="br0">
+      <inkml:brushProperty name="width" value="0.1" units="cm"/>
+      <inkml:brushProperty name="height" value="0.1" units="cm"/>
+      <inkml:brushProperty name="color" value="#33CCFF"/>
+    </inkml:brush>
+  </inkml:definitions>
+  <inkml:trace contextRef="#ctx0" brushRef="#br0">133 0 24575,'-1'16'0,"-1"-1"0,-1 0 0,0 1 0,-1-1 0,-1 0 0,0-1 0,-1 1 0,-1-1 0,-13 23 0,-18 41 0,29-54 13,2 0 0,1 0 0,0 1 0,-3 48 0,7 101-439,3-106-578,-1-45-5822</inkml:trace>
+</inkml:ink>
+</file>
+
+<file path=word/ink/ink2.xml><?xml version="1.0" encoding="utf-8"?>
+<inkml:ink xmlns:inkml="http://www.w3.org/2003/InkML">
+  <inkml:definitions>
+    <inkml:context xml:id="ctx0">
+      <inkml:inkSource xml:id="inkSrc0">
+        <inkml:traceFormat>
+          <inkml:channel name="X" type="integer" min="-2.14748E9" max="2.14748E9" units="cm"/>
+          <inkml:channel name="Y" type="integer" min="-2.14748E9" max="2.14748E9" units="cm"/>
+        </inkml:traceFormat>
+        <inkml:channelProperties>
+          <inkml:channelProperty channel="X" name="resolution" value="1000" units="1/cm"/>
+          <inkml:channelProperty channel="Y" name="resolution" value="1000" units="1/cm"/>
+        </inkml:channelProperties>
+      </inkml:inkSource>
+      <inkml:timestamp xml:id="ts0" timeString="2025-05-28T14:38:20.507"/>
+    </inkml:context>
+    <inkml:brush xml:id="br0">
+      <inkml:brushProperty name="width" value="0.1" units="cm"/>
+      <inkml:brushProperty name="height" value="0.1" units="cm"/>
+      <inkml:brushProperty name="color" value="#33CCFF"/>
+      <inkml:brushProperty name="ignorePressure" value="1"/>
+    </inkml:brush>
+    <inkml:context xml:id="ctx1">
+      <inkml:inkSource xml:id="inkSrc2">
+        <inkml:traceFormat>
+          <inkml:channel name="X" type="integer" min="-2.14748E9" max="2.14748E9" units="cm"/>
+          <inkml:channel name="Y" type="integer" min="-2.14748E9" max="2.14748E9" units="cm"/>
+          <inkml:channel name="F" type="integer" max="32767" units="dev"/>
+        </inkml:traceFormat>
+        <inkml:channelProperties>
+          <inkml:channelProperty channel="X" name="resolution" value="1000" units="1/cm"/>
+          <inkml:channelProperty channel="Y" name="resolution" value="1000" units="1/cm"/>
+          <inkml:channelProperty channel="F" name="resolution" value="0" units="1/dev"/>
+        </inkml:channelProperties>
+      </inkml:inkSource>
+      <inkml:timestamp xml:id="ts1" timeString="2025-05-28T14:38:25.920"/>
+    </inkml:context>
+    <inkml:brush xml:id="br1">
+      <inkml:brushProperty name="width" value="0.1" units="cm"/>
+      <inkml:brushProperty name="height" value="0.1" units="cm"/>
+      <inkml:brushProperty name="color" value="#33CCFF"/>
+    </inkml:brush>
+  </inkml:definitions>
+  <inkml:trace contextRef="#ctx0" brushRef="#br0">0 602,'652'0,"-635"0</inkml:trace>
+  <inkml:trace contextRef="#ctx0" brushRef="#br0" timeOffset="2062.28">795 602,'-398'0,"375"0</inkml:trace>
+  <inkml:trace contextRef="#ctx1" brushRef="#br1">132 0 24575,'22'0'0,"0"1"0,0 1 0,0 2 0,0 0 0,-1 0 0,1 2 0,26 12 0,-21-6 0,0 0 0,1-1 0,33 7 0,-27-7 0,-1 2 0,0 1 0,-1 2 0,-1 1 0,-1 1 0,0 2 0,29 25 0,-54-41 9,0 1 1,0 0-1,-1 0 0,1 0 0,-1 0 1,0 0-1,-1 1 0,1 0 0,-1 0 0,0 0 1,-1 0-1,4 11 0,-3-3-306,0 0 0,0 1 0,-2 0 0,0 23 0,-1-16-6529</inkml:trace>
+</inkml:ink>
+</file>
+
+<file path=word/ink/ink20.xml><?xml version="1.0" encoding="utf-8"?>
+<inkml:ink xmlns:inkml="http://www.w3.org/2003/InkML">
+  <inkml:definitions>
+    <inkml:context xml:id="ctx0">
+      <inkml:inkSource xml:id="inkSrc0">
+        <inkml:traceFormat>
+          <inkml:channel name="X" type="integer" min="-2.14748E9" max="2.14748E9" units="cm"/>
+          <inkml:channel name="Y" type="integer" min="-2.14748E9" max="2.14748E9" units="cm"/>
+          <inkml:channel name="F" type="integer" max="32767" units="dev"/>
+        </inkml:traceFormat>
+        <inkml:channelProperties>
+          <inkml:channelProperty channel="X" name="resolution" value="1000" units="1/cm"/>
+          <inkml:channelProperty channel="Y" name="resolution" value="1000" units="1/cm"/>
+          <inkml:channelProperty channel="F" name="resolution" value="0" units="1/dev"/>
+        </inkml:channelProperties>
+      </inkml:inkSource>
+      <inkml:timestamp xml:id="ts0" timeString="2025-05-28T14:35:51.859"/>
+    </inkml:context>
+    <inkml:brush xml:id="br0">
+      <inkml:brushProperty name="width" value="0.1" units="cm"/>
+      <inkml:brushProperty name="height" value="0.1" units="cm"/>
+      <inkml:brushProperty name="color" value="#33CCFF"/>
+    </inkml:brush>
+  </inkml:definitions>
+  <inkml:trace contextRef="#ctx0" brushRef="#br0">0 0 24575,'3'23'0,"0"0"0,2-1 0,0 1 0,2-1 0,0-1 0,2 1 0,21 38 0,-2 1 0,-22-47 0,12 28 0,26 44 0,-41-82 0,-1-1 0,0 1 0,0 0 0,-1 0 0,1 0 0,-1 0 0,0 0 0,0 0 0,0 0 0,0 1 0,-1-1 0,0 0 0,0 0 0,0 7 0,-1-9 0,0 1 0,0-1 0,0 1 0,0-1 0,0 0 0,0 0 0,-1 1 0,1-1 0,-1 0 0,1 0 0,-1 0 0,0-1 0,0 1 0,0 0 0,0-1 0,0 1 0,0-1 0,-1 1 0,1-1 0,0 0 0,-1 0 0,1 0 0,-1 0 0,-3 0 0,1 0-124,-1 1 0,1 0 0,0 0 0,0 0 0,-1 1 0,1 0-1,1 0 1,-1 0 0,0 0 0,-6 7 0</inkml:trace>
+</inkml:ink>
+</file>
+
+<file path=word/ink/ink21.xml><?xml version="1.0" encoding="utf-8"?>
+<inkml:ink xmlns:inkml="http://www.w3.org/2003/InkML">
+  <inkml:definitions>
+    <inkml:context xml:id="ctx0">
+      <inkml:inkSource xml:id="inkSrc0">
+        <inkml:traceFormat>
+          <inkml:channel name="X" type="integer" min="-2.14748E9" max="2.14748E9" units="cm"/>
+          <inkml:channel name="Y" type="integer" min="-2.14748E9" max="2.14748E9" units="cm"/>
+        </inkml:traceFormat>
+        <inkml:channelProperties>
+          <inkml:channelProperty channel="X" name="resolution" value="1000" units="1/cm"/>
+          <inkml:channelProperty channel="Y" name="resolution" value="1000" units="1/cm"/>
+        </inkml:channelProperties>
+      </inkml:inkSource>
+      <inkml:timestamp xml:id="ts0" timeString="2025-05-28T14:35:48.001"/>
+    </inkml:context>
+    <inkml:brush xml:id="br0">
+      <inkml:brushProperty name="width" value="0.1" units="cm"/>
+      <inkml:brushProperty name="height" value="0.1" units="cm"/>
+      <inkml:brushProperty name="color" value="#33CCFF"/>
+      <inkml:brushProperty name="ignorePressure" value="1"/>
+    </inkml:brush>
+  </inkml:definitions>
+  <inkml:trace contextRef="#ctx0" brushRef="#br0">0 0,'7535'0,"-7508"0</inkml:trace>
+</inkml:ink>
+</file>
+
+<file path=word/ink/ink22.xml><?xml version="1.0" encoding="utf-8"?>
+<inkml:ink xmlns:inkml="http://www.w3.org/2003/InkML">
+  <inkml:definitions>
+    <inkml:context xml:id="ctx0">
+      <inkml:inkSource xml:id="inkSrc0">
+        <inkml:traceFormat>
+          <inkml:channel name="X" type="integer" min="-2.14748E9" max="2.14748E9" units="cm"/>
+          <inkml:channel name="Y" type="integer" min="-2.14748E9" max="2.14748E9" units="cm"/>
+        </inkml:traceFormat>
+        <inkml:channelProperties>
+          <inkml:channelProperty channel="X" name="resolution" value="1000" units="1/cm"/>
+          <inkml:channelProperty channel="Y" name="resolution" value="1000" units="1/cm"/>
+        </inkml:channelProperties>
+      </inkml:inkSource>
+      <inkml:timestamp xml:id="ts0" timeString="2025-05-28T14:35:32.630"/>
+    </inkml:context>
+    <inkml:brush xml:id="br0">
+      <inkml:brushProperty name="width" value="0.1" units="cm"/>
+      <inkml:brushProperty name="height" value="0.1" units="cm"/>
+      <inkml:brushProperty name="color" value="#33CCFF"/>
+      <inkml:brushProperty name="ignorePressure" value="1"/>
+    </inkml:brush>
+  </inkml:definitions>
+  <inkml:trace contextRef="#ctx0" brushRef="#br0">0 0,'7409'0,"-7386"0</inkml:trace>
+</inkml:ink>
+</file>
+
+<file path=word/ink/ink23.xml><?xml version="1.0" encoding="utf-8"?>
+<inkml:ink xmlns:inkml="http://www.w3.org/2003/InkML">
+  <inkml:definitions>
+    <inkml:context xml:id="ctx0">
+      <inkml:inkSource xml:id="inkSrc0">
+        <inkml:traceFormat>
+          <inkml:channel name="X" type="integer" min="-2.14748E9" max="2.14748E9" units="cm"/>
+          <inkml:channel name="Y" type="integer" min="-2.14748E9" max="2.14748E9" units="cm"/>
+        </inkml:traceFormat>
+        <inkml:channelProperties>
+          <inkml:channelProperty channel="X" name="resolution" value="1000" units="1/cm"/>
+          <inkml:channelProperty channel="Y" name="resolution" value="1000" units="1/cm"/>
+        </inkml:channelProperties>
+      </inkml:inkSource>
+      <inkml:timestamp xml:id="ts0" timeString="2025-05-28T14:35:20.119"/>
+    </inkml:context>
+    <inkml:brush xml:id="br0">
+      <inkml:brushProperty name="width" value="0.1" units="cm"/>
+      <inkml:brushProperty name="height" value="0.1" units="cm"/>
+      <inkml:brushProperty name="color" value="#33CCFF"/>
+      <inkml:brushProperty name="ignorePressure" value="1"/>
+    </inkml:brush>
+  </inkml:definitions>
+  <inkml:trace contextRef="#ctx0" brushRef="#br0">0 1,'7344'0,"-7326"0</inkml:trace>
+</inkml:ink>
+</file>
+
+<file path=word/ink/ink24.xml><?xml version="1.0" encoding="utf-8"?>
+<inkml:ink xmlns:inkml="http://www.w3.org/2003/InkML">
+  <inkml:definitions>
+    <inkml:context xml:id="ctx0">
+      <inkml:inkSource xml:id="inkSrc0">
+        <inkml:traceFormat>
+          <inkml:channel name="X" type="integer" min="-2.14748E9" max="2.14748E9" units="cm"/>
+          <inkml:channel name="Y" type="integer" min="-2.14748E9" max="2.14748E9" units="cm"/>
+        </inkml:traceFormat>
+        <inkml:channelProperties>
+          <inkml:channelProperty channel="X" name="resolution" value="1000" units="1/cm"/>
+          <inkml:channelProperty channel="Y" name="resolution" value="1000" units="1/cm"/>
+        </inkml:channelProperties>
+      </inkml:inkSource>
+      <inkml:timestamp xml:id="ts0" timeString="2025-05-28T14:35:08.076"/>
+    </inkml:context>
+    <inkml:brush xml:id="br0">
+      <inkml:brushProperty name="width" value="0.035" units="cm"/>
+      <inkml:brushProperty name="height" value="0.035" units="cm"/>
+      <inkml:brushProperty name="color" value="#33CCFF"/>
+      <inkml:brushProperty name="ignorePressure" value="1"/>
+    </inkml:brush>
+  </inkml:definitions>
+  <inkml:trace contextRef="#ctx0" brushRef="#br0">0 1,'7257'0,"-7238"0</inkml:trace>
+</inkml:ink>
+</file>
+
+<file path=word/ink/ink3.xml><?xml version="1.0" encoding="utf-8"?>
+<inkml:ink xmlns:inkml="http://www.w3.org/2003/InkML">
+  <inkml:definitions>
+    <inkml:context xml:id="ctx0">
+      <inkml:inkSource xml:id="inkSrc0">
+        <inkml:traceFormat>
+          <inkml:channel name="X" type="integer" min="-2.14748E9" max="2.14748E9" units="cm"/>
+          <inkml:channel name="Y" type="integer" min="-2.14748E9" max="2.14748E9" units="cm"/>
+        </inkml:traceFormat>
+        <inkml:channelProperties>
+          <inkml:channelProperty channel="X" name="resolution" value="1000" units="1/cm"/>
+          <inkml:channelProperty channel="Y" name="resolution" value="1000" units="1/cm"/>
+        </inkml:channelProperties>
+      </inkml:inkSource>
+      <inkml:timestamp xml:id="ts0" timeString="2025-05-28T14:38:17.883"/>
+    </inkml:context>
+    <inkml:brush xml:id="br0">
+      <inkml:brushProperty name="width" value="0.1" units="cm"/>
+      <inkml:brushProperty name="height" value="0.1" units="cm"/>
+      <inkml:brushProperty name="color" value="#33CCFF"/>
+      <inkml:brushProperty name="ignorePressure" value="1"/>
+    </inkml:brush>
+  </inkml:definitions>
+  <inkml:trace contextRef="#ctx0" brushRef="#br0">0 0,'10998'0,"-10971"0</inkml:trace>
+</inkml:ink>
+</file>
+
+<file path=word/ink/ink4.xml><?xml version="1.0" encoding="utf-8"?>
+<inkml:ink xmlns:inkml="http://www.w3.org/2003/InkML">
+  <inkml:definitions>
+    <inkml:context xml:id="ctx0">
+      <inkml:inkSource xml:id="inkSrc0">
+        <inkml:traceFormat>
+          <inkml:channel name="X" type="integer" min="-2.14748E9" max="2.14748E9" units="cm"/>
+          <inkml:channel name="Y" type="integer" min="-2.14748E9" max="2.14748E9" units="cm"/>
+        </inkml:traceFormat>
+        <inkml:channelProperties>
+          <inkml:channelProperty channel="X" name="resolution" value="1000" units="1/cm"/>
+          <inkml:channelProperty channel="Y" name="resolution" value="1000" units="1/cm"/>
+        </inkml:channelProperties>
+      </inkml:inkSource>
+      <inkml:timestamp xml:id="ts0" timeString="2025-05-28T14:38:09.984"/>
+    </inkml:context>
+    <inkml:brush xml:id="br0">
+      <inkml:brushProperty name="width" value="0.1" units="cm"/>
+      <inkml:brushProperty name="height" value="0.1" units="cm"/>
+      <inkml:brushProperty name="color" value="#33CCFF"/>
+      <inkml:brushProperty name="ignorePressure" value="1"/>
+    </inkml:brush>
+  </inkml:definitions>
+  <inkml:trace contextRef="#ctx0" brushRef="#br0">0 0,'2029'0,"-2001"0</inkml:trace>
+</inkml:ink>
+</file>
+
+<file path=word/ink/ink5.xml><?xml version="1.0" encoding="utf-8"?>
+<inkml:ink xmlns:inkml="http://www.w3.org/2003/InkML">
+  <inkml:definitions>
+    <inkml:context xml:id="ctx0">
+      <inkml:inkSource xml:id="inkSrc0">
+        <inkml:traceFormat>
+          <inkml:channel name="X" type="integer" min="-2.14748E9" max="2.14748E9" units="cm"/>
+          <inkml:channel name="Y" type="integer" min="-2.14748E9" max="2.14748E9" units="cm"/>
+        </inkml:traceFormat>
+        <inkml:channelProperties>
+          <inkml:channelProperty channel="X" name="resolution" value="1000" units="1/cm"/>
+          <inkml:channelProperty channel="Y" name="resolution" value="1000" units="1/cm"/>
+        </inkml:channelProperties>
+      </inkml:inkSource>
+      <inkml:timestamp xml:id="ts0" timeString="2025-05-28T14:38:05.044"/>
+    </inkml:context>
+    <inkml:brush xml:id="br0">
+      <inkml:brushProperty name="width" value="0.1" units="cm"/>
+      <inkml:brushProperty name="height" value="0.1" units="cm"/>
+      <inkml:brushProperty name="color" value="#33CCFF"/>
+      <inkml:brushProperty name="ignorePressure" value="1"/>
+    </inkml:brush>
+  </inkml:definitions>
+  <inkml:trace contextRef="#ctx0" brushRef="#br0">0 1,'9709'0,"-9677"0</inkml:trace>
+</inkml:ink>
+</file>
+
+<file path=word/ink/ink6.xml><?xml version="1.0" encoding="utf-8"?>
+<inkml:ink xmlns:inkml="http://www.w3.org/2003/InkML">
+  <inkml:definitions>
+    <inkml:context xml:id="ctx0">
+      <inkml:inkSource xml:id="inkSrc0">
+        <inkml:traceFormat>
+          <inkml:channel name="X" type="integer" min="-2.14748E9" max="2.14748E9" units="cm"/>
+          <inkml:channel name="Y" type="integer" min="-2.14748E9" max="2.14748E9" units="cm"/>
+        </inkml:traceFormat>
+        <inkml:channelProperties>
+          <inkml:channelProperty channel="X" name="resolution" value="1000" units="1/cm"/>
+          <inkml:channelProperty channel="Y" name="resolution" value="1000" units="1/cm"/>
+        </inkml:channelProperties>
+      </inkml:inkSource>
+      <inkml:timestamp xml:id="ts0" timeString="2025-05-28T14:37:51.336"/>
+    </inkml:context>
+    <inkml:brush xml:id="br0">
+      <inkml:brushProperty name="width" value="0.1" units="cm"/>
+      <inkml:brushProperty name="height" value="0.1" units="cm"/>
+      <inkml:brushProperty name="color" value="#33CCFF"/>
+      <inkml:brushProperty name="ignorePressure" value="1"/>
+    </inkml:brush>
+    <inkml:context xml:id="ctx1">
+      <inkml:inkSource xml:id="inkSrc1">
+        <inkml:traceFormat>
+          <inkml:channel name="X" type="integer" min="-2.14748E9" max="2.14748E9" units="cm"/>
+          <inkml:channel name="Y" type="integer" min="-2.14748E9" max="2.14748E9" units="cm"/>
+          <inkml:channel name="F" type="integer" max="32767" units="dev"/>
+        </inkml:traceFormat>
+        <inkml:channelProperties>
+          <inkml:channelProperty channel="X" name="resolution" value="1000" units="1/cm"/>
+          <inkml:channelProperty channel="Y" name="resolution" value="1000" units="1/cm"/>
+          <inkml:channelProperty channel="F" name="resolution" value="0" units="1/dev"/>
+        </inkml:channelProperties>
+      </inkml:inkSource>
+      <inkml:timestamp xml:id="ts1" timeString="2025-05-28T14:37:53.680"/>
+    </inkml:context>
+    <inkml:brush xml:id="br1">
+      <inkml:brushProperty name="width" value="0.1" units="cm"/>
+      <inkml:brushProperty name="height" value="0.1" units="cm"/>
+      <inkml:brushProperty name="color" value="#33CCFF"/>
+    </inkml:brush>
+  </inkml:definitions>
+  <inkml:trace contextRef="#ctx0" brushRef="#br0">159 1,'8247'0,"-8220"0</inkml:trace>
+  <inkml:trace contextRef="#ctx1" brushRef="#br1">54 7 24575,'-11'48'0,"1"-9"0,4 5 0,-7 53 0,-1 126 0,14-209-136,0-1-1,1 0 1,1-1-1,0 1 1,0 0-1,1 0 1,1-1-1,0 1 0,10 19 1,-5-15-6690</inkml:trace>
+  <inkml:trace contextRef="#ctx1" brushRef="#br1" timeOffset="2632.13">8441 60 24575,'-3'0'0,"0"1"0,1 0 0,-1-1 0,0 1 0,0 0 0,1 0 0,-1 0 0,1 1 0,-1-1 0,1 1 0,0-1 0,-1 1 0,-2 3 0,-32 34 0,15-16 0,-12 6 0,23-20 0,1 0 0,-1 0 0,2 1 0,-1 0 0,-13 21 0,14-18 0,1 1 0,0 1 0,1 0 0,1 0 0,0 0 0,1 1 0,1-1 0,-4 24 0,-11 45-1365,16-64-5461</inkml:trace>
+</inkml:ink>
+</file>
+
+<file path=word/ink/ink7.xml><?xml version="1.0" encoding="utf-8"?>
+<inkml:ink xmlns:inkml="http://www.w3.org/2003/InkML">
+  <inkml:definitions>
+    <inkml:context xml:id="ctx0">
+      <inkml:inkSource xml:id="inkSrc0">
+        <inkml:traceFormat>
+          <inkml:channel name="X" type="integer" min="-2.14748E9" max="2.14748E9" units="cm"/>
+          <inkml:channel name="Y" type="integer" min="-2.14748E9" max="2.14748E9" units="cm"/>
+        </inkml:traceFormat>
+        <inkml:channelProperties>
+          <inkml:channelProperty channel="X" name="resolution" value="1000" units="1/cm"/>
+          <inkml:channelProperty channel="Y" name="resolution" value="1000" units="1/cm"/>
+        </inkml:channelProperties>
+      </inkml:inkSource>
+      <inkml:timestamp xml:id="ts0" timeString="2025-05-28T14:37:45.244"/>
+    </inkml:context>
+    <inkml:brush xml:id="br0">
+      <inkml:brushProperty name="width" value="0.1" units="cm"/>
+      <inkml:brushProperty name="height" value="0.1" units="cm"/>
+      <inkml:brushProperty name="color" value="#33CCFF"/>
+      <inkml:brushProperty name="ignorePressure" value="1"/>
+    </inkml:brush>
+  </inkml:definitions>
+  <inkml:trace contextRef="#ctx0" brushRef="#br0">0 0,'7885'0,"-7853"0</inkml:trace>
+</inkml:ink>
+</file>
+
+<file path=word/ink/ink8.xml><?xml version="1.0" encoding="utf-8"?>
+<inkml:ink xmlns:inkml="http://www.w3.org/2003/InkML">
+  <inkml:definitions>
+    <inkml:context xml:id="ctx0">
+      <inkml:inkSource xml:id="inkSrc0">
+        <inkml:traceFormat>
+          <inkml:channel name="X" type="integer" min="-2.14748E9" max="2.14748E9" units="cm"/>
+          <inkml:channel name="Y" type="integer" min="-2.14748E9" max="2.14748E9" units="cm"/>
+          <inkml:channel name="F" type="integer" max="32767" units="dev"/>
+        </inkml:traceFormat>
+        <inkml:channelProperties>
+          <inkml:channelProperty channel="X" name="resolution" value="1000" units="1/cm"/>
+          <inkml:channelProperty channel="Y" name="resolution" value="1000" units="1/cm"/>
+          <inkml:channelProperty channel="F" name="resolution" value="0" units="1/dev"/>
+        </inkml:channelProperties>
+      </inkml:inkSource>
+      <inkml:timestamp xml:id="ts0" timeString="2025-05-28T14:37:30.180"/>
+    </inkml:context>
+    <inkml:brush xml:id="br0">
+      <inkml:brushProperty name="width" value="0.1" units="cm"/>
+      <inkml:brushProperty name="height" value="0.1" units="cm"/>
+      <inkml:brushProperty name="color" value="#33CCFF"/>
+    </inkml:brush>
+  </inkml:definitions>
+  <inkml:trace contextRef="#ctx0" brushRef="#br0">0 0 24575,'4'1'0,"0"-1"0,0 1 0,0 0 0,0 0 0,0 0 0,0 1 0,0 0 0,0 0 0,-1 0 0,1 0 0,-1 0 0,1 1 0,-1-1 0,0 1 0,4 4 0,42 53 0,-37-45 0,-4-5 0,0 1 0,-1 1 0,0-1 0,-1 1 0,0 0 0,6 18 0,-11-24 0,1 0 0,-1 0 0,0 1 0,0-1 0,-1 0 0,0 1 0,0-1 0,0 0 0,-1 0 0,0 0 0,0 1 0,-1-1 0,0 0 0,0 0 0,-5 10 0,0 0-124,-1 0 0,0 0 0,-1-1 0,-1 0 0,-1 0 0,0-1-1,-1-1 1,0 0 0,-1 0 0,-15 11 0,12-14-6702</inkml:trace>
+</inkml:ink>
+</file>
+
+<file path=word/ink/ink9.xml><?xml version="1.0" encoding="utf-8"?>
+<inkml:ink xmlns:inkml="http://www.w3.org/2003/InkML">
+  <inkml:definitions>
+    <inkml:context xml:id="ctx0">
+      <inkml:inkSource xml:id="inkSrc0">
+        <inkml:traceFormat>
+          <inkml:channel name="X" type="integer" min="-2.14748E9" max="2.14748E9" units="cm"/>
+          <inkml:channel name="Y" type="integer" min="-2.14748E9" max="2.14748E9" units="cm"/>
+        </inkml:traceFormat>
+        <inkml:channelProperties>
+          <inkml:channelProperty channel="X" name="resolution" value="1000" units="1/cm"/>
+          <inkml:channelProperty channel="Y" name="resolution" value="1000" units="1/cm"/>
+        </inkml:channelProperties>
+      </inkml:inkSource>
+      <inkml:timestamp xml:id="ts0" timeString="2025-05-28T14:37:24.990"/>
+    </inkml:context>
+    <inkml:brush xml:id="br0">
+      <inkml:brushProperty name="width" value="0.1" units="cm"/>
+      <inkml:brushProperty name="height" value="0.1" units="cm"/>
+      <inkml:brushProperty name="color" value="#33CCFF"/>
+      <inkml:brushProperty name="ignorePressure" value="1"/>
+    </inkml:brush>
+  </inkml:definitions>
+  <inkml:trace contextRef="#ctx0" brushRef="#br0">0 0,'0'0,"5"0,1 0,0 0,-2 0,0 0,-2 0,-1 0,-1 0,5 0,0 0,1 0</inkml:trace>
+  <inkml:trace contextRef="#ctx0" brushRef="#br0" timeOffset="1036.39">53 0,'21'0,"-29"0,-35 0,32 0</inkml:trace>
+  <inkml:trace contextRef="#ctx0" brushRef="#br0" timeOffset="1966.38">0 0,'0'0</inkml:trace>
+</inkml:ink>
+</file>
+
 <file path=word/theme/theme1.xml><?xml version="1.0" encoding="utf-8"?>
 <a:theme xmlns:a="http://schemas.openxmlformats.org/drawingml/2006/main" name="Office Theme">
   <a:themeElements>

</xml_diff>

<commit_message>
improved rich text editor self made
</commit_message>
<xml_diff>
--- a/Notes-Blog_React.docx
+++ b/Notes-Blog_React.docx
@@ -28,13 +28,8 @@
       </w:r>
     </w:p>
     <w:p>
-      <w:proofErr w:type="gramStart"/>
-      <w:r>
-        <w:t>Position :</w:t>
-      </w:r>
-      <w:proofErr w:type="gramEnd"/>
-      <w:r>
-        <w:t xml:space="preserve"> sticky,</w:t>
+      <w:r>
+        <w:t>Position : sticky,</w:t>
       </w:r>
     </w:p>
     <w:p>
@@ -63,27 +58,7 @@
           <w:highlight w:val="yellow"/>
           <w:lang w:val="en-IN"/>
         </w:rPr>
-        <w:t xml:space="preserve">Steps To Implement Radio Button </w:t>
-      </w:r>
-      <w:proofErr w:type="gramStart"/>
-      <w:r>
-        <w:rPr>
-          <w:b/>
-          <w:bCs/>
-          <w:highlight w:val="yellow"/>
-          <w:lang w:val="en-IN"/>
-        </w:rPr>
-        <w:t>In</w:t>
-      </w:r>
-      <w:proofErr w:type="gramEnd"/>
-      <w:r>
-        <w:rPr>
-          <w:b/>
-          <w:bCs/>
-          <w:highlight w:val="yellow"/>
-          <w:lang w:val="en-IN"/>
-        </w:rPr>
-        <w:t xml:space="preserve"> React</w:t>
+        <w:t>Steps To Implement Radio Button In React</w:t>
       </w:r>
     </w:p>
     <w:p>
@@ -326,40 +301,18 @@
         <w:t xml:space="preserve"> = </w:t>
       </w:r>
       <w:proofErr w:type="spellStart"/>
-      <w:proofErr w:type="gramStart"/>
-      <w:r>
-        <w:rPr>
-          <w:lang w:val="en-IN"/>
-        </w:rPr>
-        <w:t>e.target</w:t>
-      </w:r>
-      <w:proofErr w:type="gramEnd"/>
-      <w:r>
-        <w:rPr>
-          <w:lang w:val="en-IN"/>
-        </w:rPr>
-        <w:t>.</w:t>
-      </w:r>
-      <w:proofErr w:type="gramStart"/>
-      <w:r>
-        <w:rPr>
-          <w:lang w:val="en-IN"/>
-        </w:rPr>
-        <w:t>getBoundingClientRect</w:t>
+      <w:r>
+        <w:rPr>
+          <w:lang w:val="en-IN"/>
+        </w:rPr>
+        <w:t>e.target.getBoundingClientRect</w:t>
       </w:r>
       <w:proofErr w:type="spellEnd"/>
       <w:r>
         <w:rPr>
           <w:lang w:val="en-IN"/>
         </w:rPr>
-        <w:t>(</w:t>
-      </w:r>
-      <w:proofErr w:type="gramEnd"/>
-      <w:r>
-        <w:rPr>
-          <w:lang w:val="en-IN"/>
-        </w:rPr>
-        <w:t>); // gets size and position of the hovered link</w:t>
+        <w:t>(); // gets size and position of the hovered link</w:t>
       </w:r>
     </w:p>
     <w:p>
@@ -403,7 +356,6 @@
         <w:t xml:space="preserve"> = </w:t>
       </w:r>
       <w:proofErr w:type="spellStart"/>
-      <w:proofErr w:type="gramStart"/>
       <w:r>
         <w:rPr>
           <w:lang w:val="en-IN"/>
@@ -411,7 +363,6 @@
         <w:t>containerRef.current.getBoundingClientRect</w:t>
       </w:r>
       <w:proofErr w:type="spellEnd"/>
-      <w:proofErr w:type="gramEnd"/>
       <w:r>
         <w:rPr>
           <w:lang w:val="en-IN"/>
@@ -432,19 +383,11 @@
         <w:t xml:space="preserve">  </w:t>
       </w:r>
       <w:proofErr w:type="spellStart"/>
-      <w:proofErr w:type="gramStart"/>
-      <w:r>
-        <w:rPr>
-          <w:lang w:val="en-IN"/>
-        </w:rPr>
-        <w:t>underline.style</w:t>
-      </w:r>
-      <w:proofErr w:type="gramEnd"/>
-      <w:r>
-        <w:rPr>
-          <w:lang w:val="en-IN"/>
-        </w:rPr>
-        <w:t>.width</w:t>
+      <w:r>
+        <w:rPr>
+          <w:lang w:val="en-IN"/>
+        </w:rPr>
+        <w:t>underline.style.width</w:t>
       </w:r>
       <w:proofErr w:type="spellEnd"/>
       <w:r>
@@ -454,7 +397,6 @@
         <w:t xml:space="preserve"> = `${</w:t>
       </w:r>
       <w:proofErr w:type="spellStart"/>
-      <w:proofErr w:type="gramStart"/>
       <w:r>
         <w:rPr>
           <w:lang w:val="en-IN"/>
@@ -476,7 +418,6 @@
         <w:t>px</w:t>
       </w:r>
       <w:proofErr w:type="spellEnd"/>
-      <w:proofErr w:type="gramEnd"/>
       <w:r>
         <w:rPr>
           <w:lang w:val="en-IN"/>
@@ -497,19 +438,11 @@
         <w:t xml:space="preserve">  </w:t>
       </w:r>
       <w:proofErr w:type="spellStart"/>
-      <w:proofErr w:type="gramStart"/>
-      <w:r>
-        <w:rPr>
-          <w:lang w:val="en-IN"/>
-        </w:rPr>
-        <w:t>underline.style</w:t>
-      </w:r>
-      <w:proofErr w:type="gramEnd"/>
-      <w:r>
-        <w:rPr>
-          <w:lang w:val="en-IN"/>
-        </w:rPr>
-        <w:t>.left</w:t>
+      <w:r>
+        <w:rPr>
+          <w:lang w:val="en-IN"/>
+        </w:rPr>
+        <w:t>underline.style.left</w:t>
       </w:r>
       <w:proofErr w:type="spellEnd"/>
       <w:r>
@@ -533,7 +466,6 @@
         <w:t xml:space="preserve"> - </w:t>
       </w:r>
       <w:proofErr w:type="spellStart"/>
-      <w:proofErr w:type="gramStart"/>
       <w:r>
         <w:rPr>
           <w:lang w:val="en-IN"/>
@@ -555,7 +487,6 @@
         <w:t>px</w:t>
       </w:r>
       <w:proofErr w:type="spellEnd"/>
-      <w:proofErr w:type="gramEnd"/>
       <w:r>
         <w:rPr>
           <w:lang w:val="en-IN"/>
@@ -996,26 +927,9 @@
           <w:sz w:val="32"/>
           <w:szCs w:val="32"/>
         </w:rPr>
-        <w:t xml:space="preserve">Const </w:t>
-      </w:r>
-      <w:proofErr w:type="gramStart"/>
-      <w:r>
-        <w:rPr>
-          <w:sz w:val="32"/>
-          <w:szCs w:val="32"/>
-        </w:rPr>
-        <w:t>{ bears</w:t>
-      </w:r>
-      <w:proofErr w:type="gramEnd"/>
-      <w:r>
-        <w:rPr>
-          <w:sz w:val="32"/>
-          <w:szCs w:val="32"/>
-        </w:rPr>
-        <w:t xml:space="preserve">, </w:t>
+        <w:t xml:space="preserve">Const { bears, </w:t>
       </w:r>
       <w:proofErr w:type="spellStart"/>
-      <w:proofErr w:type="gramStart"/>
       <w:r>
         <w:rPr>
           <w:sz w:val="32"/>
@@ -1029,18 +943,9 @@
           <w:sz w:val="32"/>
           <w:szCs w:val="32"/>
         </w:rPr>
-        <w:t xml:space="preserve"> }</w:t>
-      </w:r>
-      <w:proofErr w:type="gramEnd"/>
-      <w:r>
-        <w:rPr>
-          <w:sz w:val="32"/>
-          <w:szCs w:val="32"/>
-        </w:rPr>
-        <w:t xml:space="preserve"> = </w:t>
+        <w:t xml:space="preserve"> } = </w:t>
       </w:r>
       <w:proofErr w:type="spellStart"/>
-      <w:proofErr w:type="gramStart"/>
       <w:r>
         <w:rPr>
           <w:sz w:val="32"/>
@@ -1054,15 +959,7 @@
           <w:sz w:val="32"/>
           <w:szCs w:val="32"/>
         </w:rPr>
-        <w:t>(</w:t>
-      </w:r>
-      <w:proofErr w:type="gramEnd"/>
-      <w:r>
-        <w:rPr>
-          <w:sz w:val="32"/>
-          <w:szCs w:val="32"/>
-        </w:rPr>
-        <w:t>)</w:t>
+        <w:t>()</w:t>
       </w:r>
     </w:p>
     <w:p>
@@ -2140,6 +2037,7 @@
         <w:rPr>
           <w:b/>
           <w:bCs/>
+          <w:noProof/>
           <w:sz w:val="32"/>
           <w:szCs w:val="32"/>
         </w:rPr>
@@ -2253,6 +2151,7 @@
         <w:rPr>
           <w:b/>
           <w:bCs/>
+          <w:noProof/>
           <w:sz w:val="32"/>
           <w:szCs w:val="32"/>
         </w:rPr>
@@ -2293,6 +2192,240 @@
         </w:drawing>
       </w:r>
     </w:p>
+    <w:p>
+      <w:pPr>
+        <w:rPr>
+          <w:b/>
+          <w:bCs/>
+          <w:sz w:val="32"/>
+          <w:szCs w:val="32"/>
+        </w:rPr>
+      </w:pPr>
+    </w:p>
+    <w:p>
+      <w:pPr>
+        <w:rPr>
+          <w:b/>
+          <w:bCs/>
+          <w:sz w:val="32"/>
+          <w:szCs w:val="32"/>
+        </w:rPr>
+      </w:pPr>
+    </w:p>
+    <w:p>
+      <w:pPr>
+        <w:rPr>
+          <w:b/>
+          <w:bCs/>
+          <w:sz w:val="32"/>
+          <w:szCs w:val="32"/>
+        </w:rPr>
+      </w:pPr>
+      <w:r>
+        <w:rPr>
+          <w:b/>
+          <w:bCs/>
+          <w:sz w:val="32"/>
+          <w:szCs w:val="32"/>
+          <w:highlight w:val="yellow"/>
+        </w:rPr>
+        <w:t xml:space="preserve">for (variable of </w:t>
+      </w:r>
+      <w:proofErr w:type="spellStart"/>
+      <w:r>
+        <w:rPr>
+          <w:b/>
+          <w:bCs/>
+          <w:sz w:val="32"/>
+          <w:szCs w:val="32"/>
+          <w:highlight w:val="yellow"/>
+        </w:rPr>
+        <w:t>iterable</w:t>
+      </w:r>
+      <w:proofErr w:type="spellEnd"/>
+      <w:r>
+        <w:rPr>
+          <w:b/>
+          <w:bCs/>
+          <w:sz w:val="32"/>
+          <w:szCs w:val="32"/>
+          <w:highlight w:val="yellow"/>
+        </w:rPr>
+        <w:t>) {</w:t>
+      </w:r>
+      <w:r>
+        <w:rPr>
+          <w:b/>
+          <w:bCs/>
+          <w:sz w:val="32"/>
+          <w:szCs w:val="32"/>
+          <w:highlight w:val="yellow"/>
+        </w:rPr>
+        <w:br/>
+        <w:t xml:space="preserve">  </w:t>
+      </w:r>
+      <w:r>
+        <w:rPr>
+          <w:b/>
+          <w:bCs/>
+          <w:i/>
+          <w:iCs/>
+          <w:sz w:val="32"/>
+          <w:szCs w:val="32"/>
+          <w:highlight w:val="yellow"/>
+        </w:rPr>
+        <w:t>// code block to be executed</w:t>
+      </w:r>
+      <w:r>
+        <w:rPr>
+          <w:b/>
+          <w:bCs/>
+          <w:sz w:val="32"/>
+          <w:szCs w:val="32"/>
+          <w:highlight w:val="yellow"/>
+        </w:rPr>
+        <w:br/>
+        <w:t>}</w:t>
+      </w:r>
+    </w:p>
+    <w:p>
+      <w:pPr>
+        <w:rPr>
+          <w:b/>
+          <w:bCs/>
+          <w:sz w:val="32"/>
+          <w:szCs w:val="32"/>
+        </w:rPr>
+      </w:pPr>
+    </w:p>
+    <w:p>
+      <w:pPr>
+        <w:numPr>
+          <w:ilvl w:val="0"/>
+          <w:numId w:val="2"/>
+        </w:numPr>
+        <w:rPr>
+          <w:b/>
+          <w:bCs/>
+          <w:sz w:val="32"/>
+          <w:szCs w:val="32"/>
+          <w:highlight w:val="red"/>
+          <w:lang w:val="en-IN"/>
+        </w:rPr>
+      </w:pPr>
+      <w:r>
+        <w:rPr>
+          <w:b/>
+          <w:bCs/>
+          <w:sz w:val="32"/>
+          <w:szCs w:val="32"/>
+          <w:highlight w:val="red"/>
+          <w:lang w:val="en-IN"/>
+        </w:rPr>
+        <w:t>&lt;a&gt;: The anchor tag is used to define a hyperlink.</w:t>
+      </w:r>
+    </w:p>
+    <w:p>
+      <w:pPr>
+        <w:numPr>
+          <w:ilvl w:val="0"/>
+          <w:numId w:val="3"/>
+        </w:numPr>
+        <w:rPr>
+          <w:b/>
+          <w:bCs/>
+          <w:sz w:val="32"/>
+          <w:szCs w:val="32"/>
+          <w:highlight w:val="red"/>
+          <w:lang w:val="en-IN"/>
+        </w:rPr>
+      </w:pPr>
+      <w:proofErr w:type="spellStart"/>
+      <w:r>
+        <w:rPr>
+          <w:b/>
+          <w:bCs/>
+          <w:sz w:val="32"/>
+          <w:szCs w:val="32"/>
+          <w:highlight w:val="red"/>
+          <w:lang w:val="en-IN"/>
+        </w:rPr>
+        <w:t>href</w:t>
+      </w:r>
+      <w:proofErr w:type="spellEnd"/>
+      <w:r>
+        <w:rPr>
+          <w:b/>
+          <w:bCs/>
+          <w:sz w:val="32"/>
+          <w:szCs w:val="32"/>
+          <w:highlight w:val="red"/>
+          <w:lang w:val="en-IN"/>
+        </w:rPr>
+        <w:t>="#section1": The </w:t>
+      </w:r>
+      <w:proofErr w:type="spellStart"/>
+      <w:r>
+        <w:rPr>
+          <w:b/>
+          <w:bCs/>
+          <w:sz w:val="32"/>
+          <w:szCs w:val="32"/>
+          <w:highlight w:val="red"/>
+          <w:lang w:val="en-IN"/>
+        </w:rPr>
+        <w:t>href</w:t>
+      </w:r>
+      <w:proofErr w:type="spellEnd"/>
+      <w:r>
+        <w:rPr>
+          <w:b/>
+          <w:bCs/>
+          <w:sz w:val="32"/>
+          <w:szCs w:val="32"/>
+          <w:highlight w:val="red"/>
+          <w:lang w:val="en-IN"/>
+        </w:rPr>
+        <w:t> attribute specifies the target of the link. In this case, it points to a section id="section1" on the same page.</w:t>
+      </w:r>
+    </w:p>
+    <w:p>
+      <w:pPr>
+        <w:numPr>
+          <w:ilvl w:val="0"/>
+          <w:numId w:val="4"/>
+        </w:numPr>
+        <w:rPr>
+          <w:b/>
+          <w:bCs/>
+          <w:sz w:val="32"/>
+          <w:szCs w:val="32"/>
+          <w:highlight w:val="red"/>
+          <w:lang w:val="en-IN"/>
+        </w:rPr>
+      </w:pPr>
+      <w:r>
+        <w:rPr>
+          <w:b/>
+          <w:bCs/>
+          <w:sz w:val="32"/>
+          <w:szCs w:val="32"/>
+          <w:highlight w:val="red"/>
+          <w:lang w:val="en-IN"/>
+        </w:rPr>
+        <w:t>Section 1: The clickable text that appears for the user. When clicked, it will scroll to the section with id="section1".</w:t>
+      </w:r>
+    </w:p>
+    <w:p>
+      <w:pPr>
+        <w:rPr>
+          <w:b/>
+          <w:bCs/>
+          <w:sz w:val="32"/>
+          <w:szCs w:val="32"/>
+        </w:rPr>
+      </w:pPr>
+    </w:p>
     <w:sectPr>
       <w:pgSz w:w="12240" w:h="15840"/>
       <w:pgMar w:top="1440" w:right="1440" w:bottom="1440" w:left="1440" w:header="708" w:footer="708" w:gutter="0"/>
@@ -2306,6 +2439,155 @@
 <file path=word/numbering.xml><?xml version="1.0" encoding="utf-8"?>
 <w:numbering xmlns:wpc="http://schemas.microsoft.com/office/word/2010/wordprocessingCanvas" xmlns:cx="http://schemas.microsoft.com/office/drawing/2014/chartex" xmlns:cx1="http://schemas.microsoft.com/office/drawing/2015/9/8/chartex" xmlns:cx2="http://schemas.microsoft.com/office/drawing/2015/10/21/chartex" xmlns:cx3="http://schemas.microsoft.com/office/drawing/2016/5/9/chartex" xmlns:cx4="http://schemas.microsoft.com/office/drawing/2016/5/10/chartex" xmlns:cx5="http://schemas.microsoft.com/office/drawing/2016/5/11/chartex" xmlns:cx6="http://schemas.microsoft.com/office/drawing/2016/5/12/chartex" xmlns:cx7="http://schemas.microsoft.com/office/drawing/2016/5/13/chartex" xmlns:cx8="http://schemas.microsoft.com/office/drawing/2016/5/14/chartex" xmlns:mc="http://schemas.openxmlformats.org/markup-compatibility/2006" xmlns:aink="http://schemas.microsoft.com/office/drawing/2016/ink" xmlns:am3d="http://schemas.microsoft.com/office/drawing/2017/model3d" xmlns:o="urn:schemas-microsoft-com:office:office" xmlns:oel="http://schemas.microsoft.com/office/2019/extlst" xmlns:r="http://schemas.openxmlformats.org/officeDocument/2006/relationships" xmlns:m="http://schemas.openxmlformats.org/officeDocument/2006/math" xmlns:v="urn:schemas-microsoft-com:vml" xmlns:wp14="http://schemas.microsoft.com/office/word/2010/wordprocessingDrawing" xmlns:wp="http://schemas.openxmlformats.org/drawingml/2006/wordprocessingDrawing" xmlns:w10="urn:schemas-microsoft-com:office:word" xmlns:w="http://schemas.openxmlformats.org/wordprocessingml/2006/main" xmlns:w14="http://schemas.microsoft.com/office/word/2010/wordml" xmlns:w15="http://schemas.microsoft.com/office/word/2012/wordml" xmlns:w16cex="http://schemas.microsoft.com/office/word/2018/wordml/cex" xmlns:w16cid="http://schemas.microsoft.com/office/word/2016/wordml/cid" xmlns:w16="http://schemas.microsoft.com/office/word/2018/wordml" xmlns:w16du="http://schemas.microsoft.com/office/word/2023/wordml/word16du" xmlns:w16sdtdh="http://schemas.microsoft.com/office/word/2020/wordml/sdtdatahash" xmlns:w16sdtfl="http://schemas.microsoft.com/office/word/2024/wordml/sdtformatlock" xmlns:w16se="http://schemas.microsoft.com/office/word/2015/wordml/symex" xmlns:wpg="http://schemas.microsoft.com/office/word/2010/wordprocessingGroup" xmlns:wpi="http://schemas.microsoft.com/office/word/2010/wordprocessingInk" xmlns:wne="http://schemas.microsoft.com/office/word/2006/wordml" xmlns:wps="http://schemas.microsoft.com/office/word/2010/wordprocessingShape" mc:Ignorable="w14 w15 w16se w16cid w16 w16cex w16sdtdh w16sdtfl w16du wp14">
   <w:abstractNum w:abstractNumId="0" w15:restartNumberingAfterBreak="0">
+    <w:nsid w:val="6B310718"/>
+    <w:multiLevelType w:val="multilevel"/>
+    <w:tmpl w:val="AB126946"/>
+    <w:lvl w:ilvl="0">
+      <w:start w:val="1"/>
+      <w:numFmt w:val="bullet"/>
+      <w:lvlText w:val=""/>
+      <w:lvlJc w:val="left"/>
+      <w:pPr>
+        <w:tabs>
+          <w:tab w:val="num" w:pos="720"/>
+        </w:tabs>
+        <w:ind w:left="720" w:hanging="360"/>
+      </w:pPr>
+      <w:rPr>
+        <w:rFonts w:ascii="Symbol" w:hAnsi="Symbol" w:hint="default"/>
+        <w:sz w:val="20"/>
+      </w:rPr>
+    </w:lvl>
+    <w:lvl w:ilvl="1" w:tentative="1">
+      <w:start w:val="1"/>
+      <w:numFmt w:val="bullet"/>
+      <w:lvlText w:val=""/>
+      <w:lvlJc w:val="left"/>
+      <w:pPr>
+        <w:tabs>
+          <w:tab w:val="num" w:pos="1440"/>
+        </w:tabs>
+        <w:ind w:left="1440" w:hanging="360"/>
+      </w:pPr>
+      <w:rPr>
+        <w:rFonts w:ascii="Symbol" w:hAnsi="Symbol" w:hint="default"/>
+        <w:sz w:val="20"/>
+      </w:rPr>
+    </w:lvl>
+    <w:lvl w:ilvl="2" w:tentative="1">
+      <w:start w:val="1"/>
+      <w:numFmt w:val="bullet"/>
+      <w:lvlText w:val=""/>
+      <w:lvlJc w:val="left"/>
+      <w:pPr>
+        <w:tabs>
+          <w:tab w:val="num" w:pos="2160"/>
+        </w:tabs>
+        <w:ind w:left="2160" w:hanging="360"/>
+      </w:pPr>
+      <w:rPr>
+        <w:rFonts w:ascii="Symbol" w:hAnsi="Symbol" w:hint="default"/>
+        <w:sz w:val="20"/>
+      </w:rPr>
+    </w:lvl>
+    <w:lvl w:ilvl="3" w:tentative="1">
+      <w:start w:val="1"/>
+      <w:numFmt w:val="bullet"/>
+      <w:lvlText w:val=""/>
+      <w:lvlJc w:val="left"/>
+      <w:pPr>
+        <w:tabs>
+          <w:tab w:val="num" w:pos="2880"/>
+        </w:tabs>
+        <w:ind w:left="2880" w:hanging="360"/>
+      </w:pPr>
+      <w:rPr>
+        <w:rFonts w:ascii="Symbol" w:hAnsi="Symbol" w:hint="default"/>
+        <w:sz w:val="20"/>
+      </w:rPr>
+    </w:lvl>
+    <w:lvl w:ilvl="4" w:tentative="1">
+      <w:start w:val="1"/>
+      <w:numFmt w:val="bullet"/>
+      <w:lvlText w:val=""/>
+      <w:lvlJc w:val="left"/>
+      <w:pPr>
+        <w:tabs>
+          <w:tab w:val="num" w:pos="3600"/>
+        </w:tabs>
+        <w:ind w:left="3600" w:hanging="360"/>
+      </w:pPr>
+      <w:rPr>
+        <w:rFonts w:ascii="Symbol" w:hAnsi="Symbol" w:hint="default"/>
+        <w:sz w:val="20"/>
+      </w:rPr>
+    </w:lvl>
+    <w:lvl w:ilvl="5" w:tentative="1">
+      <w:start w:val="1"/>
+      <w:numFmt w:val="bullet"/>
+      <w:lvlText w:val=""/>
+      <w:lvlJc w:val="left"/>
+      <w:pPr>
+        <w:tabs>
+          <w:tab w:val="num" w:pos="4320"/>
+        </w:tabs>
+        <w:ind w:left="4320" w:hanging="360"/>
+      </w:pPr>
+      <w:rPr>
+        <w:rFonts w:ascii="Symbol" w:hAnsi="Symbol" w:hint="default"/>
+        <w:sz w:val="20"/>
+      </w:rPr>
+    </w:lvl>
+    <w:lvl w:ilvl="6" w:tentative="1">
+      <w:start w:val="1"/>
+      <w:numFmt w:val="bullet"/>
+      <w:lvlText w:val=""/>
+      <w:lvlJc w:val="left"/>
+      <w:pPr>
+        <w:tabs>
+          <w:tab w:val="num" w:pos="5040"/>
+        </w:tabs>
+        <w:ind w:left="5040" w:hanging="360"/>
+      </w:pPr>
+      <w:rPr>
+        <w:rFonts w:ascii="Symbol" w:hAnsi="Symbol" w:hint="default"/>
+        <w:sz w:val="20"/>
+      </w:rPr>
+    </w:lvl>
+    <w:lvl w:ilvl="7" w:tentative="1">
+      <w:start w:val="1"/>
+      <w:numFmt w:val="bullet"/>
+      <w:lvlText w:val=""/>
+      <w:lvlJc w:val="left"/>
+      <w:pPr>
+        <w:tabs>
+          <w:tab w:val="num" w:pos="5760"/>
+        </w:tabs>
+        <w:ind w:left="5760" w:hanging="360"/>
+      </w:pPr>
+      <w:rPr>
+        <w:rFonts w:ascii="Symbol" w:hAnsi="Symbol" w:hint="default"/>
+        <w:sz w:val="20"/>
+      </w:rPr>
+    </w:lvl>
+    <w:lvl w:ilvl="8" w:tentative="1">
+      <w:start w:val="1"/>
+      <w:numFmt w:val="bullet"/>
+      <w:lvlText w:val=""/>
+      <w:lvlJc w:val="left"/>
+      <w:pPr>
+        <w:tabs>
+          <w:tab w:val="num" w:pos="6480"/>
+        </w:tabs>
+        <w:ind w:left="6480" w:hanging="360"/>
+      </w:pPr>
+      <w:rPr>
+        <w:rFonts w:ascii="Symbol" w:hAnsi="Symbol" w:hint="default"/>
+        <w:sz w:val="20"/>
+      </w:rPr>
+    </w:lvl>
+  </w:abstractNum>
+  <w:abstractNum w:abstractNumId="1" w15:restartNumberingAfterBreak="0">
     <w:nsid w:val="6D9F485E"/>
     <w:multiLevelType w:val="multilevel"/>
     <w:tmpl w:val="DE529542"/>
@@ -2455,7 +2737,25 @@
     </w:lvl>
   </w:abstractNum>
   <w:num w:numId="1" w16cid:durableId="1178927217">
+    <w:abstractNumId w:val="1"/>
+  </w:num>
+  <w:num w:numId="2" w16cid:durableId="1744840311">
     <w:abstractNumId w:val="0"/>
+    <w:lvlOverride w:ilvl="0">
+      <w:startOverride w:val="1"/>
+    </w:lvlOverride>
+  </w:num>
+  <w:num w:numId="3" w16cid:durableId="2074043595">
+    <w:abstractNumId w:val="0"/>
+    <w:lvlOverride w:ilvl="0">
+      <w:startOverride w:val="2"/>
+    </w:lvlOverride>
+  </w:num>
+  <w:num w:numId="4" w16cid:durableId="1511602920">
+    <w:abstractNumId w:val="0"/>
+    <w:lvlOverride w:ilvl="0">
+      <w:startOverride w:val="3"/>
+    </w:lvlOverride>
   </w:num>
 </w:numbering>
 </file>
@@ -3062,7 +3362,6 @@
   <w:style w:type="character" w:default="1" w:styleId="DefaultParagraphFont">
     <w:name w:val="Default Paragraph Font"/>
     <w:uiPriority w:val="1"/>
-    <w:semiHidden/>
     <w:unhideWhenUsed/>
   </w:style>
   <w:style w:type="table" w:default="1" w:styleId="TableNormal">

</xml_diff>

<commit_message>
Added creation of new submajor
</commit_message>
<xml_diff>
--- a/Notes-Blog_React.docx
+++ b/Notes-Blog_React.docx
@@ -28,8 +28,13 @@
       </w:r>
     </w:p>
     <w:p>
-      <w:r>
-        <w:t>Position : sticky,</w:t>
+      <w:proofErr w:type="gramStart"/>
+      <w:r>
+        <w:t>Position :</w:t>
+      </w:r>
+      <w:proofErr w:type="gramEnd"/>
+      <w:r>
+        <w:t xml:space="preserve"> sticky,</w:t>
       </w:r>
     </w:p>
     <w:p>
@@ -58,7 +63,27 @@
           <w:highlight w:val="yellow"/>
           <w:lang w:val="en-IN"/>
         </w:rPr>
-        <w:t>Steps To Implement Radio Button In React</w:t>
+        <w:t xml:space="preserve">Steps To Implement Radio Button </w:t>
+      </w:r>
+      <w:proofErr w:type="gramStart"/>
+      <w:r>
+        <w:rPr>
+          <w:b/>
+          <w:bCs/>
+          <w:highlight w:val="yellow"/>
+          <w:lang w:val="en-IN"/>
+        </w:rPr>
+        <w:t>In</w:t>
+      </w:r>
+      <w:proofErr w:type="gramEnd"/>
+      <w:r>
+        <w:rPr>
+          <w:b/>
+          <w:bCs/>
+          <w:highlight w:val="yellow"/>
+          <w:lang w:val="en-IN"/>
+        </w:rPr>
+        <w:t xml:space="preserve"> React</w:t>
       </w:r>
     </w:p>
     <w:p>
@@ -301,18 +326,40 @@
         <w:t xml:space="preserve"> = </w:t>
       </w:r>
       <w:proofErr w:type="spellStart"/>
-      <w:r>
-        <w:rPr>
-          <w:lang w:val="en-IN"/>
-        </w:rPr>
-        <w:t>e.target.getBoundingClientRect</w:t>
+      <w:proofErr w:type="gramStart"/>
+      <w:r>
+        <w:rPr>
+          <w:lang w:val="en-IN"/>
+        </w:rPr>
+        <w:t>e.target</w:t>
+      </w:r>
+      <w:proofErr w:type="gramEnd"/>
+      <w:r>
+        <w:rPr>
+          <w:lang w:val="en-IN"/>
+        </w:rPr>
+        <w:t>.</w:t>
+      </w:r>
+      <w:proofErr w:type="gramStart"/>
+      <w:r>
+        <w:rPr>
+          <w:lang w:val="en-IN"/>
+        </w:rPr>
+        <w:t>getBoundingClientRect</w:t>
       </w:r>
       <w:proofErr w:type="spellEnd"/>
       <w:r>
         <w:rPr>
           <w:lang w:val="en-IN"/>
         </w:rPr>
-        <w:t>(); // gets size and position of the hovered link</w:t>
+        <w:t>(</w:t>
+      </w:r>
+      <w:proofErr w:type="gramEnd"/>
+      <w:r>
+        <w:rPr>
+          <w:lang w:val="en-IN"/>
+        </w:rPr>
+        <w:t>); // gets size and position of the hovered link</w:t>
       </w:r>
     </w:p>
     <w:p>
@@ -356,6 +403,7 @@
         <w:t xml:space="preserve"> = </w:t>
       </w:r>
       <w:proofErr w:type="spellStart"/>
+      <w:proofErr w:type="gramStart"/>
       <w:r>
         <w:rPr>
           <w:lang w:val="en-IN"/>
@@ -363,6 +411,7 @@
         <w:t>containerRef.current.getBoundingClientRect</w:t>
       </w:r>
       <w:proofErr w:type="spellEnd"/>
+      <w:proofErr w:type="gramEnd"/>
       <w:r>
         <w:rPr>
           <w:lang w:val="en-IN"/>
@@ -383,11 +432,19 @@
         <w:t xml:space="preserve">  </w:t>
       </w:r>
       <w:proofErr w:type="spellStart"/>
-      <w:r>
-        <w:rPr>
-          <w:lang w:val="en-IN"/>
-        </w:rPr>
-        <w:t>underline.style.width</w:t>
+      <w:proofErr w:type="gramStart"/>
+      <w:r>
+        <w:rPr>
+          <w:lang w:val="en-IN"/>
+        </w:rPr>
+        <w:t>underline.style</w:t>
+      </w:r>
+      <w:proofErr w:type="gramEnd"/>
+      <w:r>
+        <w:rPr>
+          <w:lang w:val="en-IN"/>
+        </w:rPr>
+        <w:t>.width</w:t>
       </w:r>
       <w:proofErr w:type="spellEnd"/>
       <w:r>
@@ -397,6 +454,7 @@
         <w:t xml:space="preserve"> = `${</w:t>
       </w:r>
       <w:proofErr w:type="spellStart"/>
+      <w:proofErr w:type="gramStart"/>
       <w:r>
         <w:rPr>
           <w:lang w:val="en-IN"/>
@@ -418,6 +476,7 @@
         <w:t>px</w:t>
       </w:r>
       <w:proofErr w:type="spellEnd"/>
+      <w:proofErr w:type="gramEnd"/>
       <w:r>
         <w:rPr>
           <w:lang w:val="en-IN"/>
@@ -438,11 +497,19 @@
         <w:t xml:space="preserve">  </w:t>
       </w:r>
       <w:proofErr w:type="spellStart"/>
-      <w:r>
-        <w:rPr>
-          <w:lang w:val="en-IN"/>
-        </w:rPr>
-        <w:t>underline.style.left</w:t>
+      <w:proofErr w:type="gramStart"/>
+      <w:r>
+        <w:rPr>
+          <w:lang w:val="en-IN"/>
+        </w:rPr>
+        <w:t>underline.style</w:t>
+      </w:r>
+      <w:proofErr w:type="gramEnd"/>
+      <w:r>
+        <w:rPr>
+          <w:lang w:val="en-IN"/>
+        </w:rPr>
+        <w:t>.left</w:t>
       </w:r>
       <w:proofErr w:type="spellEnd"/>
       <w:r>
@@ -466,6 +533,7 @@
         <w:t xml:space="preserve"> - </w:t>
       </w:r>
       <w:proofErr w:type="spellStart"/>
+      <w:proofErr w:type="gramStart"/>
       <w:r>
         <w:rPr>
           <w:lang w:val="en-IN"/>
@@ -487,6 +555,7 @@
         <w:t>px</w:t>
       </w:r>
       <w:proofErr w:type="spellEnd"/>
+      <w:proofErr w:type="gramEnd"/>
       <w:r>
         <w:rPr>
           <w:lang w:val="en-IN"/>
@@ -927,9 +996,26 @@
           <w:sz w:val="32"/>
           <w:szCs w:val="32"/>
         </w:rPr>
-        <w:t xml:space="preserve">Const { bears, </w:t>
+        <w:t xml:space="preserve">Const </w:t>
+      </w:r>
+      <w:proofErr w:type="gramStart"/>
+      <w:r>
+        <w:rPr>
+          <w:sz w:val="32"/>
+          <w:szCs w:val="32"/>
+        </w:rPr>
+        <w:t>{ bears</w:t>
+      </w:r>
+      <w:proofErr w:type="gramEnd"/>
+      <w:r>
+        <w:rPr>
+          <w:sz w:val="32"/>
+          <w:szCs w:val="32"/>
+        </w:rPr>
+        <w:t xml:space="preserve">, </w:t>
       </w:r>
       <w:proofErr w:type="spellStart"/>
+      <w:proofErr w:type="gramStart"/>
       <w:r>
         <w:rPr>
           <w:sz w:val="32"/>
@@ -943,9 +1029,18 @@
           <w:sz w:val="32"/>
           <w:szCs w:val="32"/>
         </w:rPr>
-        <w:t xml:space="preserve"> } = </w:t>
+        <w:t xml:space="preserve"> }</w:t>
+      </w:r>
+      <w:proofErr w:type="gramEnd"/>
+      <w:r>
+        <w:rPr>
+          <w:sz w:val="32"/>
+          <w:szCs w:val="32"/>
+        </w:rPr>
+        <w:t xml:space="preserve"> = </w:t>
       </w:r>
       <w:proofErr w:type="spellStart"/>
+      <w:proofErr w:type="gramStart"/>
       <w:r>
         <w:rPr>
           <w:sz w:val="32"/>
@@ -959,7 +1054,15 @@
           <w:sz w:val="32"/>
           <w:szCs w:val="32"/>
         </w:rPr>
-        <w:t>()</w:t>
+        <w:t>(</w:t>
+      </w:r>
+      <w:proofErr w:type="gramEnd"/>
+      <w:r>
+        <w:rPr>
+          <w:sz w:val="32"/>
+          <w:szCs w:val="32"/>
+        </w:rPr>
+        <w:t>)</w:t>
       </w:r>
     </w:p>
     <w:p>
@@ -2425,6 +2528,177 @@
           <w:szCs w:val="32"/>
         </w:rPr>
       </w:pPr>
+      <w:r>
+        <w:rPr>
+          <w:b/>
+          <w:bCs/>
+          <w:sz w:val="32"/>
+          <w:szCs w:val="32"/>
+        </w:rPr>
+        <w:lastRenderedPageBreak/>
+        <w:drawing>
+          <wp:inline distT="0" distB="0" distL="0" distR="0" wp14:anchorId="09C84D6E" wp14:editId="61933E71">
+            <wp:extent cx="5943600" cy="2564765"/>
+            <wp:effectExtent l="0" t="0" r="0" b="0"/>
+            <wp:docPr id="1609365617" name="Picture 1"/>
+            <wp:cNvGraphicFramePr>
+              <a:graphicFrameLocks xmlns:a="http://schemas.openxmlformats.org/drawingml/2006/main" noChangeAspect="1"/>
+            </wp:cNvGraphicFramePr>
+            <a:graphic xmlns:a="http://schemas.openxmlformats.org/drawingml/2006/main">
+              <a:graphicData uri="http://schemas.openxmlformats.org/drawingml/2006/picture">
+                <pic:pic xmlns:pic="http://schemas.openxmlformats.org/drawingml/2006/picture">
+                  <pic:nvPicPr>
+                    <pic:cNvPr id="1609365617" name=""/>
+                    <pic:cNvPicPr/>
+                  </pic:nvPicPr>
+                  <pic:blipFill>
+                    <a:blip r:embed="rId23"/>
+                    <a:stretch>
+                      <a:fillRect/>
+                    </a:stretch>
+                  </pic:blipFill>
+                  <pic:spPr>
+                    <a:xfrm>
+                      <a:off x="0" y="0"/>
+                      <a:ext cx="5943600" cy="2564765"/>
+                    </a:xfrm>
+                    <a:prstGeom prst="rect">
+                      <a:avLst/>
+                    </a:prstGeom>
+                  </pic:spPr>
+                </pic:pic>
+              </a:graphicData>
+            </a:graphic>
+          </wp:inline>
+        </w:drawing>
+      </w:r>
+    </w:p>
+    <w:p>
+      <w:pPr>
+        <w:rPr>
+          <w:b/>
+          <w:bCs/>
+          <w:sz w:val="32"/>
+          <w:szCs w:val="32"/>
+        </w:rPr>
+      </w:pPr>
+    </w:p>
+    <w:p>
+      <w:pPr>
+        <w:rPr>
+          <w:b/>
+          <w:bCs/>
+          <w:sz w:val="32"/>
+          <w:szCs w:val="32"/>
+        </w:rPr>
+      </w:pPr>
+      <w:r>
+        <w:rPr>
+          <w:b/>
+          <w:bCs/>
+          <w:sz w:val="32"/>
+          <w:szCs w:val="32"/>
+        </w:rPr>
+        <w:drawing>
+          <wp:inline distT="0" distB="0" distL="0" distR="0" wp14:anchorId="42CE2450" wp14:editId="7AAAF199">
+            <wp:extent cx="5943600" cy="3056890"/>
+            <wp:effectExtent l="0" t="0" r="0" b="0"/>
+            <wp:docPr id="649888532" name="Picture 1"/>
+            <wp:cNvGraphicFramePr>
+              <a:graphicFrameLocks xmlns:a="http://schemas.openxmlformats.org/drawingml/2006/main" noChangeAspect="1"/>
+            </wp:cNvGraphicFramePr>
+            <a:graphic xmlns:a="http://schemas.openxmlformats.org/drawingml/2006/main">
+              <a:graphicData uri="http://schemas.openxmlformats.org/drawingml/2006/picture">
+                <pic:pic xmlns:pic="http://schemas.openxmlformats.org/drawingml/2006/picture">
+                  <pic:nvPicPr>
+                    <pic:cNvPr id="649888532" name=""/>
+                    <pic:cNvPicPr/>
+                  </pic:nvPicPr>
+                  <pic:blipFill>
+                    <a:blip r:embed="rId24"/>
+                    <a:stretch>
+                      <a:fillRect/>
+                    </a:stretch>
+                  </pic:blipFill>
+                  <pic:spPr>
+                    <a:xfrm>
+                      <a:off x="0" y="0"/>
+                      <a:ext cx="5943600" cy="3056890"/>
+                    </a:xfrm>
+                    <a:prstGeom prst="rect">
+                      <a:avLst/>
+                    </a:prstGeom>
+                  </pic:spPr>
+                </pic:pic>
+              </a:graphicData>
+            </a:graphic>
+          </wp:inline>
+        </w:drawing>
+      </w:r>
+    </w:p>
+    <w:p>
+      <w:pPr>
+        <w:rPr>
+          <w:b/>
+          <w:bCs/>
+          <w:sz w:val="32"/>
+          <w:szCs w:val="32"/>
+        </w:rPr>
+      </w:pPr>
+    </w:p>
+    <w:p>
+      <w:pPr>
+        <w:rPr>
+          <w:b/>
+          <w:bCs/>
+          <w:sz w:val="32"/>
+          <w:szCs w:val="32"/>
+        </w:rPr>
+      </w:pPr>
+      <w:r>
+        <w:rPr>
+          <w:b/>
+          <w:bCs/>
+          <w:sz w:val="32"/>
+          <w:szCs w:val="32"/>
+        </w:rPr>
+        <w:lastRenderedPageBreak/>
+        <w:drawing>
+          <wp:inline distT="0" distB="0" distL="0" distR="0" wp14:anchorId="68E88A98" wp14:editId="307347B4">
+            <wp:extent cx="5943600" cy="3687445"/>
+            <wp:effectExtent l="0" t="0" r="0" b="0"/>
+            <wp:docPr id="112144506" name="Picture 1"/>
+            <wp:cNvGraphicFramePr>
+              <a:graphicFrameLocks xmlns:a="http://schemas.openxmlformats.org/drawingml/2006/main" noChangeAspect="1"/>
+            </wp:cNvGraphicFramePr>
+            <a:graphic xmlns:a="http://schemas.openxmlformats.org/drawingml/2006/main">
+              <a:graphicData uri="http://schemas.openxmlformats.org/drawingml/2006/picture">
+                <pic:pic xmlns:pic="http://schemas.openxmlformats.org/drawingml/2006/picture">
+                  <pic:nvPicPr>
+                    <pic:cNvPr id="112144506" name=""/>
+                    <pic:cNvPicPr/>
+                  </pic:nvPicPr>
+                  <pic:blipFill>
+                    <a:blip r:embed="rId25"/>
+                    <a:stretch>
+                      <a:fillRect/>
+                    </a:stretch>
+                  </pic:blipFill>
+                  <pic:spPr>
+                    <a:xfrm>
+                      <a:off x="0" y="0"/>
+                      <a:ext cx="5943600" cy="3687445"/>
+                    </a:xfrm>
+                    <a:prstGeom prst="rect">
+                      <a:avLst/>
+                    </a:prstGeom>
+                  </pic:spPr>
+                </pic:pic>
+              </a:graphicData>
+            </a:graphic>
+          </wp:inline>
+        </w:drawing>
+      </w:r>
     </w:p>
     <w:sectPr>
       <w:pgSz w:w="12240" w:h="15840"/>
@@ -3362,6 +3636,7 @@
   <w:style w:type="character" w:default="1" w:styleId="DefaultParagraphFont">
     <w:name w:val="Default Paragraph Font"/>
     <w:uiPriority w:val="1"/>
+    <w:semiHidden/>
     <w:unhideWhenUsed/>
   </w:style>
   <w:style w:type="table" w:default="1" w:styleId="TableNormal">

</xml_diff>

<commit_message>
Added user authentication check
</commit_message>
<xml_diff>
--- a/Notes-Blog_React.docx
+++ b/Notes-Blog_React.docx
@@ -229,25 +229,20 @@
           <w:bCs/>
           <w:lang w:val="en-IN"/>
         </w:rPr>
-        <w:t>2. Hover Handling (</w:t>
-      </w:r>
-      <w:proofErr w:type="spellStart"/>
-      <w:r>
-        <w:rPr>
-          <w:b/>
-          <w:bCs/>
+        <w:t>2. Hover Handling (onMouseEnter)</w:t>
+      </w:r>
+    </w:p>
+    <w:p>
+      <w:pPr>
+        <w:rPr>
           <w:lang w:val="en-IN"/>
         </w:rPr>
-        <w:t>onMouseEnter</w:t>
-      </w:r>
-      <w:proofErr w:type="spellEnd"/>
-      <w:r>
-        <w:rPr>
-          <w:b/>
-          <w:bCs/>
+      </w:pPr>
+      <w:r>
+        <w:rPr>
           <w:lang w:val="en-IN"/>
         </w:rPr>
-        <w:t>)</w:t>
+        <w:t>const handleMouseEnter = (e) =&gt; {</w:t>
       </w:r>
     </w:p>
     <w:p>
@@ -256,311 +251,92 @@
           <w:lang w:val="en-IN"/>
         </w:rPr>
       </w:pPr>
-      <w:proofErr w:type="spellStart"/>
       <w:r>
         <w:rPr>
           <w:lang w:val="en-IN"/>
         </w:rPr>
-        <w:t>const</w:t>
-      </w:r>
-      <w:proofErr w:type="spellEnd"/>
+        <w:t xml:space="preserve">  const itemRect = </w:t>
+      </w:r>
+      <w:proofErr w:type="gramStart"/>
       <w:r>
         <w:rPr>
           <w:lang w:val="en-IN"/>
         </w:rPr>
-        <w:t xml:space="preserve"> </w:t>
-      </w:r>
-      <w:proofErr w:type="spellStart"/>
+        <w:t>e.target</w:t>
+      </w:r>
+      <w:proofErr w:type="gramEnd"/>
       <w:r>
         <w:rPr>
           <w:lang w:val="en-IN"/>
         </w:rPr>
-        <w:t>handleMouseEnter</w:t>
-      </w:r>
-      <w:proofErr w:type="spellEnd"/>
+        <w:t>.</w:t>
+      </w:r>
+      <w:proofErr w:type="gramStart"/>
       <w:r>
         <w:rPr>
           <w:lang w:val="en-IN"/>
         </w:rPr>
-        <w:t xml:space="preserve"> = (e) =&gt; {</w:t>
-      </w:r>
-    </w:p>
-    <w:p>
-      <w:pPr>
+        <w:t>getBoundingClientRect(</w:t>
+      </w:r>
+      <w:proofErr w:type="gramEnd"/>
+      <w:r>
         <w:rPr>
           <w:lang w:val="en-IN"/>
         </w:rPr>
-      </w:pPr>
-      <w:r>
+        <w:t>); // gets size and position of the hovered link</w:t>
+      </w:r>
+    </w:p>
+    <w:p>
+      <w:pPr>
         <w:rPr>
           <w:lang w:val="en-IN"/>
         </w:rPr>
-        <w:t xml:space="preserve">  </w:t>
-      </w:r>
-      <w:proofErr w:type="spellStart"/>
+      </w:pPr>
       <w:r>
         <w:rPr>
           <w:lang w:val="en-IN"/>
         </w:rPr>
-        <w:t>const</w:t>
-      </w:r>
-      <w:proofErr w:type="spellEnd"/>
+        <w:t xml:space="preserve">  const containerRect = </w:t>
+      </w:r>
+      <w:proofErr w:type="gramStart"/>
       <w:r>
         <w:rPr>
           <w:lang w:val="en-IN"/>
         </w:rPr>
-        <w:t xml:space="preserve"> </w:t>
-      </w:r>
-      <w:proofErr w:type="spellStart"/>
+        <w:t>containerRef.current.getBoundingClientRect</w:t>
+      </w:r>
+      <w:proofErr w:type="gramEnd"/>
       <w:r>
         <w:rPr>
           <w:lang w:val="en-IN"/>
         </w:rPr>
-        <w:t>itemRect</w:t>
-      </w:r>
-      <w:proofErr w:type="spellEnd"/>
-      <w:r>
+        <w:t>(); // same for nav container</w:t>
+      </w:r>
+    </w:p>
+    <w:p>
+      <w:pPr>
         <w:rPr>
           <w:lang w:val="en-IN"/>
         </w:rPr>
-        <w:t xml:space="preserve"> = </w:t>
-      </w:r>
-      <w:proofErr w:type="spellStart"/>
-      <w:proofErr w:type="gramStart"/>
+      </w:pPr>
       <w:r>
         <w:rPr>
           <w:lang w:val="en-IN"/>
         </w:rPr>
-        <w:t>e.target</w:t>
-      </w:r>
-      <w:proofErr w:type="gramEnd"/>
-      <w:r>
+        <w:t xml:space="preserve">  underline.style.width = `${itemRect.width}px`; // match the hovered link width</w:t>
+      </w:r>
+    </w:p>
+    <w:p>
+      <w:pPr>
         <w:rPr>
           <w:lang w:val="en-IN"/>
         </w:rPr>
-        <w:t>.</w:t>
-      </w:r>
-      <w:proofErr w:type="gramStart"/>
+      </w:pPr>
       <w:r>
         <w:rPr>
           <w:lang w:val="en-IN"/>
         </w:rPr>
-        <w:t>getBoundingClientRect</w:t>
-      </w:r>
-      <w:proofErr w:type="spellEnd"/>
-      <w:r>
-        <w:rPr>
-          <w:lang w:val="en-IN"/>
-        </w:rPr>
-        <w:t>(</w:t>
-      </w:r>
-      <w:proofErr w:type="gramEnd"/>
-      <w:r>
-        <w:rPr>
-          <w:lang w:val="en-IN"/>
-        </w:rPr>
-        <w:t>); // gets size and position of the hovered link</w:t>
-      </w:r>
-    </w:p>
-    <w:p>
-      <w:pPr>
-        <w:rPr>
-          <w:lang w:val="en-IN"/>
-        </w:rPr>
-      </w:pPr>
-      <w:r>
-        <w:rPr>
-          <w:lang w:val="en-IN"/>
-        </w:rPr>
-        <w:t xml:space="preserve">  </w:t>
-      </w:r>
-      <w:proofErr w:type="spellStart"/>
-      <w:r>
-        <w:rPr>
-          <w:lang w:val="en-IN"/>
-        </w:rPr>
-        <w:t>const</w:t>
-      </w:r>
-      <w:proofErr w:type="spellEnd"/>
-      <w:r>
-        <w:rPr>
-          <w:lang w:val="en-IN"/>
-        </w:rPr>
-        <w:t xml:space="preserve"> </w:t>
-      </w:r>
-      <w:proofErr w:type="spellStart"/>
-      <w:r>
-        <w:rPr>
-          <w:lang w:val="en-IN"/>
-        </w:rPr>
-        <w:t>containerRect</w:t>
-      </w:r>
-      <w:proofErr w:type="spellEnd"/>
-      <w:r>
-        <w:rPr>
-          <w:lang w:val="en-IN"/>
-        </w:rPr>
-        <w:t xml:space="preserve"> = </w:t>
-      </w:r>
-      <w:proofErr w:type="spellStart"/>
-      <w:proofErr w:type="gramStart"/>
-      <w:r>
-        <w:rPr>
-          <w:lang w:val="en-IN"/>
-        </w:rPr>
-        <w:t>containerRef.current.getBoundingClientRect</w:t>
-      </w:r>
-      <w:proofErr w:type="spellEnd"/>
-      <w:proofErr w:type="gramEnd"/>
-      <w:r>
-        <w:rPr>
-          <w:lang w:val="en-IN"/>
-        </w:rPr>
-        <w:t>(); // same for nav container</w:t>
-      </w:r>
-    </w:p>
-    <w:p>
-      <w:pPr>
-        <w:rPr>
-          <w:lang w:val="en-IN"/>
-        </w:rPr>
-      </w:pPr>
-      <w:r>
-        <w:rPr>
-          <w:lang w:val="en-IN"/>
-        </w:rPr>
-        <w:t xml:space="preserve">  </w:t>
-      </w:r>
-      <w:proofErr w:type="spellStart"/>
-      <w:proofErr w:type="gramStart"/>
-      <w:r>
-        <w:rPr>
-          <w:lang w:val="en-IN"/>
-        </w:rPr>
-        <w:t>underline.style</w:t>
-      </w:r>
-      <w:proofErr w:type="gramEnd"/>
-      <w:r>
-        <w:rPr>
-          <w:lang w:val="en-IN"/>
-        </w:rPr>
-        <w:t>.width</w:t>
-      </w:r>
-      <w:proofErr w:type="spellEnd"/>
-      <w:r>
-        <w:rPr>
-          <w:lang w:val="en-IN"/>
-        </w:rPr>
-        <w:t xml:space="preserve"> = `${</w:t>
-      </w:r>
-      <w:proofErr w:type="spellStart"/>
-      <w:proofErr w:type="gramStart"/>
-      <w:r>
-        <w:rPr>
-          <w:lang w:val="en-IN"/>
-        </w:rPr>
-        <w:t>itemRect.width</w:t>
-      </w:r>
-      <w:proofErr w:type="spellEnd"/>
-      <w:r>
-        <w:rPr>
-          <w:lang w:val="en-IN"/>
-        </w:rPr>
-        <w:t>}</w:t>
-      </w:r>
-      <w:proofErr w:type="spellStart"/>
-      <w:r>
-        <w:rPr>
-          <w:lang w:val="en-IN"/>
-        </w:rPr>
-        <w:t>px</w:t>
-      </w:r>
-      <w:proofErr w:type="spellEnd"/>
-      <w:proofErr w:type="gramEnd"/>
-      <w:r>
-        <w:rPr>
-          <w:lang w:val="en-IN"/>
-        </w:rPr>
-        <w:t>`; // match the hovered link width</w:t>
-      </w:r>
-    </w:p>
-    <w:p>
-      <w:pPr>
-        <w:rPr>
-          <w:lang w:val="en-IN"/>
-        </w:rPr>
-      </w:pPr>
-      <w:r>
-        <w:rPr>
-          <w:lang w:val="en-IN"/>
-        </w:rPr>
-        <w:t xml:space="preserve">  </w:t>
-      </w:r>
-      <w:proofErr w:type="spellStart"/>
-      <w:proofErr w:type="gramStart"/>
-      <w:r>
-        <w:rPr>
-          <w:lang w:val="en-IN"/>
-        </w:rPr>
-        <w:t>underline.style</w:t>
-      </w:r>
-      <w:proofErr w:type="gramEnd"/>
-      <w:r>
-        <w:rPr>
-          <w:lang w:val="en-IN"/>
-        </w:rPr>
-        <w:t>.left</w:t>
-      </w:r>
-      <w:proofErr w:type="spellEnd"/>
-      <w:r>
-        <w:rPr>
-          <w:lang w:val="en-IN"/>
-        </w:rPr>
-        <w:t xml:space="preserve"> = `${</w:t>
-      </w:r>
-      <w:proofErr w:type="spellStart"/>
-      <w:r>
-        <w:rPr>
-          <w:lang w:val="en-IN"/>
-        </w:rPr>
-        <w:t>itemRect.left</w:t>
-      </w:r>
-      <w:proofErr w:type="spellEnd"/>
-      <w:r>
-        <w:rPr>
-          <w:lang w:val="en-IN"/>
-        </w:rPr>
-        <w:t xml:space="preserve"> - </w:t>
-      </w:r>
-      <w:proofErr w:type="spellStart"/>
-      <w:proofErr w:type="gramStart"/>
-      <w:r>
-        <w:rPr>
-          <w:lang w:val="en-IN"/>
-        </w:rPr>
-        <w:t>containerRect.left</w:t>
-      </w:r>
-      <w:proofErr w:type="spellEnd"/>
-      <w:r>
-        <w:rPr>
-          <w:lang w:val="en-IN"/>
-        </w:rPr>
-        <w:t>}</w:t>
-      </w:r>
-      <w:proofErr w:type="spellStart"/>
-      <w:r>
-        <w:rPr>
-          <w:lang w:val="en-IN"/>
-        </w:rPr>
-        <w:t>px</w:t>
-      </w:r>
-      <w:proofErr w:type="spellEnd"/>
-      <w:proofErr w:type="gramEnd"/>
-      <w:r>
-        <w:rPr>
-          <w:lang w:val="en-IN"/>
-        </w:rPr>
-        <w:t>`; // move it to the hovered link's position</w:t>
+        <w:t xml:space="preserve">  underline.style.left = `${itemRect.left - containerRect.left}px`; // move it to the hovered link's position</w:t>
       </w:r>
     </w:p>
     <w:p>
@@ -800,31 +576,13 @@
           <w:szCs w:val="32"/>
         </w:rPr>
       </w:pPr>
-      <w:proofErr w:type="spellStart"/>
-      <w:r>
-        <w:rPr>
-          <w:sz w:val="32"/>
-          <w:szCs w:val="32"/>
-        </w:rPr>
-        <w:t>npm</w:t>
-      </w:r>
-      <w:proofErr w:type="spellEnd"/>
-      <w:r>
-        <w:rPr>
-          <w:sz w:val="32"/>
-          <w:szCs w:val="32"/>
-        </w:rPr>
-        <w:t xml:space="preserve"> install </w:t>
-      </w:r>
-      <w:proofErr w:type="spellStart"/>
-      <w:r>
-        <w:rPr>
-          <w:sz w:val="32"/>
-          <w:szCs w:val="32"/>
-        </w:rPr>
-        <w:t>zustand</w:t>
-      </w:r>
-      <w:proofErr w:type="spellEnd"/>
+      <w:r>
+        <w:rPr>
+          <w:sz w:val="32"/>
+          <w:szCs w:val="32"/>
+        </w:rPr>
+        <w:t>npm install zustand</w:t>
+      </w:r>
     </w:p>
     <w:p>
       <w:pPr>
@@ -902,70 +660,22 @@
           <w:sz w:val="32"/>
           <w:szCs w:val="32"/>
         </w:rPr>
-        <w:t xml:space="preserve"> export const </w:t>
-      </w:r>
-      <w:proofErr w:type="spellStart"/>
-      <w:r>
-        <w:rPr>
-          <w:sz w:val="32"/>
-          <w:szCs w:val="32"/>
-        </w:rPr>
-        <w:t>useStore</w:t>
-      </w:r>
-      <w:proofErr w:type="spellEnd"/>
-      <w:r>
-        <w:rPr>
-          <w:sz w:val="32"/>
-          <w:szCs w:val="32"/>
-        </w:rPr>
-        <w:t xml:space="preserve"> = ….</w:t>
-      </w:r>
-    </w:p>
-    <w:p>
-      <w:pPr>
-        <w:rPr>
-          <w:sz w:val="32"/>
-          <w:szCs w:val="32"/>
-        </w:rPr>
-      </w:pPr>
-      <w:r>
-        <w:rPr>
-          <w:sz w:val="32"/>
-          <w:szCs w:val="32"/>
-        </w:rPr>
-        <w:t xml:space="preserve">And then import it as import </w:t>
-      </w:r>
-      <w:proofErr w:type="spellStart"/>
-      <w:r>
-        <w:rPr>
-          <w:sz w:val="32"/>
-          <w:szCs w:val="32"/>
-        </w:rPr>
-        <w:t>useStore</w:t>
-      </w:r>
-      <w:proofErr w:type="spellEnd"/>
-      <w:r>
-        <w:rPr>
-          <w:sz w:val="32"/>
-          <w:szCs w:val="32"/>
-        </w:rPr>
-        <w:t xml:space="preserve"> from “../</w:t>
-      </w:r>
-      <w:proofErr w:type="spellStart"/>
-      <w:r>
-        <w:rPr>
-          <w:sz w:val="32"/>
-          <w:szCs w:val="32"/>
-        </w:rPr>
-        <w:t>src</w:t>
-      </w:r>
-      <w:proofErr w:type="spellEnd"/>
-      <w:r>
-        <w:rPr>
-          <w:sz w:val="32"/>
-          <w:szCs w:val="32"/>
-        </w:rPr>
-        <w:t>/useStore.js”</w:t>
+        <w:t xml:space="preserve"> export const useStore = ….</w:t>
+      </w:r>
+    </w:p>
+    <w:p>
+      <w:pPr>
+        <w:rPr>
+          <w:sz w:val="32"/>
+          <w:szCs w:val="32"/>
+        </w:rPr>
+      </w:pPr>
+      <w:r>
+        <w:rPr>
+          <w:sz w:val="32"/>
+          <w:szCs w:val="32"/>
+        </w:rPr>
+        <w:t>And then import it as import useStore from “../src/useStore.js”</w:t>
       </w:r>
     </w:p>
     <w:p>
@@ -996,73 +706,7 @@
           <w:sz w:val="32"/>
           <w:szCs w:val="32"/>
         </w:rPr>
-        <w:t xml:space="preserve">Const </w:t>
-      </w:r>
-      <w:proofErr w:type="gramStart"/>
-      <w:r>
-        <w:rPr>
-          <w:sz w:val="32"/>
-          <w:szCs w:val="32"/>
-        </w:rPr>
-        <w:t>{ bears</w:t>
-      </w:r>
-      <w:proofErr w:type="gramEnd"/>
-      <w:r>
-        <w:rPr>
-          <w:sz w:val="32"/>
-          <w:szCs w:val="32"/>
-        </w:rPr>
-        <w:t xml:space="preserve">, </w:t>
-      </w:r>
-      <w:proofErr w:type="spellStart"/>
-      <w:proofErr w:type="gramStart"/>
-      <w:r>
-        <w:rPr>
-          <w:sz w:val="32"/>
-          <w:szCs w:val="32"/>
-        </w:rPr>
-        <w:t>updateBears</w:t>
-      </w:r>
-      <w:proofErr w:type="spellEnd"/>
-      <w:r>
-        <w:rPr>
-          <w:sz w:val="32"/>
-          <w:szCs w:val="32"/>
-        </w:rPr>
-        <w:t xml:space="preserve"> }</w:t>
-      </w:r>
-      <w:proofErr w:type="gramEnd"/>
-      <w:r>
-        <w:rPr>
-          <w:sz w:val="32"/>
-          <w:szCs w:val="32"/>
-        </w:rPr>
-        <w:t xml:space="preserve"> = </w:t>
-      </w:r>
-      <w:proofErr w:type="spellStart"/>
-      <w:proofErr w:type="gramStart"/>
-      <w:r>
-        <w:rPr>
-          <w:sz w:val="32"/>
-          <w:szCs w:val="32"/>
-        </w:rPr>
-        <w:t>useStore</w:t>
-      </w:r>
-      <w:proofErr w:type="spellEnd"/>
-      <w:r>
-        <w:rPr>
-          <w:sz w:val="32"/>
-          <w:szCs w:val="32"/>
-        </w:rPr>
-        <w:t>(</w:t>
-      </w:r>
-      <w:proofErr w:type="gramEnd"/>
-      <w:r>
-        <w:rPr>
-          <w:sz w:val="32"/>
-          <w:szCs w:val="32"/>
-        </w:rPr>
-        <w:t>)</w:t>
+        <w:t>Const { bears, updateBears } = useStore()</w:t>
       </w:r>
     </w:p>
     <w:p>
@@ -1451,42 +1095,8 @@
           <w:szCs w:val="32"/>
           <w:highlight w:val="yellow"/>
         </w:rPr>
-        <w:t xml:space="preserve">Ripple effect and getting position of </w:t>
-      </w:r>
-      <w:proofErr w:type="spellStart"/>
-      <w:r>
-        <w:rPr>
-          <w:b/>
-          <w:bCs/>
-          <w:sz w:val="32"/>
-          <w:szCs w:val="32"/>
-          <w:highlight w:val="yellow"/>
-        </w:rPr>
-        <w:t>el</w:t>
-      </w:r>
-      <w:proofErr w:type="spellEnd"/>
-      <w:r>
-        <w:rPr>
-          <w:b/>
-          <w:bCs/>
-          <w:sz w:val="32"/>
-          <w:szCs w:val="32"/>
-          <w:highlight w:val="yellow"/>
-        </w:rPr>
-        <w:t xml:space="preserve"> using </w:t>
-      </w:r>
-      <w:proofErr w:type="spellStart"/>
-      <w:r>
-        <w:rPr>
-          <w:b/>
-          <w:bCs/>
-          <w:sz w:val="32"/>
-          <w:szCs w:val="32"/>
-          <w:highlight w:val="yellow"/>
-        </w:rPr>
-        <w:t>javascript</w:t>
-      </w:r>
-      <w:proofErr w:type="spellEnd"/>
+        <w:t>Ripple effect and getting position of el using javascript</w:t>
+      </w:r>
     </w:p>
     <w:p>
       <w:pPr>
@@ -2332,29 +1942,7 @@
           <w:szCs w:val="32"/>
           <w:highlight w:val="yellow"/>
         </w:rPr>
-        <w:t xml:space="preserve">for (variable of </w:t>
-      </w:r>
-      <w:proofErr w:type="spellStart"/>
-      <w:r>
-        <w:rPr>
-          <w:b/>
-          <w:bCs/>
-          <w:sz w:val="32"/>
-          <w:szCs w:val="32"/>
-          <w:highlight w:val="yellow"/>
-        </w:rPr>
-        <w:t>iterable</w:t>
-      </w:r>
-      <w:proofErr w:type="spellEnd"/>
-      <w:r>
-        <w:rPr>
-          <w:b/>
-          <w:bCs/>
-          <w:sz w:val="32"/>
-          <w:szCs w:val="32"/>
-          <w:highlight w:val="yellow"/>
-        </w:rPr>
-        <w:t>) {</w:t>
+        <w:t>for (variable of iterable) {</w:t>
       </w:r>
       <w:r>
         <w:rPr>
@@ -2443,7 +2031,6 @@
           <w:lang w:val="en-IN"/>
         </w:rPr>
       </w:pPr>
-      <w:proofErr w:type="spellStart"/>
       <w:r>
         <w:rPr>
           <w:b/>
@@ -2453,43 +2040,7 @@
           <w:highlight w:val="red"/>
           <w:lang w:val="en-IN"/>
         </w:rPr>
-        <w:t>href</w:t>
-      </w:r>
-      <w:proofErr w:type="spellEnd"/>
-      <w:r>
-        <w:rPr>
-          <w:b/>
-          <w:bCs/>
-          <w:sz w:val="32"/>
-          <w:szCs w:val="32"/>
-          <w:highlight w:val="red"/>
-          <w:lang w:val="en-IN"/>
-        </w:rPr>
-        <w:t>="#section1": The </w:t>
-      </w:r>
-      <w:proofErr w:type="spellStart"/>
-      <w:r>
-        <w:rPr>
-          <w:b/>
-          <w:bCs/>
-          <w:sz w:val="32"/>
-          <w:szCs w:val="32"/>
-          <w:highlight w:val="red"/>
-          <w:lang w:val="en-IN"/>
-        </w:rPr>
-        <w:t>href</w:t>
-      </w:r>
-      <w:proofErr w:type="spellEnd"/>
-      <w:r>
-        <w:rPr>
-          <w:b/>
-          <w:bCs/>
-          <w:sz w:val="32"/>
-          <w:szCs w:val="32"/>
-          <w:highlight w:val="red"/>
-          <w:lang w:val="en-IN"/>
-        </w:rPr>
-        <w:t> attribute specifies the target of the link. In this case, it points to a section id="section1" on the same page.</w:t>
+        <w:t>href="#section1": The href attribute specifies the target of the link. In this case, it points to a section id="section1" on the same page.</w:t>
       </w:r>
     </w:p>
     <w:p>
@@ -2532,6 +2083,7 @@
         <w:rPr>
           <w:b/>
           <w:bCs/>
+          <w:noProof/>
           <w:sz w:val="32"/>
           <w:szCs w:val="32"/>
         </w:rPr>
@@ -2596,6 +2148,7 @@
         <w:rPr>
           <w:b/>
           <w:bCs/>
+          <w:noProof/>
           <w:sz w:val="32"/>
           <w:szCs w:val="32"/>
         </w:rPr>
@@ -2659,6 +2212,7 @@
         <w:rPr>
           <w:b/>
           <w:bCs/>
+          <w:noProof/>
           <w:sz w:val="32"/>
           <w:szCs w:val="32"/>
         </w:rPr>
@@ -2688,6 +2242,246 @@
                     <a:xfrm>
                       <a:off x="0" y="0"/>
                       <a:ext cx="5943600" cy="3687445"/>
+                    </a:xfrm>
+                    <a:prstGeom prst="rect">
+                      <a:avLst/>
+                    </a:prstGeom>
+                  </pic:spPr>
+                </pic:pic>
+              </a:graphicData>
+            </a:graphic>
+          </wp:inline>
+        </w:drawing>
+      </w:r>
+    </w:p>
+    <w:p>
+      <w:pPr>
+        <w:rPr>
+          <w:b/>
+          <w:bCs/>
+          <w:sz w:val="32"/>
+          <w:szCs w:val="32"/>
+        </w:rPr>
+      </w:pPr>
+    </w:p>
+    <w:p>
+      <w:pPr>
+        <w:rPr>
+          <w:b/>
+          <w:bCs/>
+          <w:sz w:val="32"/>
+          <w:szCs w:val="32"/>
+        </w:rPr>
+      </w:pPr>
+    </w:p>
+    <w:p>
+      <w:pPr>
+        <w:rPr>
+          <w:b/>
+          <w:bCs/>
+          <w:sz w:val="32"/>
+          <w:szCs w:val="32"/>
+        </w:rPr>
+      </w:pPr>
+    </w:p>
+    <w:p>
+      <w:pPr>
+        <w:rPr>
+          <w:b/>
+          <w:bCs/>
+          <w:sz w:val="32"/>
+          <w:szCs w:val="32"/>
+        </w:rPr>
+      </w:pPr>
+    </w:p>
+    <w:p>
+      <w:pPr>
+        <w:rPr>
+          <w:b/>
+          <w:bCs/>
+          <w:sz w:val="32"/>
+          <w:szCs w:val="32"/>
+        </w:rPr>
+      </w:pPr>
+    </w:p>
+    <w:p>
+      <w:pPr>
+        <w:rPr>
+          <w:b/>
+          <w:bCs/>
+          <w:sz w:val="32"/>
+          <w:szCs w:val="32"/>
+        </w:rPr>
+      </w:pPr>
+    </w:p>
+    <w:p>
+      <w:pPr>
+        <w:rPr>
+          <w:b/>
+          <w:bCs/>
+          <w:sz w:val="32"/>
+          <w:szCs w:val="32"/>
+        </w:rPr>
+      </w:pPr>
+      <w:r>
+        <w:rPr>
+          <w:b/>
+          <w:bCs/>
+          <w:sz w:val="32"/>
+          <w:szCs w:val="32"/>
+        </w:rPr>
+        <w:lastRenderedPageBreak/>
+        <w:drawing>
+          <wp:inline distT="0" distB="0" distL="0" distR="0" wp14:anchorId="41C80A8D" wp14:editId="3249A1A2">
+            <wp:extent cx="5772956" cy="2476846"/>
+            <wp:effectExtent l="0" t="0" r="0" b="0"/>
+            <wp:docPr id="998538395" name="Picture 1"/>
+            <wp:cNvGraphicFramePr>
+              <a:graphicFrameLocks xmlns:a="http://schemas.openxmlformats.org/drawingml/2006/main" noChangeAspect="1"/>
+            </wp:cNvGraphicFramePr>
+            <a:graphic xmlns:a="http://schemas.openxmlformats.org/drawingml/2006/main">
+              <a:graphicData uri="http://schemas.openxmlformats.org/drawingml/2006/picture">
+                <pic:pic xmlns:pic="http://schemas.openxmlformats.org/drawingml/2006/picture">
+                  <pic:nvPicPr>
+                    <pic:cNvPr id="998538395" name=""/>
+                    <pic:cNvPicPr/>
+                  </pic:nvPicPr>
+                  <pic:blipFill>
+                    <a:blip r:embed="rId26"/>
+                    <a:stretch>
+                      <a:fillRect/>
+                    </a:stretch>
+                  </pic:blipFill>
+                  <pic:spPr>
+                    <a:xfrm>
+                      <a:off x="0" y="0"/>
+                      <a:ext cx="5772956" cy="2476846"/>
+                    </a:xfrm>
+                    <a:prstGeom prst="rect">
+                      <a:avLst/>
+                    </a:prstGeom>
+                  </pic:spPr>
+                </pic:pic>
+              </a:graphicData>
+            </a:graphic>
+          </wp:inline>
+        </w:drawing>
+      </w:r>
+    </w:p>
+    <w:p>
+      <w:pPr>
+        <w:rPr>
+          <w:b/>
+          <w:bCs/>
+          <w:sz w:val="32"/>
+          <w:szCs w:val="32"/>
+        </w:rPr>
+      </w:pPr>
+    </w:p>
+    <w:p>
+      <w:pPr>
+        <w:rPr>
+          <w:b/>
+          <w:bCs/>
+          <w:sz w:val="32"/>
+          <w:szCs w:val="32"/>
+        </w:rPr>
+      </w:pPr>
+    </w:p>
+    <w:p>
+      <w:pPr>
+        <w:rPr>
+          <w:b/>
+          <w:bCs/>
+          <w:sz w:val="32"/>
+          <w:szCs w:val="32"/>
+        </w:rPr>
+      </w:pPr>
+      <w:r>
+        <w:rPr>
+          <w:b/>
+          <w:bCs/>
+          <w:sz w:val="32"/>
+          <w:szCs w:val="32"/>
+        </w:rPr>
+        <w:drawing>
+          <wp:inline distT="0" distB="0" distL="0" distR="0" wp14:anchorId="25A7E4E4" wp14:editId="3504C3C3">
+            <wp:extent cx="4848902" cy="866896"/>
+            <wp:effectExtent l="0" t="0" r="8890" b="9525"/>
+            <wp:docPr id="1224869100" name="Picture 1"/>
+            <wp:cNvGraphicFramePr>
+              <a:graphicFrameLocks xmlns:a="http://schemas.openxmlformats.org/drawingml/2006/main" noChangeAspect="1"/>
+            </wp:cNvGraphicFramePr>
+            <a:graphic xmlns:a="http://schemas.openxmlformats.org/drawingml/2006/main">
+              <a:graphicData uri="http://schemas.openxmlformats.org/drawingml/2006/picture">
+                <pic:pic xmlns:pic="http://schemas.openxmlformats.org/drawingml/2006/picture">
+                  <pic:nvPicPr>
+                    <pic:cNvPr id="1224869100" name=""/>
+                    <pic:cNvPicPr/>
+                  </pic:nvPicPr>
+                  <pic:blipFill>
+                    <a:blip r:embed="rId27"/>
+                    <a:stretch>
+                      <a:fillRect/>
+                    </a:stretch>
+                  </pic:blipFill>
+                  <pic:spPr>
+                    <a:xfrm>
+                      <a:off x="0" y="0"/>
+                      <a:ext cx="4848902" cy="866896"/>
+                    </a:xfrm>
+                    <a:prstGeom prst="rect">
+                      <a:avLst/>
+                    </a:prstGeom>
+                  </pic:spPr>
+                </pic:pic>
+              </a:graphicData>
+            </a:graphic>
+          </wp:inline>
+        </w:drawing>
+      </w:r>
+    </w:p>
+    <w:p>
+      <w:pPr>
+        <w:rPr>
+          <w:b/>
+          <w:bCs/>
+          <w:sz w:val="32"/>
+          <w:szCs w:val="32"/>
+        </w:rPr>
+      </w:pPr>
+      <w:r>
+        <w:rPr>
+          <w:b/>
+          <w:bCs/>
+          <w:sz w:val="32"/>
+          <w:szCs w:val="32"/>
+        </w:rPr>
+        <w:drawing>
+          <wp:inline distT="0" distB="0" distL="0" distR="0" wp14:anchorId="4D22E326" wp14:editId="4E7115C0">
+            <wp:extent cx="1991003" cy="800212"/>
+            <wp:effectExtent l="0" t="0" r="0" b="0"/>
+            <wp:docPr id="1167859896" name="Picture 1"/>
+            <wp:cNvGraphicFramePr>
+              <a:graphicFrameLocks xmlns:a="http://schemas.openxmlformats.org/drawingml/2006/main" noChangeAspect="1"/>
+            </wp:cNvGraphicFramePr>
+            <a:graphic xmlns:a="http://schemas.openxmlformats.org/drawingml/2006/main">
+              <a:graphicData uri="http://schemas.openxmlformats.org/drawingml/2006/picture">
+                <pic:pic xmlns:pic="http://schemas.openxmlformats.org/drawingml/2006/picture">
+                  <pic:nvPicPr>
+                    <pic:cNvPr id="1167859896" name=""/>
+                    <pic:cNvPicPr/>
+                  </pic:nvPicPr>
+                  <pic:blipFill>
+                    <a:blip r:embed="rId28"/>
+                    <a:stretch>
+                      <a:fillRect/>
+                    </a:stretch>
+                  </pic:blipFill>
+                  <pic:spPr>
+                    <a:xfrm>
+                      <a:off x="0" y="0"/>
+                      <a:ext cx="1991003" cy="800212"/>
                     </a:xfrm>
                     <a:prstGeom prst="rect">
                       <a:avLst/>

</xml_diff>

<commit_message>
added react router dom more routes
</commit_message>
<xml_diff>
--- a/Notes-Blog_React.docx
+++ b/Notes-Blog_React.docx
@@ -152,7 +152,6 @@
         <w:rPr>
           <w:noProof/>
         </w:rPr>
-        <w:lastRenderedPageBreak/>
         <w:drawing>
           <wp:inline distT="0" distB="0" distL="0" distR="0" wp14:anchorId="097E0890" wp14:editId="11EE50F6">
             <wp:extent cx="5943600" cy="1956435"/>
@@ -377,7 +376,6 @@
         <w:rPr>
           <w:noProof/>
         </w:rPr>
-        <w:lastRenderedPageBreak/>
         <w:drawing>
           <wp:inline distT="0" distB="0" distL="0" distR="0" wp14:anchorId="3CA024D3" wp14:editId="1B107269">
             <wp:extent cx="5943600" cy="1835150"/>
@@ -623,7 +621,6 @@
           <w:sz w:val="32"/>
           <w:szCs w:val="32"/>
         </w:rPr>
-        <w:lastRenderedPageBreak/>
         <w:t xml:space="preserve">Then use its states as </w:t>
       </w:r>
     </w:p>
@@ -774,7 +771,6 @@
           <w:sz w:val="32"/>
           <w:szCs w:val="32"/>
         </w:rPr>
-        <w:lastRenderedPageBreak/>
         <w:drawing>
           <wp:inline distT="0" distB="0" distL="0" distR="0" wp14:anchorId="1EF1573B" wp14:editId="2BAC3B57">
             <wp:extent cx="3562847" cy="2781688"/>
@@ -953,7 +949,6 @@
           <w:sz w:val="32"/>
           <w:szCs w:val="32"/>
         </w:rPr>
-        <w:lastRenderedPageBreak/>
         <w:drawing>
           <wp:inline distT="0" distB="0" distL="0" distR="0" wp14:anchorId="22F659B3" wp14:editId="5FDBEF22">
             <wp:extent cx="5220429" cy="2114845"/>
@@ -1209,7 +1204,6 @@
         <w:rPr>
           <w:noProof/>
         </w:rPr>
-        <w:lastRenderedPageBreak/>
         <w:pict w14:anchorId="74CA4FAC">
           <v:rect id="Ink 22" o:spid="_x0000_s1042" style="position:absolute;margin-left:263.35pt;margin-top:75.1pt;width:8.1pt;height:16.9pt;z-index:251680768;visibility:visible;mso-wrap-style:square;mso-wrap-distance-left:9pt;mso-wrap-distance-top:0;mso-wrap-distance-right:9pt;mso-wrap-distance-bottom:0;mso-position-horizontal:absolute;mso-position-horizontal-relative:text;mso-position-vertical:absolute;mso-position-vertical-relative:text" filled="f" strokecolor="#3cf" strokeweight="1mm">
             <v:stroke endcap="round"/>
@@ -2020,7 +2014,6 @@
           <w:sz w:val="32"/>
           <w:szCs w:val="32"/>
         </w:rPr>
-        <w:lastRenderedPageBreak/>
         <w:drawing>
           <wp:inline distT="0" distB="0" distL="0" distR="0" wp14:anchorId="09C84D6E" wp14:editId="61933E71">
             <wp:extent cx="5943600" cy="2564765"/>
@@ -2149,7 +2142,6 @@
           <w:sz w:val="32"/>
           <w:szCs w:val="32"/>
         </w:rPr>
-        <w:lastRenderedPageBreak/>
         <w:drawing>
           <wp:inline distT="0" distB="0" distL="0" distR="0" wp14:anchorId="68E88A98" wp14:editId="307347B4">
             <wp:extent cx="5943600" cy="3687445"/>
@@ -2264,7 +2256,6 @@
           <w:sz w:val="32"/>
           <w:szCs w:val="32"/>
         </w:rPr>
-        <w:lastRenderedPageBreak/>
         <w:drawing>
           <wp:inline distT="0" distB="0" distL="0" distR="0" wp14:anchorId="41C80A8D" wp14:editId="3249A1A2">
             <wp:extent cx="5772956" cy="2476846"/>
@@ -2645,7 +2636,6 @@
           <w:sz w:val="32"/>
           <w:szCs w:val="32"/>
         </w:rPr>
-        <w:lastRenderedPageBreak/>
         <w:drawing>
           <wp:inline distT="0" distB="0" distL="0" distR="0" wp14:anchorId="5B6D30D1" wp14:editId="58808252">
             <wp:extent cx="5943600" cy="4587240"/>
@@ -2770,6 +2760,7 @@
         <w:rPr>
           <w:b/>
           <w:bCs/>
+          <w:noProof/>
           <w:sz w:val="32"/>
           <w:szCs w:val="32"/>
         </w:rPr>
@@ -2833,10 +2824,10 @@
         <w:rPr>
           <w:b/>
           <w:bCs/>
-          <w:sz w:val="32"/>
-          <w:szCs w:val="32"/>
-        </w:rPr>
-        <w:lastRenderedPageBreak/>
+          <w:noProof/>
+          <w:sz w:val="32"/>
+          <w:szCs w:val="32"/>
+        </w:rPr>
         <w:drawing>
           <wp:inline distT="0" distB="0" distL="0" distR="0" wp14:anchorId="4D1F60FB" wp14:editId="5D8AE57F">
             <wp:extent cx="5943600" cy="3067050"/>
@@ -2862,6 +2853,124 @@
                     <a:xfrm>
                       <a:off x="0" y="0"/>
                       <a:ext cx="5943600" cy="3067050"/>
+                    </a:xfrm>
+                    <a:prstGeom prst="rect">
+                      <a:avLst/>
+                    </a:prstGeom>
+                  </pic:spPr>
+                </pic:pic>
+              </a:graphicData>
+            </a:graphic>
+          </wp:inline>
+        </w:drawing>
+      </w:r>
+    </w:p>
+    <w:p>
+      <w:pPr>
+        <w:rPr>
+          <w:b/>
+          <w:bCs/>
+          <w:sz w:val="32"/>
+          <w:szCs w:val="32"/>
+        </w:rPr>
+      </w:pPr>
+    </w:p>
+    <w:p>
+      <w:pPr>
+        <w:rPr>
+          <w:b/>
+          <w:bCs/>
+          <w:sz w:val="32"/>
+          <w:szCs w:val="32"/>
+        </w:rPr>
+      </w:pPr>
+      <w:r>
+        <w:rPr>
+          <w:b/>
+          <w:bCs/>
+          <w:sz w:val="32"/>
+          <w:szCs w:val="32"/>
+        </w:rPr>
+        <w:drawing>
+          <wp:inline distT="0" distB="0" distL="0" distR="0" wp14:anchorId="171B648A" wp14:editId="10ECC2F3">
+            <wp:extent cx="6173061" cy="4448796"/>
+            <wp:effectExtent l="0" t="0" r="0" b="9525"/>
+            <wp:docPr id="513011679" name="Picture 1"/>
+            <wp:cNvGraphicFramePr>
+              <a:graphicFrameLocks xmlns:a="http://schemas.openxmlformats.org/drawingml/2006/main" noChangeAspect="1"/>
+            </wp:cNvGraphicFramePr>
+            <a:graphic xmlns:a="http://schemas.openxmlformats.org/drawingml/2006/main">
+              <a:graphicData uri="http://schemas.openxmlformats.org/drawingml/2006/picture">
+                <pic:pic xmlns:pic="http://schemas.openxmlformats.org/drawingml/2006/picture">
+                  <pic:nvPicPr>
+                    <pic:cNvPr id="513011679" name=""/>
+                    <pic:cNvPicPr/>
+                  </pic:nvPicPr>
+                  <pic:blipFill>
+                    <a:blip r:embed="rId35"/>
+                    <a:stretch>
+                      <a:fillRect/>
+                    </a:stretch>
+                  </pic:blipFill>
+                  <pic:spPr>
+                    <a:xfrm>
+                      <a:off x="0" y="0"/>
+                      <a:ext cx="6173061" cy="4448796"/>
+                    </a:xfrm>
+                    <a:prstGeom prst="rect">
+                      <a:avLst/>
+                    </a:prstGeom>
+                  </pic:spPr>
+                </pic:pic>
+              </a:graphicData>
+            </a:graphic>
+          </wp:inline>
+        </w:drawing>
+      </w:r>
+    </w:p>
+    <w:p>
+      <w:pPr>
+        <w:rPr>
+          <w:b/>
+          <w:bCs/>
+          <w:sz w:val="32"/>
+          <w:szCs w:val="32"/>
+          <w:lang w:val="en-IN"/>
+        </w:rPr>
+      </w:pPr>
+      <w:r>
+        <w:rPr>
+          <w:b/>
+          <w:bCs/>
+          <w:sz w:val="32"/>
+          <w:szCs w:val="32"/>
+          <w:lang w:val="en-IN"/>
+        </w:rPr>
+        <w:drawing>
+          <wp:inline distT="0" distB="0" distL="0" distR="0" wp14:anchorId="3858F15F" wp14:editId="4730A599">
+            <wp:extent cx="6516009" cy="2410161"/>
+            <wp:effectExtent l="0" t="0" r="0" b="9525"/>
+            <wp:docPr id="1442582541" name="Picture 1"/>
+            <wp:cNvGraphicFramePr>
+              <a:graphicFrameLocks xmlns:a="http://schemas.openxmlformats.org/drawingml/2006/main" noChangeAspect="1"/>
+            </wp:cNvGraphicFramePr>
+            <a:graphic xmlns:a="http://schemas.openxmlformats.org/drawingml/2006/main">
+              <a:graphicData uri="http://schemas.openxmlformats.org/drawingml/2006/picture">
+                <pic:pic xmlns:pic="http://schemas.openxmlformats.org/drawingml/2006/picture">
+                  <pic:nvPicPr>
+                    <pic:cNvPr id="1442582541" name=""/>
+                    <pic:cNvPicPr/>
+                  </pic:nvPicPr>
+                  <pic:blipFill>
+                    <a:blip r:embed="rId36"/>
+                    <a:stretch>
+                      <a:fillRect/>
+                    </a:stretch>
+                  </pic:blipFill>
+                  <pic:spPr>
+                    <a:xfrm>
+                      <a:off x="0" y="0"/>
+                      <a:ext cx="6516009" cy="2410161"/>
                     </a:xfrm>
                     <a:prstGeom prst="rect">
                       <a:avLst/>

</xml_diff>

<commit_message>
done a leetcode graph ques
</commit_message>
<xml_diff>
--- a/Notes-Blog_React.docx
+++ b/Notes-Blog_React.docx
@@ -152,6 +152,7 @@
         <w:rPr>
           <w:noProof/>
         </w:rPr>
+        <w:lastRenderedPageBreak/>
         <w:drawing>
           <wp:inline distT="0" distB="0" distL="0" distR="0" wp14:anchorId="097E0890" wp14:editId="11EE50F6">
             <wp:extent cx="5943600" cy="1956435"/>
@@ -376,6 +377,7 @@
         <w:rPr>
           <w:noProof/>
         </w:rPr>
+        <w:lastRenderedPageBreak/>
         <w:drawing>
           <wp:inline distT="0" distB="0" distL="0" distR="0" wp14:anchorId="3CA024D3" wp14:editId="1B107269">
             <wp:extent cx="5943600" cy="1835150"/>
@@ -621,6 +623,7 @@
           <w:sz w:val="32"/>
           <w:szCs w:val="32"/>
         </w:rPr>
+        <w:lastRenderedPageBreak/>
         <w:t xml:space="preserve">Then use its states as </w:t>
       </w:r>
     </w:p>
@@ -771,6 +774,7 @@
           <w:sz w:val="32"/>
           <w:szCs w:val="32"/>
         </w:rPr>
+        <w:lastRenderedPageBreak/>
         <w:drawing>
           <wp:inline distT="0" distB="0" distL="0" distR="0" wp14:anchorId="1EF1573B" wp14:editId="2BAC3B57">
             <wp:extent cx="3562847" cy="2781688"/>
@@ -949,6 +953,7 @@
           <w:sz w:val="32"/>
           <w:szCs w:val="32"/>
         </w:rPr>
+        <w:lastRenderedPageBreak/>
         <w:drawing>
           <wp:inline distT="0" distB="0" distL="0" distR="0" wp14:anchorId="22F659B3" wp14:editId="5FDBEF22">
             <wp:extent cx="5220429" cy="2114845"/>
@@ -1204,6 +1209,7 @@
         <w:rPr>
           <w:noProof/>
         </w:rPr>
+        <w:lastRenderedPageBreak/>
         <w:pict w14:anchorId="74CA4FAC">
           <v:rect id="Ink 22" o:spid="_x0000_s1042" style="position:absolute;margin-left:263.35pt;margin-top:75.1pt;width:8.1pt;height:16.9pt;z-index:251680768;visibility:visible;mso-wrap-style:square;mso-wrap-distance-left:9pt;mso-wrap-distance-top:0;mso-wrap-distance-right:9pt;mso-wrap-distance-bottom:0;mso-position-horizontal:absolute;mso-position-horizontal-relative:text;mso-position-vertical:absolute;mso-position-vertical-relative:text" filled="f" strokecolor="#3cf" strokeweight="1mm">
             <v:stroke endcap="round"/>
@@ -2014,6 +2020,7 @@
           <w:sz w:val="32"/>
           <w:szCs w:val="32"/>
         </w:rPr>
+        <w:lastRenderedPageBreak/>
         <w:drawing>
           <wp:inline distT="0" distB="0" distL="0" distR="0" wp14:anchorId="09C84D6E" wp14:editId="61933E71">
             <wp:extent cx="5943600" cy="2564765"/>
@@ -2142,6 +2149,7 @@
           <w:sz w:val="32"/>
           <w:szCs w:val="32"/>
         </w:rPr>
+        <w:lastRenderedPageBreak/>
         <w:drawing>
           <wp:inline distT="0" distB="0" distL="0" distR="0" wp14:anchorId="68E88A98" wp14:editId="307347B4">
             <wp:extent cx="5943600" cy="3687445"/>
@@ -2256,6 +2264,7 @@
           <w:sz w:val="32"/>
           <w:szCs w:val="32"/>
         </w:rPr>
+        <w:lastRenderedPageBreak/>
         <w:drawing>
           <wp:inline distT="0" distB="0" distL="0" distR="0" wp14:anchorId="41C80A8D" wp14:editId="3249A1A2">
             <wp:extent cx="5772956" cy="2476846"/>
@@ -2636,6 +2645,7 @@
           <w:sz w:val="32"/>
           <w:szCs w:val="32"/>
         </w:rPr>
+        <w:lastRenderedPageBreak/>
         <w:drawing>
           <wp:inline distT="0" distB="0" distL="0" distR="0" wp14:anchorId="5B6D30D1" wp14:editId="58808252">
             <wp:extent cx="5943600" cy="4587240"/>
@@ -2828,6 +2838,7 @@
           <w:sz w:val="32"/>
           <w:szCs w:val="32"/>
         </w:rPr>
+        <w:lastRenderedPageBreak/>
         <w:drawing>
           <wp:inline distT="0" distB="0" distL="0" distR="0" wp14:anchorId="4D1F60FB" wp14:editId="5D8AE57F">
             <wp:extent cx="5943600" cy="3067050"/>
@@ -2888,6 +2899,7 @@
         <w:rPr>
           <w:b/>
           <w:bCs/>
+          <w:noProof/>
           <w:sz w:val="32"/>
           <w:szCs w:val="32"/>
         </w:rPr>
@@ -2942,10 +2954,12 @@
         <w:rPr>
           <w:b/>
           <w:bCs/>
+          <w:noProof/>
           <w:sz w:val="32"/>
           <w:szCs w:val="32"/>
           <w:lang w:val="en-IN"/>
         </w:rPr>
+        <w:lastRenderedPageBreak/>
         <w:drawing>
           <wp:inline distT="0" distB="0" distL="0" distR="0" wp14:anchorId="3858F15F" wp14:editId="4730A599">
             <wp:extent cx="6516009" cy="2410161"/>
@@ -2971,6 +2985,184 @@
                     <a:xfrm>
                       <a:off x="0" y="0"/>
                       <a:ext cx="6516009" cy="2410161"/>
+                    </a:xfrm>
+                    <a:prstGeom prst="rect">
+                      <a:avLst/>
+                    </a:prstGeom>
+                  </pic:spPr>
+                </pic:pic>
+              </a:graphicData>
+            </a:graphic>
+          </wp:inline>
+        </w:drawing>
+      </w:r>
+    </w:p>
+    <w:p>
+      <w:pPr>
+        <w:rPr>
+          <w:b/>
+          <w:bCs/>
+          <w:sz w:val="32"/>
+          <w:szCs w:val="32"/>
+          <w:lang w:val="en-IN"/>
+        </w:rPr>
+      </w:pPr>
+    </w:p>
+    <w:p>
+      <w:pPr>
+        <w:rPr>
+          <w:b/>
+          <w:bCs/>
+          <w:sz w:val="32"/>
+          <w:szCs w:val="32"/>
+          <w:lang w:val="en-IN"/>
+        </w:rPr>
+      </w:pPr>
+      <w:r>
+        <w:rPr>
+          <w:b/>
+          <w:bCs/>
+          <w:sz w:val="32"/>
+          <w:szCs w:val="32"/>
+          <w:lang w:val="en-IN"/>
+        </w:rPr>
+        <w:drawing>
+          <wp:inline distT="0" distB="0" distL="0" distR="0" wp14:anchorId="6DF73BEA" wp14:editId="523E5554">
+            <wp:extent cx="5943600" cy="3805555"/>
+            <wp:effectExtent l="0" t="0" r="0" b="0"/>
+            <wp:docPr id="782111884" name="Picture 1"/>
+            <wp:cNvGraphicFramePr>
+              <a:graphicFrameLocks xmlns:a="http://schemas.openxmlformats.org/drawingml/2006/main" noChangeAspect="1"/>
+            </wp:cNvGraphicFramePr>
+            <a:graphic xmlns:a="http://schemas.openxmlformats.org/drawingml/2006/main">
+              <a:graphicData uri="http://schemas.openxmlformats.org/drawingml/2006/picture">
+                <pic:pic xmlns:pic="http://schemas.openxmlformats.org/drawingml/2006/picture">
+                  <pic:nvPicPr>
+                    <pic:cNvPr id="782111884" name=""/>
+                    <pic:cNvPicPr/>
+                  </pic:nvPicPr>
+                  <pic:blipFill>
+                    <a:blip r:embed="rId37"/>
+                    <a:stretch>
+                      <a:fillRect/>
+                    </a:stretch>
+                  </pic:blipFill>
+                  <pic:spPr>
+                    <a:xfrm>
+                      <a:off x="0" y="0"/>
+                      <a:ext cx="5943600" cy="3805555"/>
+                    </a:xfrm>
+                    <a:prstGeom prst="rect">
+                      <a:avLst/>
+                    </a:prstGeom>
+                  </pic:spPr>
+                </pic:pic>
+              </a:graphicData>
+            </a:graphic>
+          </wp:inline>
+        </w:drawing>
+      </w:r>
+    </w:p>
+    <w:p>
+      <w:pPr>
+        <w:rPr>
+          <w:b/>
+          <w:bCs/>
+          <w:sz w:val="32"/>
+          <w:szCs w:val="32"/>
+          <w:lang w:val="en-IN"/>
+        </w:rPr>
+      </w:pPr>
+    </w:p>
+    <w:p>
+      <w:pPr>
+        <w:rPr>
+          <w:b/>
+          <w:bCs/>
+          <w:sz w:val="32"/>
+          <w:szCs w:val="32"/>
+          <w:lang w:val="en-IN"/>
+        </w:rPr>
+      </w:pPr>
+      <w:r>
+        <w:rPr>
+          <w:b/>
+          <w:bCs/>
+          <w:sz w:val="32"/>
+          <w:szCs w:val="32"/>
+          <w:lang w:val="en-IN"/>
+        </w:rPr>
+        <w:lastRenderedPageBreak/>
+        <w:drawing>
+          <wp:inline distT="0" distB="0" distL="0" distR="0" wp14:anchorId="07FC4927" wp14:editId="756BEB54">
+            <wp:extent cx="5943600" cy="5182870"/>
+            <wp:effectExtent l="0" t="0" r="0" b="0"/>
+            <wp:docPr id="364905053" name="Picture 1"/>
+            <wp:cNvGraphicFramePr>
+              <a:graphicFrameLocks xmlns:a="http://schemas.openxmlformats.org/drawingml/2006/main" noChangeAspect="1"/>
+            </wp:cNvGraphicFramePr>
+            <a:graphic xmlns:a="http://schemas.openxmlformats.org/drawingml/2006/main">
+              <a:graphicData uri="http://schemas.openxmlformats.org/drawingml/2006/picture">
+                <pic:pic xmlns:pic="http://schemas.openxmlformats.org/drawingml/2006/picture">
+                  <pic:nvPicPr>
+                    <pic:cNvPr id="364905053" name=""/>
+                    <pic:cNvPicPr/>
+                  </pic:nvPicPr>
+                  <pic:blipFill>
+                    <a:blip r:embed="rId38"/>
+                    <a:stretch>
+                      <a:fillRect/>
+                    </a:stretch>
+                  </pic:blipFill>
+                  <pic:spPr>
+                    <a:xfrm>
+                      <a:off x="0" y="0"/>
+                      <a:ext cx="5943600" cy="5182870"/>
+                    </a:xfrm>
+                    <a:prstGeom prst="rect">
+                      <a:avLst/>
+                    </a:prstGeom>
+                  </pic:spPr>
+                </pic:pic>
+              </a:graphicData>
+            </a:graphic>
+          </wp:inline>
+        </w:drawing>
+      </w:r>
+      <w:r>
+        <w:rPr>
+          <w:b/>
+          <w:bCs/>
+          <w:sz w:val="32"/>
+          <w:szCs w:val="32"/>
+          <w:lang w:val="en-IN"/>
+        </w:rPr>
+        <w:lastRenderedPageBreak/>
+        <w:drawing>
+          <wp:inline distT="0" distB="0" distL="0" distR="0" wp14:anchorId="362A7380" wp14:editId="0696B591">
+            <wp:extent cx="5943600" cy="4208145"/>
+            <wp:effectExtent l="0" t="0" r="0" b="0"/>
+            <wp:docPr id="211634600" name="Picture 1"/>
+            <wp:cNvGraphicFramePr>
+              <a:graphicFrameLocks xmlns:a="http://schemas.openxmlformats.org/drawingml/2006/main" noChangeAspect="1"/>
+            </wp:cNvGraphicFramePr>
+            <a:graphic xmlns:a="http://schemas.openxmlformats.org/drawingml/2006/main">
+              <a:graphicData uri="http://schemas.openxmlformats.org/drawingml/2006/picture">
+                <pic:pic xmlns:pic="http://schemas.openxmlformats.org/drawingml/2006/picture">
+                  <pic:nvPicPr>
+                    <pic:cNvPr id="211634600" name=""/>
+                    <pic:cNvPicPr/>
+                  </pic:nvPicPr>
+                  <pic:blipFill>
+                    <a:blip r:embed="rId39"/>
+                    <a:stretch>
+                      <a:fillRect/>
+                    </a:stretch>
+                  </pic:blipFill>
+                  <pic:spPr>
+                    <a:xfrm>
+                      <a:off x="0" y="0"/>
+                      <a:ext cx="5943600" cy="4208145"/>
                     </a:xfrm>
                     <a:prstGeom prst="rect">
                       <a:avLst/>

</xml_diff>

<commit_message>
done for first deployment
</commit_message>
<xml_diff>
--- a/Notes-Blog_React.docx
+++ b/Notes-Blog_React.docx
@@ -28,8 +28,13 @@
       </w:r>
     </w:p>
     <w:p>
-      <w:r>
-        <w:t>Position : sticky,</w:t>
+      <w:proofErr w:type="gramStart"/>
+      <w:r>
+        <w:t>Position :</w:t>
+      </w:r>
+      <w:proofErr w:type="gramEnd"/>
+      <w:r>
+        <w:t xml:space="preserve"> sticky,</w:t>
       </w:r>
     </w:p>
     <w:p>
@@ -58,7 +63,27 @@
           <w:highlight w:val="yellow"/>
           <w:lang w:val="en-IN"/>
         </w:rPr>
-        <w:t>Steps To Implement Radio Button In React</w:t>
+        <w:t xml:space="preserve">Steps To Implement Radio Button </w:t>
+      </w:r>
+      <w:proofErr w:type="gramStart"/>
+      <w:r>
+        <w:rPr>
+          <w:b/>
+          <w:bCs/>
+          <w:highlight w:val="yellow"/>
+          <w:lang w:val="en-IN"/>
+        </w:rPr>
+        <w:t>In</w:t>
+      </w:r>
+      <w:proofErr w:type="gramEnd"/>
+      <w:r>
+        <w:rPr>
+          <w:b/>
+          <w:bCs/>
+          <w:highlight w:val="yellow"/>
+          <w:lang w:val="en-IN"/>
+        </w:rPr>
+        <w:t xml:space="preserve"> React</w:t>
       </w:r>
     </w:p>
     <w:p>
@@ -204,72 +229,338 @@
           <w:bCs/>
           <w:lang w:val="en-IN"/>
         </w:rPr>
-        <w:t>2. Hover Handling (onMouseEnter)</w:t>
-      </w:r>
-    </w:p>
-    <w:p>
-      <w:pPr>
-        <w:rPr>
-          <w:lang w:val="en-IN"/>
-        </w:rPr>
-      </w:pPr>
-      <w:r>
-        <w:rPr>
-          <w:lang w:val="en-IN"/>
-        </w:rPr>
-        <w:t>const handleMouseEnter = (e) =&gt; {</w:t>
-      </w:r>
-    </w:p>
-    <w:p>
-      <w:pPr>
-        <w:rPr>
-          <w:lang w:val="en-IN"/>
-        </w:rPr>
-      </w:pPr>
-      <w:r>
-        <w:rPr>
-          <w:lang w:val="en-IN"/>
-        </w:rPr>
-        <w:t xml:space="preserve">  const itemRect = e.target.getBoundingClientRect(); // gets size and position of the hovered link</w:t>
-      </w:r>
-    </w:p>
-    <w:p>
-      <w:pPr>
-        <w:rPr>
-          <w:lang w:val="en-IN"/>
-        </w:rPr>
-      </w:pPr>
-      <w:r>
-        <w:rPr>
-          <w:lang w:val="en-IN"/>
-        </w:rPr>
-        <w:t xml:space="preserve">  const containerRect = containerRef.current.getBoundingClientRect(); // same for nav container</w:t>
-      </w:r>
-    </w:p>
-    <w:p>
-      <w:pPr>
-        <w:rPr>
-          <w:lang w:val="en-IN"/>
-        </w:rPr>
-      </w:pPr>
-      <w:r>
-        <w:rPr>
-          <w:lang w:val="en-IN"/>
-        </w:rPr>
-        <w:t xml:space="preserve">  underline.style.width = `${itemRect.width}px`; // match the hovered link width</w:t>
-      </w:r>
-    </w:p>
-    <w:p>
-      <w:pPr>
-        <w:rPr>
-          <w:lang w:val="en-IN"/>
-        </w:rPr>
-      </w:pPr>
-      <w:r>
-        <w:rPr>
-          <w:lang w:val="en-IN"/>
-        </w:rPr>
-        <w:t xml:space="preserve">  underline.style.left = `${itemRect.left - containerRect.left}px`; // move it to the hovered link's position</w:t>
+        <w:t>2. Hover Handling (</w:t>
+      </w:r>
+      <w:proofErr w:type="spellStart"/>
+      <w:r>
+        <w:rPr>
+          <w:b/>
+          <w:bCs/>
+          <w:lang w:val="en-IN"/>
+        </w:rPr>
+        <w:t>onMouseEnter</w:t>
+      </w:r>
+      <w:proofErr w:type="spellEnd"/>
+      <w:r>
+        <w:rPr>
+          <w:b/>
+          <w:bCs/>
+          <w:lang w:val="en-IN"/>
+        </w:rPr>
+        <w:t>)</w:t>
+      </w:r>
+    </w:p>
+    <w:p>
+      <w:pPr>
+        <w:rPr>
+          <w:lang w:val="en-IN"/>
+        </w:rPr>
+      </w:pPr>
+      <w:proofErr w:type="spellStart"/>
+      <w:r>
+        <w:rPr>
+          <w:lang w:val="en-IN"/>
+        </w:rPr>
+        <w:t>const</w:t>
+      </w:r>
+      <w:proofErr w:type="spellEnd"/>
+      <w:r>
+        <w:rPr>
+          <w:lang w:val="en-IN"/>
+        </w:rPr>
+        <w:t xml:space="preserve"> </w:t>
+      </w:r>
+      <w:proofErr w:type="spellStart"/>
+      <w:r>
+        <w:rPr>
+          <w:lang w:val="en-IN"/>
+        </w:rPr>
+        <w:t>handleMouseEnter</w:t>
+      </w:r>
+      <w:proofErr w:type="spellEnd"/>
+      <w:r>
+        <w:rPr>
+          <w:lang w:val="en-IN"/>
+        </w:rPr>
+        <w:t xml:space="preserve"> = (e) =&gt; {</w:t>
+      </w:r>
+    </w:p>
+    <w:p>
+      <w:pPr>
+        <w:rPr>
+          <w:lang w:val="en-IN"/>
+        </w:rPr>
+      </w:pPr>
+      <w:r>
+        <w:rPr>
+          <w:lang w:val="en-IN"/>
+        </w:rPr>
+        <w:t xml:space="preserve">  </w:t>
+      </w:r>
+      <w:proofErr w:type="spellStart"/>
+      <w:r>
+        <w:rPr>
+          <w:lang w:val="en-IN"/>
+        </w:rPr>
+        <w:t>const</w:t>
+      </w:r>
+      <w:proofErr w:type="spellEnd"/>
+      <w:r>
+        <w:rPr>
+          <w:lang w:val="en-IN"/>
+        </w:rPr>
+        <w:t xml:space="preserve"> </w:t>
+      </w:r>
+      <w:proofErr w:type="spellStart"/>
+      <w:r>
+        <w:rPr>
+          <w:lang w:val="en-IN"/>
+        </w:rPr>
+        <w:t>itemRect</w:t>
+      </w:r>
+      <w:proofErr w:type="spellEnd"/>
+      <w:r>
+        <w:rPr>
+          <w:lang w:val="en-IN"/>
+        </w:rPr>
+        <w:t xml:space="preserve"> = </w:t>
+      </w:r>
+      <w:proofErr w:type="spellStart"/>
+      <w:proofErr w:type="gramStart"/>
+      <w:r>
+        <w:rPr>
+          <w:lang w:val="en-IN"/>
+        </w:rPr>
+        <w:t>e.target</w:t>
+      </w:r>
+      <w:proofErr w:type="gramEnd"/>
+      <w:r>
+        <w:rPr>
+          <w:lang w:val="en-IN"/>
+        </w:rPr>
+        <w:t>.</w:t>
+      </w:r>
+      <w:proofErr w:type="gramStart"/>
+      <w:r>
+        <w:rPr>
+          <w:lang w:val="en-IN"/>
+        </w:rPr>
+        <w:t>getBoundingClientRect</w:t>
+      </w:r>
+      <w:proofErr w:type="spellEnd"/>
+      <w:r>
+        <w:rPr>
+          <w:lang w:val="en-IN"/>
+        </w:rPr>
+        <w:t>(</w:t>
+      </w:r>
+      <w:proofErr w:type="gramEnd"/>
+      <w:r>
+        <w:rPr>
+          <w:lang w:val="en-IN"/>
+        </w:rPr>
+        <w:t>); // gets size and position of the hovered link</w:t>
+      </w:r>
+    </w:p>
+    <w:p>
+      <w:pPr>
+        <w:rPr>
+          <w:lang w:val="en-IN"/>
+        </w:rPr>
+      </w:pPr>
+      <w:r>
+        <w:rPr>
+          <w:lang w:val="en-IN"/>
+        </w:rPr>
+        <w:t xml:space="preserve">  </w:t>
+      </w:r>
+      <w:proofErr w:type="spellStart"/>
+      <w:r>
+        <w:rPr>
+          <w:lang w:val="en-IN"/>
+        </w:rPr>
+        <w:t>const</w:t>
+      </w:r>
+      <w:proofErr w:type="spellEnd"/>
+      <w:r>
+        <w:rPr>
+          <w:lang w:val="en-IN"/>
+        </w:rPr>
+        <w:t xml:space="preserve"> </w:t>
+      </w:r>
+      <w:proofErr w:type="spellStart"/>
+      <w:r>
+        <w:rPr>
+          <w:lang w:val="en-IN"/>
+        </w:rPr>
+        <w:t>containerRect</w:t>
+      </w:r>
+      <w:proofErr w:type="spellEnd"/>
+      <w:r>
+        <w:rPr>
+          <w:lang w:val="en-IN"/>
+        </w:rPr>
+        <w:t xml:space="preserve"> = </w:t>
+      </w:r>
+      <w:proofErr w:type="spellStart"/>
+      <w:proofErr w:type="gramStart"/>
+      <w:r>
+        <w:rPr>
+          <w:lang w:val="en-IN"/>
+        </w:rPr>
+        <w:t>containerRef.current.getBoundingClientRect</w:t>
+      </w:r>
+      <w:proofErr w:type="spellEnd"/>
+      <w:proofErr w:type="gramEnd"/>
+      <w:r>
+        <w:rPr>
+          <w:lang w:val="en-IN"/>
+        </w:rPr>
+        <w:t>(); // same for nav container</w:t>
+      </w:r>
+    </w:p>
+    <w:p>
+      <w:pPr>
+        <w:rPr>
+          <w:lang w:val="en-IN"/>
+        </w:rPr>
+      </w:pPr>
+      <w:r>
+        <w:rPr>
+          <w:lang w:val="en-IN"/>
+        </w:rPr>
+        <w:t xml:space="preserve">  </w:t>
+      </w:r>
+      <w:proofErr w:type="spellStart"/>
+      <w:proofErr w:type="gramStart"/>
+      <w:r>
+        <w:rPr>
+          <w:lang w:val="en-IN"/>
+        </w:rPr>
+        <w:t>underline.style</w:t>
+      </w:r>
+      <w:proofErr w:type="gramEnd"/>
+      <w:r>
+        <w:rPr>
+          <w:lang w:val="en-IN"/>
+        </w:rPr>
+        <w:t>.width</w:t>
+      </w:r>
+      <w:proofErr w:type="spellEnd"/>
+      <w:r>
+        <w:rPr>
+          <w:lang w:val="en-IN"/>
+        </w:rPr>
+        <w:t xml:space="preserve"> = `${</w:t>
+      </w:r>
+      <w:proofErr w:type="spellStart"/>
+      <w:proofErr w:type="gramStart"/>
+      <w:r>
+        <w:rPr>
+          <w:lang w:val="en-IN"/>
+        </w:rPr>
+        <w:t>itemRect.width</w:t>
+      </w:r>
+      <w:proofErr w:type="spellEnd"/>
+      <w:r>
+        <w:rPr>
+          <w:lang w:val="en-IN"/>
+        </w:rPr>
+        <w:t>}</w:t>
+      </w:r>
+      <w:proofErr w:type="spellStart"/>
+      <w:r>
+        <w:rPr>
+          <w:lang w:val="en-IN"/>
+        </w:rPr>
+        <w:t>px</w:t>
+      </w:r>
+      <w:proofErr w:type="spellEnd"/>
+      <w:proofErr w:type="gramEnd"/>
+      <w:r>
+        <w:rPr>
+          <w:lang w:val="en-IN"/>
+        </w:rPr>
+        <w:t>`; // match the hovered link width</w:t>
+      </w:r>
+    </w:p>
+    <w:p>
+      <w:pPr>
+        <w:rPr>
+          <w:lang w:val="en-IN"/>
+        </w:rPr>
+      </w:pPr>
+      <w:r>
+        <w:rPr>
+          <w:lang w:val="en-IN"/>
+        </w:rPr>
+        <w:t xml:space="preserve">  </w:t>
+      </w:r>
+      <w:proofErr w:type="spellStart"/>
+      <w:proofErr w:type="gramStart"/>
+      <w:r>
+        <w:rPr>
+          <w:lang w:val="en-IN"/>
+        </w:rPr>
+        <w:t>underline.style</w:t>
+      </w:r>
+      <w:proofErr w:type="gramEnd"/>
+      <w:r>
+        <w:rPr>
+          <w:lang w:val="en-IN"/>
+        </w:rPr>
+        <w:t>.left</w:t>
+      </w:r>
+      <w:proofErr w:type="spellEnd"/>
+      <w:r>
+        <w:rPr>
+          <w:lang w:val="en-IN"/>
+        </w:rPr>
+        <w:t xml:space="preserve"> = `${</w:t>
+      </w:r>
+      <w:proofErr w:type="spellStart"/>
+      <w:r>
+        <w:rPr>
+          <w:lang w:val="en-IN"/>
+        </w:rPr>
+        <w:t>itemRect.left</w:t>
+      </w:r>
+      <w:proofErr w:type="spellEnd"/>
+      <w:r>
+        <w:rPr>
+          <w:lang w:val="en-IN"/>
+        </w:rPr>
+        <w:t xml:space="preserve"> - </w:t>
+      </w:r>
+      <w:proofErr w:type="spellStart"/>
+      <w:proofErr w:type="gramStart"/>
+      <w:r>
+        <w:rPr>
+          <w:lang w:val="en-IN"/>
+        </w:rPr>
+        <w:t>containerRect.left</w:t>
+      </w:r>
+      <w:proofErr w:type="spellEnd"/>
+      <w:r>
+        <w:rPr>
+          <w:lang w:val="en-IN"/>
+        </w:rPr>
+        <w:t>}</w:t>
+      </w:r>
+      <w:proofErr w:type="spellStart"/>
+      <w:r>
+        <w:rPr>
+          <w:lang w:val="en-IN"/>
+        </w:rPr>
+        <w:t>px</w:t>
+      </w:r>
+      <w:proofErr w:type="spellEnd"/>
+      <w:proofErr w:type="gramEnd"/>
+      <w:r>
+        <w:rPr>
+          <w:lang w:val="en-IN"/>
+        </w:rPr>
+        <w:t>`; // move it to the hovered link's position</w:t>
       </w:r>
     </w:p>
     <w:p>
@@ -509,13 +800,31 @@
           <w:szCs w:val="32"/>
         </w:rPr>
       </w:pPr>
-      <w:r>
-        <w:rPr>
-          <w:sz w:val="32"/>
-          <w:szCs w:val="32"/>
-        </w:rPr>
-        <w:t>npm install zustand</w:t>
-      </w:r>
+      <w:proofErr w:type="spellStart"/>
+      <w:r>
+        <w:rPr>
+          <w:sz w:val="32"/>
+          <w:szCs w:val="32"/>
+        </w:rPr>
+        <w:t>npm</w:t>
+      </w:r>
+      <w:proofErr w:type="spellEnd"/>
+      <w:r>
+        <w:rPr>
+          <w:sz w:val="32"/>
+          <w:szCs w:val="32"/>
+        </w:rPr>
+        <w:t xml:space="preserve"> install </w:t>
+      </w:r>
+      <w:proofErr w:type="spellStart"/>
+      <w:r>
+        <w:rPr>
+          <w:sz w:val="32"/>
+          <w:szCs w:val="32"/>
+        </w:rPr>
+        <w:t>zustand</w:t>
+      </w:r>
+      <w:proofErr w:type="spellEnd"/>
     </w:p>
     <w:p>
       <w:pPr>
@@ -593,22 +902,70 @@
           <w:sz w:val="32"/>
           <w:szCs w:val="32"/>
         </w:rPr>
-        <w:t xml:space="preserve"> export const useStore = ….</w:t>
-      </w:r>
-    </w:p>
-    <w:p>
-      <w:pPr>
-        <w:rPr>
-          <w:sz w:val="32"/>
-          <w:szCs w:val="32"/>
-        </w:rPr>
-      </w:pPr>
-      <w:r>
-        <w:rPr>
-          <w:sz w:val="32"/>
-          <w:szCs w:val="32"/>
-        </w:rPr>
-        <w:t>And then import it as import useStore from “../src/useStore.js”</w:t>
+        <w:t xml:space="preserve"> export const </w:t>
+      </w:r>
+      <w:proofErr w:type="spellStart"/>
+      <w:r>
+        <w:rPr>
+          <w:sz w:val="32"/>
+          <w:szCs w:val="32"/>
+        </w:rPr>
+        <w:t>useStore</w:t>
+      </w:r>
+      <w:proofErr w:type="spellEnd"/>
+      <w:r>
+        <w:rPr>
+          <w:sz w:val="32"/>
+          <w:szCs w:val="32"/>
+        </w:rPr>
+        <w:t xml:space="preserve"> = ….</w:t>
+      </w:r>
+    </w:p>
+    <w:p>
+      <w:pPr>
+        <w:rPr>
+          <w:sz w:val="32"/>
+          <w:szCs w:val="32"/>
+        </w:rPr>
+      </w:pPr>
+      <w:r>
+        <w:rPr>
+          <w:sz w:val="32"/>
+          <w:szCs w:val="32"/>
+        </w:rPr>
+        <w:t xml:space="preserve">And then import it as import </w:t>
+      </w:r>
+      <w:proofErr w:type="spellStart"/>
+      <w:r>
+        <w:rPr>
+          <w:sz w:val="32"/>
+          <w:szCs w:val="32"/>
+        </w:rPr>
+        <w:t>useStore</w:t>
+      </w:r>
+      <w:proofErr w:type="spellEnd"/>
+      <w:r>
+        <w:rPr>
+          <w:sz w:val="32"/>
+          <w:szCs w:val="32"/>
+        </w:rPr>
+        <w:t xml:space="preserve"> from “../</w:t>
+      </w:r>
+      <w:proofErr w:type="spellStart"/>
+      <w:r>
+        <w:rPr>
+          <w:sz w:val="32"/>
+          <w:szCs w:val="32"/>
+        </w:rPr>
+        <w:t>src</w:t>
+      </w:r>
+      <w:proofErr w:type="spellEnd"/>
+      <w:r>
+        <w:rPr>
+          <w:sz w:val="32"/>
+          <w:szCs w:val="32"/>
+        </w:rPr>
+        <w:t>/useStore.js”</w:t>
       </w:r>
     </w:p>
     <w:p>
@@ -639,7 +996,73 @@
           <w:sz w:val="32"/>
           <w:szCs w:val="32"/>
         </w:rPr>
-        <w:t>Const { bears, updateBears } = useStore()</w:t>
+        <w:t xml:space="preserve">Const </w:t>
+      </w:r>
+      <w:proofErr w:type="gramStart"/>
+      <w:r>
+        <w:rPr>
+          <w:sz w:val="32"/>
+          <w:szCs w:val="32"/>
+        </w:rPr>
+        <w:t>{ bears</w:t>
+      </w:r>
+      <w:proofErr w:type="gramEnd"/>
+      <w:r>
+        <w:rPr>
+          <w:sz w:val="32"/>
+          <w:szCs w:val="32"/>
+        </w:rPr>
+        <w:t xml:space="preserve">, </w:t>
+      </w:r>
+      <w:proofErr w:type="spellStart"/>
+      <w:proofErr w:type="gramStart"/>
+      <w:r>
+        <w:rPr>
+          <w:sz w:val="32"/>
+          <w:szCs w:val="32"/>
+        </w:rPr>
+        <w:t>updateBears</w:t>
+      </w:r>
+      <w:proofErr w:type="spellEnd"/>
+      <w:r>
+        <w:rPr>
+          <w:sz w:val="32"/>
+          <w:szCs w:val="32"/>
+        </w:rPr>
+        <w:t xml:space="preserve"> }</w:t>
+      </w:r>
+      <w:proofErr w:type="gramEnd"/>
+      <w:r>
+        <w:rPr>
+          <w:sz w:val="32"/>
+          <w:szCs w:val="32"/>
+        </w:rPr>
+        <w:t xml:space="preserve"> = </w:t>
+      </w:r>
+      <w:proofErr w:type="spellStart"/>
+      <w:proofErr w:type="gramStart"/>
+      <w:r>
+        <w:rPr>
+          <w:sz w:val="32"/>
+          <w:szCs w:val="32"/>
+        </w:rPr>
+        <w:t>useStore</w:t>
+      </w:r>
+      <w:proofErr w:type="spellEnd"/>
+      <w:r>
+        <w:rPr>
+          <w:sz w:val="32"/>
+          <w:szCs w:val="32"/>
+        </w:rPr>
+        <w:t>(</w:t>
+      </w:r>
+      <w:proofErr w:type="gramEnd"/>
+      <w:r>
+        <w:rPr>
+          <w:sz w:val="32"/>
+          <w:szCs w:val="32"/>
+        </w:rPr>
+        <w:t>)</w:t>
       </w:r>
     </w:p>
     <w:p>
@@ -1028,8 +1451,42 @@
           <w:szCs w:val="32"/>
           <w:highlight w:val="yellow"/>
         </w:rPr>
-        <w:t>Ripple effect and getting position of el using javascript</w:t>
-      </w:r>
+        <w:t xml:space="preserve">Ripple effect and getting position of </w:t>
+      </w:r>
+      <w:proofErr w:type="spellStart"/>
+      <w:r>
+        <w:rPr>
+          <w:b/>
+          <w:bCs/>
+          <w:sz w:val="32"/>
+          <w:szCs w:val="32"/>
+          <w:highlight w:val="yellow"/>
+        </w:rPr>
+        <w:t>el</w:t>
+      </w:r>
+      <w:proofErr w:type="spellEnd"/>
+      <w:r>
+        <w:rPr>
+          <w:b/>
+          <w:bCs/>
+          <w:sz w:val="32"/>
+          <w:szCs w:val="32"/>
+          <w:highlight w:val="yellow"/>
+        </w:rPr>
+        <w:t xml:space="preserve"> using </w:t>
+      </w:r>
+      <w:proofErr w:type="spellStart"/>
+      <w:r>
+        <w:rPr>
+          <w:b/>
+          <w:bCs/>
+          <w:sz w:val="32"/>
+          <w:szCs w:val="32"/>
+          <w:highlight w:val="yellow"/>
+        </w:rPr>
+        <w:t>javascript</w:t>
+      </w:r>
+      <w:proofErr w:type="spellEnd"/>
     </w:p>
     <w:p>
       <w:pPr>
@@ -1875,7 +2332,29 @@
           <w:szCs w:val="32"/>
           <w:highlight w:val="yellow"/>
         </w:rPr>
-        <w:t>for (variable of iterable) {</w:t>
+        <w:t xml:space="preserve">for (variable of </w:t>
+      </w:r>
+      <w:proofErr w:type="spellStart"/>
+      <w:r>
+        <w:rPr>
+          <w:b/>
+          <w:bCs/>
+          <w:sz w:val="32"/>
+          <w:szCs w:val="32"/>
+          <w:highlight w:val="yellow"/>
+        </w:rPr>
+        <w:t>iterable</w:t>
+      </w:r>
+      <w:proofErr w:type="spellEnd"/>
+      <w:r>
+        <w:rPr>
+          <w:b/>
+          <w:bCs/>
+          <w:sz w:val="32"/>
+          <w:szCs w:val="32"/>
+          <w:highlight w:val="yellow"/>
+        </w:rPr>
+        <w:t>) {</w:t>
       </w:r>
       <w:r>
         <w:rPr>
@@ -1964,6 +2443,7 @@
           <w:lang w:val="en-IN"/>
         </w:rPr>
       </w:pPr>
+      <w:proofErr w:type="spellStart"/>
       <w:r>
         <w:rPr>
           <w:b/>
@@ -1973,7 +2453,43 @@
           <w:highlight w:val="red"/>
           <w:lang w:val="en-IN"/>
         </w:rPr>
-        <w:t>href="#section1": The href attribute specifies the target of the link. In this case, it points to a section id="section1" on the same page.</w:t>
+        <w:t>href</w:t>
+      </w:r>
+      <w:proofErr w:type="spellEnd"/>
+      <w:r>
+        <w:rPr>
+          <w:b/>
+          <w:bCs/>
+          <w:sz w:val="32"/>
+          <w:szCs w:val="32"/>
+          <w:highlight w:val="red"/>
+          <w:lang w:val="en-IN"/>
+        </w:rPr>
+        <w:t>="#section1": The </w:t>
+      </w:r>
+      <w:proofErr w:type="spellStart"/>
+      <w:r>
+        <w:rPr>
+          <w:b/>
+          <w:bCs/>
+          <w:sz w:val="32"/>
+          <w:szCs w:val="32"/>
+          <w:highlight w:val="red"/>
+          <w:lang w:val="en-IN"/>
+        </w:rPr>
+        <w:t>href</w:t>
+      </w:r>
+      <w:proofErr w:type="spellEnd"/>
+      <w:r>
+        <w:rPr>
+          <w:b/>
+          <w:bCs/>
+          <w:sz w:val="32"/>
+          <w:szCs w:val="32"/>
+          <w:highlight w:val="red"/>
+          <w:lang w:val="en-IN"/>
+        </w:rPr>
+        <w:t> attribute specifies the target of the link. In this case, it points to a section id="section1" on the same page.</w:t>
       </w:r>
     </w:p>
     <w:p>
@@ -3022,6 +3538,7 @@
         <w:rPr>
           <w:b/>
           <w:bCs/>
+          <w:noProof/>
           <w:sz w:val="32"/>
           <w:szCs w:val="32"/>
           <w:lang w:val="en-IN"/>
@@ -3088,6 +3605,7 @@
         <w:rPr>
           <w:b/>
           <w:bCs/>
+          <w:noProof/>
           <w:sz w:val="32"/>
           <w:szCs w:val="32"/>
           <w:lang w:val="en-IN"/>
@@ -3133,6 +3651,7 @@
         <w:rPr>
           <w:b/>
           <w:bCs/>
+          <w:noProof/>
           <w:sz w:val="32"/>
           <w:szCs w:val="32"/>
           <w:lang w:val="en-IN"/>
@@ -3174,6 +3693,87 @@
           </wp:inline>
         </w:drawing>
       </w:r>
+    </w:p>
+    <w:p>
+      <w:pPr>
+        <w:rPr>
+          <w:b/>
+          <w:bCs/>
+          <w:sz w:val="32"/>
+          <w:szCs w:val="32"/>
+          <w:lang w:val="en-IN"/>
+        </w:rPr>
+      </w:pPr>
+    </w:p>
+    <w:p>
+      <w:pPr>
+        <w:rPr>
+          <w:b/>
+          <w:bCs/>
+          <w:sz w:val="32"/>
+          <w:szCs w:val="32"/>
+          <w:lang w:val="en-IN"/>
+        </w:rPr>
+      </w:pPr>
+    </w:p>
+    <w:p>
+      <w:pPr>
+        <w:rPr>
+          <w:b/>
+          <w:bCs/>
+          <w:sz w:val="32"/>
+          <w:szCs w:val="32"/>
+          <w:lang w:val="en-IN"/>
+        </w:rPr>
+      </w:pPr>
+      <w:hyperlink r:id="rId40" w:history="1">
+        <w:r>
+          <w:rPr>
+            <w:rStyle w:val="Hyperlink"/>
+            <w:b/>
+            <w:bCs/>
+            <w:sz w:val="32"/>
+            <w:szCs w:val="32"/>
+            <w:lang w:val="en-IN"/>
+          </w:rPr>
+          <w:t>https://articleversebackend3.vercel.app/</w:t>
+        </w:r>
+      </w:hyperlink>
+    </w:p>
+    <w:p>
+      <w:pPr>
+        <w:rPr>
+          <w:b/>
+          <w:bCs/>
+          <w:sz w:val="32"/>
+          <w:szCs w:val="32"/>
+          <w:lang w:val="en-IN"/>
+        </w:rPr>
+      </w:pPr>
+      <w:hyperlink r:id="rId41" w:history="1">
+        <w:r>
+          <w:rPr>
+            <w:rStyle w:val="Hyperlink"/>
+            <w:b/>
+            <w:bCs/>
+            <w:sz w:val="32"/>
+            <w:szCs w:val="32"/>
+            <w:lang w:val="en-IN"/>
+          </w:rPr>
+          <w:t>https://articleverse.vercel.app/</w:t>
+        </w:r>
+      </w:hyperlink>
+    </w:p>
+    <w:p>
+      <w:pPr>
+        <w:rPr>
+          <w:b/>
+          <w:bCs/>
+          <w:sz w:val="32"/>
+          <w:szCs w:val="32"/>
+          <w:lang w:val="en-IN"/>
+        </w:rPr>
+      </w:pPr>
     </w:p>
     <w:sectPr>
       <w:pgSz w:w="12240" w:h="15840"/>
@@ -4425,6 +5025,29 @@
       <w:spacing w:val="5"/>
     </w:rPr>
   </w:style>
+  <w:style w:type="character" w:styleId="Hyperlink">
+    <w:name w:val="Hyperlink"/>
+    <w:basedOn w:val="DefaultParagraphFont"/>
+    <w:uiPriority w:val="99"/>
+    <w:unhideWhenUsed/>
+    <w:rsid w:val="00ED68A8"/>
+    <w:rPr>
+      <w:color w:val="0000FF" w:themeColor="hyperlink"/>
+      <w:u w:val="single"/>
+    </w:rPr>
+  </w:style>
+  <w:style w:type="character" w:styleId="UnresolvedMention">
+    <w:name w:val="Unresolved Mention"/>
+    <w:basedOn w:val="DefaultParagraphFont"/>
+    <w:uiPriority w:val="99"/>
+    <w:semiHidden/>
+    <w:unhideWhenUsed/>
+    <w:rsid w:val="00ED68A8"/>
+    <w:rPr>
+      <w:color w:val="605E5C"/>
+      <w:shd w:val="clear" w:color="auto" w:fill="E1DFDD"/>
+    </w:rPr>
+  </w:style>
 </w:styles>
 </file>
 

</xml_diff>